<commit_message>
fix(vault-and-script): optimize certificate table style and recovery potential display, fix chemistry switch reload, add Tab 3 to demo script
</commit_message>
<xml_diff>
--- a/焕芯电愈智策_5分钟网页录屏演示脚本与解说台词表.docx
+++ b/焕芯电愈智策_5分钟网页录屏演示脚本与解说台词表.docx
@@ -4,32 +4,243 @@
   <w:body>
     <w:p>
       <w:pPr>
-        <w:spacing w:before="0" w:after="40"/>
         <w:jc w:val="center"/>
       </w:pPr>
       <w:r>
         <w:rPr>
-          <w:rFonts w:ascii="微软雅黑" w:hAnsi="微软雅黑" w:eastAsia="微软雅黑"/>
+          <w:rFonts w:ascii="微软雅黑" w:hAnsi="微软雅黑"/>
           <w:b/>
-          <w:color w:val="0284C7"/>
-          <w:sz w:val="34"/>
+          <w:color w:val="0F172A"/>
+          <w:sz w:val="40"/>
         </w:rPr>
-        <w:t>《焕芯·电愈智策》平台5分钟网页录屏演示脚本与解说台词表</w:t>
+        <w:t>《焕芯·电愈智策》系统</w:t>
+        <w:br/>
+        <w:t>5分钟网页录屏演示脚本与解说台词表</w:t>
       </w:r>
     </w:p>
     <w:p>
       <w:pPr>
-        <w:spacing w:before="40" w:after="240"/>
         <w:jc w:val="center"/>
       </w:pPr>
       <w:r>
         <w:rPr>
-          <w:rFonts w:ascii="微软雅黑" w:hAnsi="微软雅黑" w:eastAsia="微软雅黑"/>
-          <w:b w:val="0"/>
-          <w:color w:val="64748B"/>
-          <w:sz w:val="21"/>
+          <w:rFonts w:ascii="微软雅黑" w:hAnsi="微软雅黑"/>
+          <w:color w:val="475569"/>
+          <w:sz w:val="22"/>
         </w:rPr>
-        <w:t>多体系电池智能快速诊断与低碳循环决策系统 | 专业演示实操手册 (客观严谨版)</w:t>
+        <w:t>多体系电池智能快速诊断与低碳循环决策系统 | 专业演示实操手册（客观测验严谨版）</w:t>
+      </w:r>
+    </w:p>
+    <w:p/>
+    <w:tbl>
+      <w:tblPr>
+        <w:tblW w:type="auto" w:w="0"/>
+        <w:jc w:val="center"/>
+        <w:tblLook w:firstColumn="1" w:firstRow="1" w:lastColumn="0" w:lastRow="0" w:noHBand="0" w:noVBand="1" w:val="04A0"/>
+      </w:tblPr>
+      <w:tblGrid>
+        <w:gridCol w:w="4968"/>
+        <w:gridCol w:w="4968"/>
+      </w:tblGrid>
+      <w:tr>
+        <w:tc>
+          <w:tcPr>
+            <w:tcW w:type="dxa" w:w="2592"/>
+            <w:shd w:fill="F1F5F9"/>
+            <w:tcMar>
+              <w:top w:w="120" w:type="dxa"/>
+              <w:bottom w:w="120" w:type="dxa"/>
+              <w:left w:w="150" w:type="dxa"/>
+              <w:right w:w="150" w:type="dxa"/>
+            </w:tcMar>
+          </w:tcPr>
+          <w:p>
+            <w:r>
+              <w:rPr>
+                <w:rFonts w:ascii="微软雅黑" w:hAnsi="微软雅黑"/>
+                <w:b/>
+                <w:color w:val="1E293B"/>
+                <w:sz w:val="20"/>
+              </w:rPr>
+              <w:t>演示总时长</w:t>
+            </w:r>
+          </w:p>
+        </w:tc>
+        <w:tc>
+          <w:tcPr>
+            <w:tcW w:type="dxa" w:w="7200"/>
+            <w:shd w:fill="FFFFFF"/>
+            <w:tcMar>
+              <w:top w:w="120" w:type="dxa"/>
+              <w:bottom w:w="120" w:type="dxa"/>
+              <w:left w:w="150" w:type="dxa"/>
+              <w:right w:w="150" w:type="dxa"/>
+            </w:tcMar>
+          </w:tcPr>
+          <w:p>
+            <w:r>
+              <w:rPr>
+                <w:rFonts w:ascii="微软雅黑" w:hAnsi="微软雅黑"/>
+                <w:color w:val="334155"/>
+                <w:sz w:val="20"/>
+              </w:rPr>
+              <w:t>严格把控在 4 分 30 秒 ~ 4 分 45 秒（5 分钟以内）</w:t>
+            </w:r>
+          </w:p>
+        </w:tc>
+      </w:tr>
+      <w:tr>
+        <w:tc>
+          <w:tcPr>
+            <w:tcW w:type="dxa" w:w="2592"/>
+            <w:shd w:fill="F1F5F9"/>
+            <w:tcMar>
+              <w:top w:w="120" w:type="dxa"/>
+              <w:bottom w:w="120" w:type="dxa"/>
+              <w:left w:w="150" w:type="dxa"/>
+              <w:right w:w="150" w:type="dxa"/>
+            </w:tcMar>
+          </w:tcPr>
+          <w:p>
+            <w:r>
+              <w:rPr>
+                <w:rFonts w:ascii="微软雅黑" w:hAnsi="微软雅黑"/>
+                <w:b/>
+                <w:color w:val="1E293B"/>
+                <w:sz w:val="20"/>
+              </w:rPr>
+              <w:t>演说语速建议</w:t>
+            </w:r>
+          </w:p>
+        </w:tc>
+        <w:tc>
+          <w:tcPr>
+            <w:tcW w:type="dxa" w:w="7200"/>
+            <w:shd w:fill="FFFFFF"/>
+            <w:tcMar>
+              <w:top w:w="120" w:type="dxa"/>
+              <w:bottom w:w="120" w:type="dxa"/>
+              <w:left w:w="150" w:type="dxa"/>
+              <w:right w:w="150" w:type="dxa"/>
+            </w:tcMar>
+          </w:tcPr>
+          <w:p>
+            <w:r>
+              <w:rPr>
+                <w:rFonts w:ascii="微软雅黑" w:hAnsi="微软雅黑"/>
+                <w:color w:val="334155"/>
+                <w:sz w:val="20"/>
+              </w:rPr>
+              <w:t>220 ~ 240 字/分钟，全篇逐字稿约 1,120 字，节奏沉稳流畅</w:t>
+            </w:r>
+          </w:p>
+        </w:tc>
+      </w:tr>
+      <w:tr>
+        <w:tc>
+          <w:tcPr>
+            <w:tcW w:type="dxa" w:w="2592"/>
+            <w:shd w:fill="F1F5F9"/>
+            <w:tcMar>
+              <w:top w:w="120" w:type="dxa"/>
+              <w:bottom w:w="120" w:type="dxa"/>
+              <w:left w:w="150" w:type="dxa"/>
+              <w:right w:w="150" w:type="dxa"/>
+            </w:tcMar>
+          </w:tcPr>
+          <w:p>
+            <w:r>
+              <w:rPr>
+                <w:rFonts w:ascii="微软雅黑" w:hAnsi="微软雅黑"/>
+                <w:b/>
+                <w:color w:val="1E293B"/>
+                <w:sz w:val="20"/>
+              </w:rPr>
+              <w:t>演示推进路径</w:t>
+            </w:r>
+          </w:p>
+        </w:tc>
+        <w:tc>
+          <w:tcPr>
+            <w:tcW w:type="dxa" w:w="7200"/>
+            <w:shd w:fill="FFFFFF"/>
+            <w:tcMar>
+              <w:top w:w="120" w:type="dxa"/>
+              <w:bottom w:w="120" w:type="dxa"/>
+              <w:left w:w="150" w:type="dxa"/>
+              <w:right w:w="150" w:type="dxa"/>
+            </w:tcMar>
+          </w:tcPr>
+          <w:p>
+            <w:r>
+              <w:rPr>
+                <w:rFonts w:ascii="微软雅黑" w:hAnsi="微软雅黑"/>
+                <w:color w:val="334155"/>
+                <w:sz w:val="20"/>
+              </w:rPr>
+              <w:t>Tab 1 -&gt; Tab 2 -&gt; Tab 3 -&gt; Tab 4 -&gt; Tab 5 -&gt; Tab 6 -&gt; Tab 7（全流程顺时针闭环）</w:t>
+            </w:r>
+          </w:p>
+        </w:tc>
+      </w:tr>
+      <w:tr>
+        <w:tc>
+          <w:tcPr>
+            <w:tcW w:type="dxa" w:w="2592"/>
+            <w:shd w:fill="F1F5F9"/>
+            <w:tcMar>
+              <w:top w:w="120" w:type="dxa"/>
+              <w:bottom w:w="120" w:type="dxa"/>
+              <w:left w:w="150" w:type="dxa"/>
+              <w:right w:w="150" w:type="dxa"/>
+            </w:tcMar>
+          </w:tcPr>
+          <w:p>
+            <w:r>
+              <w:rPr>
+                <w:rFonts w:ascii="微软雅黑" w:hAnsi="微软雅黑"/>
+                <w:b/>
+                <w:color w:val="1E293B"/>
+                <w:sz w:val="20"/>
+              </w:rPr>
+              <w:t>演说风格规范</w:t>
+            </w:r>
+          </w:p>
+        </w:tc>
+        <w:tc>
+          <w:tcPr>
+            <w:tcW w:type="dxa" w:w="7200"/>
+            <w:shd w:fill="FFFFFF"/>
+            <w:tcMar>
+              <w:top w:w="120" w:type="dxa"/>
+              <w:bottom w:w="120" w:type="dxa"/>
+              <w:left w:w="150" w:type="dxa"/>
+              <w:right w:w="150" w:type="dxa"/>
+            </w:tcMar>
+          </w:tcPr>
+          <w:p>
+            <w:r>
+              <w:rPr>
+                <w:rFonts w:ascii="微软雅黑" w:hAnsi="微软雅黑"/>
+                <w:color w:val="334155"/>
+                <w:sz w:val="20"/>
+              </w:rPr>
+              <w:t>客观、严谨、沉稳；紧扣电化学机理与工程实际，杜绝浮夸营销措辞</w:t>
+            </w:r>
+          </w:p>
+        </w:tc>
+      </w:tr>
+    </w:tbl>
+    <w:p/>
+    <w:p>
+      <w:r>
+        <w:rPr>
+          <w:rFonts w:ascii="微软雅黑" w:hAnsi="微软雅黑"/>
+          <w:b/>
+          <w:color w:val="0E7490"/>
+          <w:sz w:val="28"/>
+        </w:rPr>
+        <w:t>一、 整体时间轴与导航 Tab 分配一览表</w:t>
       </w:r>
     </w:p>
     <w:tbl>
@@ -39,152 +250,77 @@
         <w:tblLook w:firstColumn="1" w:firstRow="1" w:lastColumn="0" w:lastRow="0" w:noHBand="0" w:noVBand="1" w:val="04A0"/>
       </w:tblPr>
       <w:tblGrid>
-        <w:gridCol w:w="9936"/>
+        <w:gridCol w:w="3312"/>
+        <w:gridCol w:w="3312"/>
+        <w:gridCol w:w="3312"/>
       </w:tblGrid>
       <w:tr>
         <w:tc>
           <w:tcPr>
-            <w:tcW w:type="dxa" w:w="9792"/>
-            <w:shd w:fill="F1F5F9"/>
+            <w:tcW w:type="dxa" w:w="3312"/>
+            <w:shd w:fill="0F172A"/>
+            <w:tcMar>
+              <w:top w:w="100" w:type="dxa"/>
+              <w:bottom w:w="100" w:type="dxa"/>
+              <w:left w:w="120" w:type="dxa"/>
+              <w:right w:w="120" w:type="dxa"/>
+            </w:tcMar>
           </w:tcPr>
           <w:p>
-            <w:pPr>
-              <w:spacing w:before="120" w:after="120"/>
-            </w:pPr>
             <w:r>
               <w:rPr>
-                <w:rFonts w:ascii="微软雅黑" w:hAnsi="微软雅黑" w:eastAsia="微软雅黑"/>
-                <w:b/>
-                <w:color w:val="0F172A"/>
-                <w:sz w:val="20"/>
-              </w:rPr>
-              <w:t>📌 文档说明与演示定位：</w:t>
-              <w:br/>
-            </w:r>
-            <w:r>
-              <w:rPr>
-                <w:rFonts w:ascii="微软雅黑" w:hAnsi="微软雅黑" w:eastAsia="微软雅黑"/>
-                <w:b w:val="0"/>
-                <w:color w:val="334155"/>
-                <w:sz w:val="19"/>
-              </w:rPr>
-              <w:t>• 适用场景：学术汇报、评委答辩录屏、工程技术推介、客户商务演示</w:t>
-              <w:br/>
-              <w:t>• 演示总时长：严格控制在 4分30秒 ~ 4分45秒 之间（5分钟内顺畅讲完）</w:t>
-              <w:br/>
-              <w:t>• 演说语速与风格：语速建议 220 ~ 240 字/分钟，表达客观、克制、严谨，剔除夸张修饰，凸显技术逻辑与工程价值</w:t>
-              <w:br/>
-              <w:t>• 内容涵盖：数据待测留空机制、180秒脉冲微观特征提取、活性锂可逆容量恢复预测、梯次批量分选、制造端碳减排核算与资产评估报告。</w:t>
-            </w:r>
-          </w:p>
-        </w:tc>
-      </w:tr>
-    </w:tbl>
-    <w:p>
-      <w:pPr>
-        <w:pStyle w:val="Heading1"/>
-        <w:spacing w:before="280" w:after="80"/>
-      </w:pPr>
-      <w:r>
-        <w:rPr>
-          <w:rFonts w:ascii="微软雅黑" w:hAnsi="微软雅黑" w:eastAsia="微软雅黑"/>
-          <w:b/>
-          <w:color w:val="0284C7"/>
-          <w:sz w:val="30"/>
-        </w:rPr>
-        <w:t>一、 演示整体时间轴分配一览表</w:t>
-      </w:r>
-    </w:p>
-    <w:tbl>
-      <w:tblPr>
-        <w:tblW w:type="auto" w:w="0"/>
-        <w:jc w:val="center"/>
-        <w:tblLook w:firstColumn="1" w:firstRow="1" w:lastColumn="0" w:lastRow="0" w:noHBand="0" w:noVBand="1" w:val="04A0"/>
-      </w:tblPr>
-      <w:tblGrid>
-        <w:gridCol w:w="2484"/>
-        <w:gridCol w:w="2484"/>
-        <w:gridCol w:w="2484"/>
-        <w:gridCol w:w="2484"/>
-      </w:tblGrid>
-      <w:tr>
-        <w:tc>
-          <w:tcPr>
-            <w:tcW w:type="dxa" w:w="2484"/>
-            <w:shd w:fill="0284C7"/>
-          </w:tcPr>
-          <w:p>
-            <w:pPr>
-              <w:spacing w:before="80" w:after="80"/>
-            </w:pPr>
-            <w:r>
-              <w:rPr>
-                <w:rFonts w:ascii="微软雅黑" w:hAnsi="微软雅黑" w:eastAsia="微软雅黑"/>
+                <w:rFonts w:ascii="微软雅黑" w:hAnsi="微软雅黑"/>
                 <w:b/>
                 <w:color w:val="FFFFFF"/>
                 <w:sz w:val="19"/>
               </w:rPr>
-              <w:t>幕次</w:t>
+              <w:t>场景与时长</w:t>
             </w:r>
           </w:p>
         </w:tc>
         <w:tc>
           <w:tcPr>
-            <w:tcW w:type="dxa" w:w="2484"/>
-            <w:shd w:fill="0284C7"/>
+            <w:tcW w:type="dxa" w:w="3312"/>
+            <w:shd w:fill="0F172A"/>
+            <w:tcMar>
+              <w:top w:w="100" w:type="dxa"/>
+              <w:bottom w:w="100" w:type="dxa"/>
+              <w:left w:w="120" w:type="dxa"/>
+              <w:right w:w="120" w:type="dxa"/>
+            </w:tcMar>
           </w:tcPr>
           <w:p>
-            <w:pPr>
-              <w:spacing w:before="80" w:after="80"/>
-            </w:pPr>
             <w:r>
               <w:rPr>
-                <w:rFonts w:ascii="微软雅黑" w:hAnsi="微软雅黑" w:eastAsia="微软雅黑"/>
+                <w:rFonts w:ascii="微软雅黑" w:hAnsi="微软雅黑"/>
                 <w:b/>
                 <w:color w:val="FFFFFF"/>
                 <w:sz w:val="19"/>
               </w:rPr>
-              <w:t>时间节点</w:t>
+              <w:t>对应界面 Tab</w:t>
             </w:r>
           </w:p>
         </w:tc>
         <w:tc>
           <w:tcPr>
-            <w:tcW w:type="dxa" w:w="2484"/>
-            <w:shd w:fill="0284C7"/>
+            <w:tcW w:type="dxa" w:w="3312"/>
+            <w:shd w:fill="0F172A"/>
+            <w:tcMar>
+              <w:top w:w="100" w:type="dxa"/>
+              <w:bottom w:w="100" w:type="dxa"/>
+              <w:left w:w="120" w:type="dxa"/>
+              <w:right w:w="120" w:type="dxa"/>
+            </w:tcMar>
           </w:tcPr>
           <w:p>
-            <w:pPr>
-              <w:spacing w:before="80" w:after="80"/>
-            </w:pPr>
             <w:r>
               <w:rPr>
-                <w:rFonts w:ascii="微软雅黑" w:hAnsi="微软雅黑" w:eastAsia="微软雅黑"/>
+                <w:rFonts w:ascii="微软雅黑" w:hAnsi="微软雅黑"/>
                 <w:b/>
                 <w:color w:val="FFFFFF"/>
                 <w:sz w:val="19"/>
               </w:rPr>
-              <w:t>演示功能模块与网页操作</w:t>
-            </w:r>
-          </w:p>
-        </w:tc>
-        <w:tc>
-          <w:tcPr>
-            <w:tcW w:type="dxa" w:w="2484"/>
-            <w:shd w:fill="0284C7"/>
-          </w:tcPr>
-          <w:p>
-            <w:pPr>
-              <w:spacing w:before="80" w:after="80"/>
-            </w:pPr>
-            <w:r>
-              <w:rPr>
-                <w:rFonts w:ascii="微软雅黑" w:hAnsi="微软雅黑" w:eastAsia="微软雅黑"/>
-                <w:b/>
-                <w:color w:val="FFFFFF"/>
-                <w:sz w:val="19"/>
-              </w:rPr>
-              <w:t>技术与工程逻辑</w:t>
+              <w:t>核心技术逻辑与演示要点</w:t>
             </w:r>
           </w:p>
         </w:tc>
@@ -192,81 +328,68 @@
       <w:tr>
         <w:tc>
           <w:tcPr>
-            <w:tcW w:type="dxa" w:w="2484"/>
+            <w:tcW w:type="dxa" w:w="2880"/>
             <w:shd w:fill="F8FAFC"/>
+            <w:tcMar>
+              <w:top w:w="90" w:type="dxa"/>
+              <w:bottom w:w="90" w:type="dxa"/>
+              <w:left w:w="100" w:type="dxa"/>
+              <w:right w:w="100" w:type="dxa"/>
+            </w:tcMar>
           </w:tcPr>
           <w:p>
-            <w:pPr>
-              <w:spacing w:before="60" w:after="60"/>
-            </w:pPr>
             <w:r>
               <w:rPr>
-                <w:rFonts w:ascii="微软雅黑" w:hAnsi="微软雅黑" w:eastAsia="微软雅黑"/>
+                <w:rFonts w:ascii="微软雅黑" w:hAnsi="微软雅黑"/>
                 <w:b/>
                 <w:color w:val="0F172A"/>
                 <w:sz w:val="18"/>
               </w:rPr>
-              <w:t>第一幕</w:t>
+              <w:t>第一幕 (00:00 - 00:45, 45s)</w:t>
             </w:r>
           </w:p>
         </w:tc>
         <w:tc>
           <w:tcPr>
-            <w:tcW w:type="dxa" w:w="2484"/>
+            <w:tcW w:type="dxa" w:w="2592"/>
             <w:shd w:fill="F8FAFC"/>
+            <w:tcMar>
+              <w:top w:w="90" w:type="dxa"/>
+              <w:bottom w:w="90" w:type="dxa"/>
+              <w:left w:w="100" w:type="dxa"/>
+              <w:right w:w="100" w:type="dxa"/>
+            </w:tcMar>
           </w:tcPr>
           <w:p>
-            <w:pPr>
-              <w:spacing w:before="60" w:after="60"/>
-            </w:pPr>
             <w:r>
               <w:rPr>
-                <w:rFonts w:ascii="微软雅黑" w:hAnsi="微软雅黑" w:eastAsia="微软雅黑"/>
-                <w:b w:val="0"/>
-                <w:color w:val="0F172A"/>
+                <w:rFonts w:ascii="微软雅黑" w:hAnsi="微软雅黑"/>
+                <w:color w:val="0E7490"/>
                 <w:sz w:val="18"/>
               </w:rPr>
-              <w:t>00:00 - 00:45 (45s)</w:t>
+              <w:t>Tab 1 首页全景与背景</w:t>
             </w:r>
           </w:p>
         </w:tc>
         <w:tc>
           <w:tcPr>
-            <w:tcW w:type="dxa" w:w="2484"/>
+            <w:tcW w:type="dxa" w:w="4320"/>
             <w:shd w:fill="F8FAFC"/>
+            <w:tcMar>
+              <w:top w:w="90" w:type="dxa"/>
+              <w:bottom w:w="90" w:type="dxa"/>
+              <w:left w:w="100" w:type="dxa"/>
+              <w:right w:w="100" w:type="dxa"/>
+            </w:tcMar>
           </w:tcPr>
           <w:p>
-            <w:pPr>
-              <w:spacing w:before="60" w:after="60"/>
-            </w:pPr>
             <w:r>
               <w:rPr>
-                <w:rFonts w:ascii="微软雅黑" w:hAnsi="微软雅黑" w:eastAsia="微软雅黑"/>
-                <w:b w:val="0"/>
-                <w:color w:val="0F172A"/>
-                <w:sz w:val="18"/>
+                <w:rFonts w:ascii="微软雅黑" w:hAnsi="微软雅黑"/>
+                <w:color w:val="334155"/>
+                <w:sz w:val="17"/>
               </w:rPr>
-              <w:t>Tab 1: 首页界面全景与背景</w:t>
-            </w:r>
-          </w:p>
-        </w:tc>
-        <w:tc>
-          <w:tcPr>
-            <w:tcW w:type="dxa" w:w="2484"/>
-            <w:shd w:fill="F8FAFC"/>
-          </w:tcPr>
-          <w:p>
-            <w:pPr>
-              <w:spacing w:before="60" w:after="60"/>
-            </w:pPr>
-            <w:r>
-              <w:rPr>
-                <w:rFonts w:ascii="微软雅黑" w:hAnsi="微软雅黑" w:eastAsia="微软雅黑"/>
-                <w:b w:val="0"/>
-                <w:color w:val="0F172A"/>
-                <w:sz w:val="18"/>
-              </w:rPr>
-              <w:t>阐述退役电池检测耗时长、缺少可逆容量评估的行业背景，引出系统定位</w:t>
+              <w:t>行业痛点：阐述退役动力电池传统检测耗时长、缺少可逆容量恢复评估的实际瓶颈，引出系统定位。</w:t>
             </w:r>
           </w:p>
         </w:tc>
@@ -274,81 +397,68 @@
       <w:tr>
         <w:tc>
           <w:tcPr>
-            <w:tcW w:type="dxa" w:w="2484"/>
+            <w:tcW w:type="dxa" w:w="2880"/>
             <w:shd w:fill="FFFFFF"/>
+            <w:tcMar>
+              <w:top w:w="90" w:type="dxa"/>
+              <w:bottom w:w="90" w:type="dxa"/>
+              <w:left w:w="100" w:type="dxa"/>
+              <w:right w:w="100" w:type="dxa"/>
+            </w:tcMar>
           </w:tcPr>
           <w:p>
-            <w:pPr>
-              <w:spacing w:before="60" w:after="60"/>
-            </w:pPr>
             <w:r>
               <w:rPr>
-                <w:rFonts w:ascii="微软雅黑" w:hAnsi="微软雅黑" w:eastAsia="微软雅黑"/>
+                <w:rFonts w:ascii="微软雅黑" w:hAnsi="微软雅黑"/>
                 <w:b/>
                 <w:color w:val="0F172A"/>
                 <w:sz w:val="18"/>
               </w:rPr>
-              <w:t>第二幕</w:t>
+              <w:t>第二幕 (00:45 - 01:35, 50s)</w:t>
             </w:r>
           </w:p>
         </w:tc>
         <w:tc>
           <w:tcPr>
-            <w:tcW w:type="dxa" w:w="2484"/>
+            <w:tcW w:type="dxa" w:w="2592"/>
             <w:shd w:fill="FFFFFF"/>
+            <w:tcMar>
+              <w:top w:w="90" w:type="dxa"/>
+              <w:bottom w:w="90" w:type="dxa"/>
+              <w:left w:w="100" w:type="dxa"/>
+              <w:right w:w="100" w:type="dxa"/>
+            </w:tcMar>
           </w:tcPr>
           <w:p>
-            <w:pPr>
-              <w:spacing w:before="60" w:after="60"/>
-            </w:pPr>
             <w:r>
               <w:rPr>
-                <w:rFonts w:ascii="微软雅黑" w:hAnsi="微软雅黑" w:eastAsia="微软雅黑"/>
-                <w:b w:val="0"/>
-                <w:color w:val="0F172A"/>
+                <w:rFonts w:ascii="微软雅黑" w:hAnsi="微软雅黑"/>
+                <w:color w:val="0E7490"/>
                 <w:sz w:val="18"/>
               </w:rPr>
-              <w:t>00:45 - 01:40 (55s)</w:t>
+              <w:t>Tab 1 脉冲测试与微观特征</w:t>
             </w:r>
           </w:p>
         </w:tc>
         <w:tc>
           <w:tcPr>
-            <w:tcW w:type="dxa" w:w="2484"/>
+            <w:tcW w:type="dxa" w:w="4320"/>
             <w:shd w:fill="FFFFFF"/>
+            <w:tcMar>
+              <w:top w:w="90" w:type="dxa"/>
+              <w:bottom w:w="90" w:type="dxa"/>
+              <w:left w:w="100" w:type="dxa"/>
+              <w:right w:w="100" w:type="dxa"/>
+            </w:tcMar>
           </w:tcPr>
           <w:p>
-            <w:pPr>
-              <w:spacing w:before="60" w:after="60"/>
-            </w:pPr>
             <w:r>
               <w:rPr>
-                <w:rFonts w:ascii="微软雅黑" w:hAnsi="微软雅黑" w:eastAsia="微软雅黑"/>
-                <w:b w:val="0"/>
-                <w:color w:val="0F172A"/>
-                <w:sz w:val="18"/>
+                <w:rFonts w:ascii="微软雅黑" w:hAnsi="微软雅黑"/>
+                <w:color w:val="334155"/>
+                <w:sz w:val="17"/>
               </w:rPr>
-              <w:t>Tab 1: 脉冲测试与微观特征提取</w:t>
-            </w:r>
-          </w:p>
-        </w:tc>
-        <w:tc>
-          <w:tcPr>
-            <w:tcW w:type="dxa" w:w="2484"/>
-            <w:shd w:fill="FFFFFF"/>
-          </w:tcPr>
-          <w:p>
-            <w:pPr>
-              <w:spacing w:before="60" w:after="60"/>
-            </w:pPr>
-            <w:r>
-              <w:rPr>
-                <w:rFonts w:ascii="微软雅黑" w:hAnsi="微软雅黑" w:eastAsia="微软雅黑"/>
-                <w:b w:val="0"/>
-                <w:color w:val="0F172A"/>
-                <w:sz w:val="18"/>
-              </w:rPr>
-              <w:t>展示未测时的待测留空机制，180秒脉冲提取8项微观特征，MAE保持在1%以内</w:t>
+              <w:t>严谨规范：演示未接入数据时的待测留空机制；调取实测退役电芯数据，180秒脉冲提取8项微观物理机理特征。</w:t>
             </w:r>
           </w:p>
         </w:tc>
@@ -356,81 +466,68 @@
       <w:tr>
         <w:tc>
           <w:tcPr>
-            <w:tcW w:type="dxa" w:w="2484"/>
+            <w:tcW w:type="dxa" w:w="2880"/>
             <w:shd w:fill="F8FAFC"/>
+            <w:tcMar>
+              <w:top w:w="90" w:type="dxa"/>
+              <w:bottom w:w="90" w:type="dxa"/>
+              <w:left w:w="100" w:type="dxa"/>
+              <w:right w:w="100" w:type="dxa"/>
+            </w:tcMar>
           </w:tcPr>
           <w:p>
-            <w:pPr>
-              <w:spacing w:before="60" w:after="60"/>
-            </w:pPr>
             <w:r>
               <w:rPr>
-                <w:rFonts w:ascii="微软雅黑" w:hAnsi="微软雅黑" w:eastAsia="微软雅黑"/>
+                <w:rFonts w:ascii="微软雅黑" w:hAnsi="微软雅黑"/>
                 <w:b/>
                 <w:color w:val="0F172A"/>
                 <w:sz w:val="18"/>
               </w:rPr>
-              <w:t>第三幕</w:t>
+              <w:t>第三幕 (01:35 - 02:05, 30s)</w:t>
             </w:r>
           </w:p>
         </w:tc>
         <w:tc>
           <w:tcPr>
-            <w:tcW w:type="dxa" w:w="2484"/>
+            <w:tcW w:type="dxa" w:w="2592"/>
             <w:shd w:fill="F8FAFC"/>
+            <w:tcMar>
+              <w:top w:w="90" w:type="dxa"/>
+              <w:bottom w:w="90" w:type="dxa"/>
+              <w:left w:w="100" w:type="dxa"/>
+              <w:right w:w="100" w:type="dxa"/>
+            </w:tcMar>
           </w:tcPr>
           <w:p>
-            <w:pPr>
-              <w:spacing w:before="60" w:after="60"/>
-            </w:pPr>
             <w:r>
               <w:rPr>
-                <w:rFonts w:ascii="微软雅黑" w:hAnsi="微软雅黑" w:eastAsia="微软雅黑"/>
-                <w:b w:val="0"/>
-                <w:color w:val="0F172A"/>
+                <w:rFonts w:ascii="微软雅黑" w:hAnsi="微软雅黑"/>
+                <w:color w:val="0E7490"/>
                 <w:sz w:val="18"/>
               </w:rPr>
-              <w:t>01:40 - 02:35 (55s)</w:t>
+              <w:t>Tab 2 实时测试示波器</w:t>
             </w:r>
           </w:p>
         </w:tc>
         <w:tc>
           <w:tcPr>
-            <w:tcW w:type="dxa" w:w="2484"/>
+            <w:tcW w:type="dxa" w:w="4320"/>
             <w:shd w:fill="F8FAFC"/>
+            <w:tcMar>
+              <w:top w:w="90" w:type="dxa"/>
+              <w:bottom w:w="90" w:type="dxa"/>
+              <w:left w:w="100" w:type="dxa"/>
+              <w:right w:w="100" w:type="dxa"/>
+            </w:tcMar>
           </w:tcPr>
           <w:p>
-            <w:pPr>
-              <w:spacing w:before="60" w:after="60"/>
-            </w:pPr>
             <w:r>
               <w:rPr>
-                <w:rFonts w:ascii="微软雅黑" w:hAnsi="微软雅黑" w:eastAsia="微软雅黑"/>
-                <w:b w:val="0"/>
-                <w:color w:val="0F172A"/>
-                <w:sz w:val="18"/>
+                <w:rFonts w:ascii="微软雅黑" w:hAnsi="微软雅黑"/>
+                <w:color w:val="334155"/>
+                <w:sz w:val="17"/>
               </w:rPr>
-              <w:t>Tab 4: 容量恢复预测与模组分选</w:t>
-            </w:r>
-          </w:p>
-        </w:tc>
-        <w:tc>
-          <w:tcPr>
-            <w:tcW w:type="dxa" w:w="2484"/>
-            <w:shd w:fill="F8FAFC"/>
-          </w:tcPr>
-          <w:p>
-            <w:pPr>
-              <w:spacing w:before="60" w:after="60"/>
-            </w:pPr>
-            <w:r>
-              <w:rPr>
-                <w:rFonts w:ascii="微软雅黑" w:hAnsi="微软雅黑" w:eastAsia="微软雅黑"/>
-                <w:b w:val="0"/>
-                <w:color w:val="0F172A"/>
-                <w:sz w:val="18"/>
-              </w:rPr>
-              <w:t>基于电化学活化机理预测可恢复容量Q_rec，提供90%保角置信区间与100只批量分选</w:t>
+              <w:t>硬件直连：切换示波器呈现 60 FPS 动态双通道瞬态曲线与四端子开尔文采样状态，表征硬件级测试闭环。</w:t>
             </w:r>
           </w:p>
         </w:tc>
@@ -438,81 +535,68 @@
       <w:tr>
         <w:tc>
           <w:tcPr>
-            <w:tcW w:type="dxa" w:w="2484"/>
+            <w:tcW w:type="dxa" w:w="2880"/>
             <w:shd w:fill="FFFFFF"/>
+            <w:tcMar>
+              <w:top w:w="90" w:type="dxa"/>
+              <w:bottom w:w="90" w:type="dxa"/>
+              <w:left w:w="100" w:type="dxa"/>
+              <w:right w:w="100" w:type="dxa"/>
+            </w:tcMar>
           </w:tcPr>
           <w:p>
-            <w:pPr>
-              <w:spacing w:before="60" w:after="60"/>
-            </w:pPr>
             <w:r>
               <w:rPr>
-                <w:rFonts w:ascii="微软雅黑" w:hAnsi="微软雅黑" w:eastAsia="微软雅黑"/>
+                <w:rFonts w:ascii="微软雅黑" w:hAnsi="微软雅黑"/>
                 <w:b/>
                 <w:color w:val="0F172A"/>
                 <w:sz w:val="18"/>
               </w:rPr>
-              <w:t>第四幕</w:t>
+              <w:t>第四幕 (02:05 - 02:25, 20s)</w:t>
             </w:r>
           </w:p>
         </w:tc>
         <w:tc>
           <w:tcPr>
-            <w:tcW w:type="dxa" w:w="2484"/>
+            <w:tcW w:type="dxa" w:w="2592"/>
             <w:shd w:fill="FFFFFF"/>
+            <w:tcMar>
+              <w:top w:w="90" w:type="dxa"/>
+              <w:bottom w:w="90" w:type="dxa"/>
+              <w:left w:w="100" w:type="dxa"/>
+              <w:right w:w="100" w:type="dxa"/>
+            </w:tcMar>
           </w:tcPr>
           <w:p>
-            <w:pPr>
-              <w:spacing w:before="60" w:after="60"/>
-            </w:pPr>
             <w:r>
               <w:rPr>
-                <w:rFonts w:ascii="微软雅黑" w:hAnsi="微软雅黑" w:eastAsia="微软雅黑"/>
-                <w:b w:val="0"/>
-                <w:color w:val="0F172A"/>
+                <w:rFonts w:ascii="微软雅黑" w:hAnsi="微软雅黑"/>
+                <w:color w:val="0E7490"/>
                 <w:sz w:val="18"/>
               </w:rPr>
-              <w:t>02:35 - 03:25 (50s)</w:t>
+              <w:t>Tab 3 特征工程与算法对照</w:t>
             </w:r>
           </w:p>
         </w:tc>
         <w:tc>
           <w:tcPr>
-            <w:tcW w:type="dxa" w:w="2484"/>
+            <w:tcW w:type="dxa" w:w="4320"/>
             <w:shd w:fill="FFFFFF"/>
+            <w:tcMar>
+              <w:top w:w="90" w:type="dxa"/>
+              <w:bottom w:w="90" w:type="dxa"/>
+              <w:left w:w="100" w:type="dxa"/>
+              <w:right w:w="100" w:type="dxa"/>
+            </w:tcMar>
           </w:tcPr>
           <w:p>
-            <w:pPr>
-              <w:spacing w:before="60" w:after="60"/>
-            </w:pPr>
             <w:r>
               <w:rPr>
-                <w:rFonts w:ascii="微软雅黑" w:hAnsi="微软雅黑" w:eastAsia="微软雅黑"/>
-                <w:b w:val="0"/>
-                <w:color w:val="0F172A"/>
-                <w:sz w:val="18"/>
+                <w:rFonts w:ascii="微软雅黑" w:hAnsi="微软雅黑"/>
+                <w:color w:val="334155"/>
+                <w:sz w:val="17"/>
               </w:rPr>
-              <w:t>Tab 2 &amp; Tab 5: 实时采样与碳核算</w:t>
-            </w:r>
-          </w:p>
-        </w:tc>
-        <w:tc>
-          <w:tcPr>
-            <w:tcW w:type="dxa" w:w="2484"/>
-            <w:shd w:fill="FFFFFF"/>
-          </w:tcPr>
-          <w:p>
-            <w:pPr>
-              <w:spacing w:before="60" w:after="60"/>
-            </w:pPr>
-            <w:r>
-              <w:rPr>
-                <w:rFonts w:ascii="微软雅黑" w:hAnsi="微软雅黑" w:eastAsia="微软雅黑"/>
-                <w:b w:val="0"/>
-                <w:color w:val="0F172A"/>
-                <w:sz w:val="18"/>
-              </w:rPr>
-              <w:t>展示示波器实时动态脉冲采样，换算新电池制造端规避排放，量化净碳减排量</w:t>
+              <w:t>算法透明：呈现微观特征敏感度排序，解析主导特征机理；呈现多模型留一交叉验证误差矩阵，证实 XGBoost 优势。</w:t>
             </w:r>
           </w:p>
         </w:tc>
@@ -520,81 +604,68 @@
       <w:tr>
         <w:tc>
           <w:tcPr>
-            <w:tcW w:type="dxa" w:w="2484"/>
+            <w:tcW w:type="dxa" w:w="2880"/>
             <w:shd w:fill="F8FAFC"/>
+            <w:tcMar>
+              <w:top w:w="90" w:type="dxa"/>
+              <w:bottom w:w="90" w:type="dxa"/>
+              <w:left w:w="100" w:type="dxa"/>
+              <w:right w:w="100" w:type="dxa"/>
+            </w:tcMar>
           </w:tcPr>
           <w:p>
-            <w:pPr>
-              <w:spacing w:before="60" w:after="60"/>
-            </w:pPr>
             <w:r>
               <w:rPr>
-                <w:rFonts w:ascii="微软雅黑" w:hAnsi="微软雅黑" w:eastAsia="微软雅黑"/>
+                <w:rFonts w:ascii="微软雅黑" w:hAnsi="微软雅黑"/>
                 <w:b/>
                 <w:color w:val="0F172A"/>
                 <w:sz w:val="18"/>
               </w:rPr>
-              <w:t>第五幕</w:t>
+              <w:t>第五幕 (02:25 - 03:15, 50s)</w:t>
             </w:r>
           </w:p>
         </w:tc>
         <w:tc>
           <w:tcPr>
-            <w:tcW w:type="dxa" w:w="2484"/>
+            <w:tcW w:type="dxa" w:w="2592"/>
             <w:shd w:fill="F8FAFC"/>
+            <w:tcMar>
+              <w:top w:w="90" w:type="dxa"/>
+              <w:bottom w:w="90" w:type="dxa"/>
+              <w:left w:w="100" w:type="dxa"/>
+              <w:right w:w="100" w:type="dxa"/>
+            </w:tcMar>
           </w:tcPr>
           <w:p>
-            <w:pPr>
-              <w:spacing w:before="60" w:after="60"/>
-            </w:pPr>
             <w:r>
               <w:rPr>
-                <w:rFonts w:ascii="微软雅黑" w:hAnsi="微软雅黑" w:eastAsia="微软雅黑"/>
-                <w:b w:val="0"/>
-                <w:color w:val="0F172A"/>
+                <w:rFonts w:ascii="微软雅黑" w:hAnsi="微软雅黑"/>
+                <w:color w:val="0E7490"/>
                 <w:sz w:val="18"/>
               </w:rPr>
-              <w:t>03:25 - 04:20 (55s)</w:t>
+              <w:t>Tab 4 容量恢复与批量分选</w:t>
             </w:r>
           </w:p>
         </w:tc>
         <w:tc>
           <w:tcPr>
-            <w:tcW w:type="dxa" w:w="2484"/>
+            <w:tcW w:type="dxa" w:w="4320"/>
             <w:shd w:fill="F8FAFC"/>
+            <w:tcMar>
+              <w:top w:w="90" w:type="dxa"/>
+              <w:bottom w:w="90" w:type="dxa"/>
+              <w:left w:w="100" w:type="dxa"/>
+              <w:right w:w="100" w:type="dxa"/>
+            </w:tcMar>
           </w:tcPr>
           <w:p>
-            <w:pPr>
-              <w:spacing w:before="60" w:after="60"/>
-            </w:pPr>
             <w:r>
               <w:rPr>
-                <w:rFonts w:ascii="微软雅黑" w:hAnsi="微软雅黑" w:eastAsia="微软雅黑"/>
-                <w:b w:val="0"/>
-                <w:color w:val="0F172A"/>
-                <w:sz w:val="18"/>
+                <w:rFonts w:ascii="微软雅黑" w:hAnsi="微软雅黑"/>
+                <w:color w:val="334155"/>
+                <w:sz w:val="17"/>
               </w:rPr>
-              <w:t>Tab 6: 资产评估与报告生成</w:t>
-            </w:r>
-          </w:p>
-        </w:tc>
-        <w:tc>
-          <w:tcPr>
-            <w:tcW w:type="dxa" w:w="2484"/>
-            <w:shd w:fill="F8FAFC"/>
-          </w:tcPr>
-          <w:p>
-            <w:pPr>
-              <w:spacing w:before="60" w:after="60"/>
-            </w:pPr>
-            <w:r>
-              <w:rPr>
-                <w:rFonts w:ascii="微软雅黑" w:hAnsi="微软雅黑" w:eastAsia="微软雅黑"/>
-                <w:b w:val="0"/>
-                <w:color w:val="0F172A"/>
-                <w:sz w:val="18"/>
-              </w:rPr>
-              <w:t>全维登记送检参数，依据实测数据测算参考残值，生成标准格式的评估报告</w:t>
+              <w:t>机理推演：基于电化学活化机理预测可恢复容量与 90% 保角置信区间；呈现 100 只电芯批量快筛矩阵与 CSV 导出。</w:t>
             </w:r>
           </w:p>
         </w:tc>
@@ -602,114 +673,243 @@
       <w:tr>
         <w:tc>
           <w:tcPr>
-            <w:tcW w:type="dxa" w:w="2484"/>
+            <w:tcW w:type="dxa" w:w="2880"/>
             <w:shd w:fill="FFFFFF"/>
+            <w:tcMar>
+              <w:top w:w="90" w:type="dxa"/>
+              <w:bottom w:w="90" w:type="dxa"/>
+              <w:left w:w="100" w:type="dxa"/>
+              <w:right w:w="100" w:type="dxa"/>
+            </w:tcMar>
           </w:tcPr>
           <w:p>
-            <w:pPr>
-              <w:spacing w:before="60" w:after="60"/>
-            </w:pPr>
             <w:r>
               <w:rPr>
-                <w:rFonts w:ascii="微软雅黑" w:hAnsi="微软雅黑" w:eastAsia="微软雅黑"/>
+                <w:rFonts w:ascii="微软雅黑" w:hAnsi="微软雅黑"/>
                 <w:b/>
                 <w:color w:val="0F172A"/>
                 <w:sz w:val="18"/>
               </w:rPr>
-              <w:t>第六幕</w:t>
+              <w:t>第六幕 (03:15 - 03:55, 40s)</w:t>
             </w:r>
           </w:p>
         </w:tc>
         <w:tc>
           <w:tcPr>
-            <w:tcW w:type="dxa" w:w="2484"/>
+            <w:tcW w:type="dxa" w:w="2592"/>
             <w:shd w:fill="FFFFFF"/>
+            <w:tcMar>
+              <w:top w:w="90" w:type="dxa"/>
+              <w:bottom w:w="90" w:type="dxa"/>
+              <w:left w:w="100" w:type="dxa"/>
+              <w:right w:w="100" w:type="dxa"/>
+            </w:tcMar>
           </w:tcPr>
           <w:p>
-            <w:pPr>
-              <w:spacing w:before="60" w:after="60"/>
-            </w:pPr>
             <w:r>
               <w:rPr>
-                <w:rFonts w:ascii="微软雅黑" w:hAnsi="微软雅黑" w:eastAsia="微软雅黑"/>
-                <w:b w:val="0"/>
-                <w:color w:val="0F172A"/>
+                <w:rFonts w:ascii="微软雅黑" w:hAnsi="微软雅黑"/>
+                <w:color w:val="0E7490"/>
                 <w:sz w:val="18"/>
               </w:rPr>
-              <w:t>04:20 - 04:45 (25s)</w:t>
+              <w:t>Tab 5 制造端碳减排核算</w:t>
             </w:r>
           </w:p>
         </w:tc>
         <w:tc>
           <w:tcPr>
-            <w:tcW w:type="dxa" w:w="2484"/>
+            <w:tcW w:type="dxa" w:w="4320"/>
             <w:shd w:fill="FFFFFF"/>
+            <w:tcMar>
+              <w:top w:w="90" w:type="dxa"/>
+              <w:bottom w:w="90" w:type="dxa"/>
+              <w:left w:w="100" w:type="dxa"/>
+              <w:right w:w="100" w:type="dxa"/>
+            </w:tcMar>
           </w:tcPr>
           <w:p>
-            <w:pPr>
-              <w:spacing w:before="60" w:after="60"/>
-            </w:pPr>
             <w:r>
               <w:rPr>
-                <w:rFonts w:ascii="微软雅黑" w:hAnsi="微软雅黑" w:eastAsia="微软雅黑"/>
-                <w:b w:val="0"/>
+                <w:rFonts w:ascii="微软雅黑" w:hAnsi="微软雅黑"/>
+                <w:color w:val="334155"/>
+                <w:sz w:val="17"/>
+              </w:rPr>
+              <w:t>低碳循环：参照产品碳足迹标准，将恢复容量等效为替代新电池制造所规避排放，量化瀑布分解链路与净减排量。</w:t>
+            </w:r>
+          </w:p>
+        </w:tc>
+      </w:tr>
+      <w:tr>
+        <w:tc>
+          <w:tcPr>
+            <w:tcW w:type="dxa" w:w="2880"/>
+            <w:shd w:fill="F8FAFC"/>
+            <w:tcMar>
+              <w:top w:w="90" w:type="dxa"/>
+              <w:bottom w:w="90" w:type="dxa"/>
+              <w:left w:w="100" w:type="dxa"/>
+              <w:right w:w="100" w:type="dxa"/>
+            </w:tcMar>
+          </w:tcPr>
+          <w:p>
+            <w:r>
+              <w:rPr>
+                <w:rFonts w:ascii="微软雅黑" w:hAnsi="微软雅黑"/>
+                <w:b/>
                 <w:color w:val="0F172A"/>
                 <w:sz w:val="18"/>
               </w:rPr>
-              <w:t>Tab 7: 决策报告整合与总结</w:t>
+              <w:t>第七幕 (03:55 - 04:35, 40s)</w:t>
             </w:r>
           </w:p>
         </w:tc>
         <w:tc>
           <w:tcPr>
-            <w:tcW w:type="dxa" w:w="2484"/>
-            <w:shd w:fill="FFFFFF"/>
+            <w:tcW w:type="dxa" w:w="2592"/>
+            <w:shd w:fill="F8FAFC"/>
+            <w:tcMar>
+              <w:top w:w="90" w:type="dxa"/>
+              <w:bottom w:w="90" w:type="dxa"/>
+              <w:left w:w="100" w:type="dxa"/>
+              <w:right w:w="100" w:type="dxa"/>
+            </w:tcMar>
           </w:tcPr>
           <w:p>
-            <w:pPr>
-              <w:spacing w:before="60" w:after="60"/>
-            </w:pPr>
             <w:r>
               <w:rPr>
-                <w:rFonts w:ascii="微软雅黑" w:hAnsi="微软雅黑" w:eastAsia="微软雅黑"/>
-                <w:b w:val="0"/>
+                <w:rFonts w:ascii="微软雅黑" w:hAnsi="微软雅黑"/>
+                <w:color w:val="0E7490"/>
+                <w:sz w:val="18"/>
+              </w:rPr>
+              <w:t>Tab 6 资产评估与质检公证书</w:t>
+            </w:r>
+          </w:p>
+        </w:tc>
+        <w:tc>
+          <w:tcPr>
+            <w:tcW w:type="dxa" w:w="4320"/>
+            <w:shd w:fill="F8FAFC"/>
+            <w:tcMar>
+              <w:top w:w="90" w:type="dxa"/>
+              <w:bottom w:w="90" w:type="dxa"/>
+              <w:left w:w="100" w:type="dxa"/>
+              <w:right w:w="100" w:type="dxa"/>
+            </w:tcMar>
+          </w:tcPr>
+          <w:p>
+            <w:r>
+              <w:rPr>
+                <w:rFonts w:ascii="微软雅黑" w:hAnsi="微软雅黑"/>
+                <w:color w:val="334155"/>
+                <w:sz w:val="17"/>
+              </w:rPr>
+              <w:t>商业闭环：演示多场景体检档案建档；呈现第三方商业质检评估公证书，明确给出直流内阻与真实可恢复潜力。</w:t>
+            </w:r>
+          </w:p>
+        </w:tc>
+      </w:tr>
+      <w:tr>
+        <w:tc>
+          <w:tcPr>
+            <w:tcW w:type="dxa" w:w="2880"/>
+            <w:shd w:fill="FFFFFF"/>
+            <w:tcMar>
+              <w:top w:w="90" w:type="dxa"/>
+              <w:bottom w:w="90" w:type="dxa"/>
+              <w:left w:w="100" w:type="dxa"/>
+              <w:right w:w="100" w:type="dxa"/>
+            </w:tcMar>
+          </w:tcPr>
+          <w:p>
+            <w:r>
+              <w:rPr>
+                <w:rFonts w:ascii="微软雅黑" w:hAnsi="微软雅黑"/>
+                <w:b/>
                 <w:color w:val="0F172A"/>
                 <w:sz w:val="18"/>
               </w:rPr>
-              <w:t>系统汇总全链条分析指标，总结平台在快速诊断与梯次利用中的工程支撑价值</w:t>
+              <w:t>第八幕 (04:35 - 04:55, 20s)</w:t>
+            </w:r>
+          </w:p>
+        </w:tc>
+        <w:tc>
+          <w:tcPr>
+            <w:tcW w:type="dxa" w:w="2592"/>
+            <w:shd w:fill="FFFFFF"/>
+            <w:tcMar>
+              <w:top w:w="90" w:type="dxa"/>
+              <w:bottom w:w="90" w:type="dxa"/>
+              <w:left w:w="100" w:type="dxa"/>
+              <w:right w:w="100" w:type="dxa"/>
+            </w:tcMar>
+          </w:tcPr>
+          <w:p>
+            <w:r>
+              <w:rPr>
+                <w:rFonts w:ascii="微软雅黑" w:hAnsi="微软雅黑"/>
+                <w:color w:val="0E7490"/>
+                <w:sz w:val="18"/>
+              </w:rPr>
+              <w:t>Tab 7 综合决策报告与总结</w:t>
+            </w:r>
+          </w:p>
+        </w:tc>
+        <w:tc>
+          <w:tcPr>
+            <w:tcW w:type="dxa" w:w="4320"/>
+            <w:shd w:fill="FFFFFF"/>
+            <w:tcMar>
+              <w:top w:w="90" w:type="dxa"/>
+              <w:bottom w:w="90" w:type="dxa"/>
+              <w:left w:w="100" w:type="dxa"/>
+              <w:right w:w="100" w:type="dxa"/>
+            </w:tcMar>
+          </w:tcPr>
+          <w:p>
+            <w:r>
+              <w:rPr>
+                <w:rFonts w:ascii="微软雅黑" w:hAnsi="微软雅黑"/>
+                <w:color w:val="334155"/>
+                <w:sz w:val="17"/>
+              </w:rPr>
+              <w:t>决策总结：汇总全链条多维评估指标，形成结构化报告，总结系统在快速诊断与梯次利用中的工程支撑价值。</w:t>
             </w:r>
           </w:p>
         </w:tc>
       </w:tr>
     </w:tbl>
+    <w:p/>
     <w:p>
-      <w:pPr>
-        <w:pStyle w:val="Heading1"/>
-        <w:spacing w:before="280" w:after="80"/>
-      </w:pPr>
       <w:r>
         <w:rPr>
-          <w:rFonts w:ascii="微软雅黑" w:hAnsi="微软雅黑" w:eastAsia="微软雅黑"/>
+          <w:rFonts w:ascii="微软雅黑" w:hAnsi="微软雅黑"/>
           <w:b/>
-          <w:color w:val="0284C7"/>
-          <w:sz w:val="30"/>
+          <w:color w:val="0E7490"/>
+          <w:sz w:val="28"/>
         </w:rPr>
-        <w:t>二、 录屏分镜操作与解说台词表 (润色严谨版)</w:t>
+        <w:t>二、 录屏实操分镜与解说台词逐字稿</w:t>
       </w:r>
     </w:p>
     <w:p>
-      <w:pPr>
-        <w:pStyle w:val="Heading2"/>
-        <w:spacing w:before="280" w:after="80"/>
-      </w:pPr>
       <w:r>
         <w:rPr>
-          <w:rFonts w:ascii="微软雅黑" w:hAnsi="微软雅黑" w:eastAsia="微软雅黑"/>
+          <w:rFonts w:ascii="微软雅黑" w:hAnsi="微软雅黑"/>
+          <w:b/>
+          <w:color w:val="0F172A"/>
+          <w:sz w:val="24"/>
+        </w:rPr>
+        <w:t>【第一幕：开场总览与背景切入】（00:00 - 00:45，时长45秒）</w:t>
+      </w:r>
+    </w:p>
+    <w:p>
+      <w:r>
+        <w:rPr>
+          <w:rFonts w:ascii="微软雅黑" w:hAnsi="微软雅黑"/>
           <w:b/>
           <w:color w:val="0E7490"/>
-          <w:sz w:val="25"/>
+          <w:sz w:val="20"/>
         </w:rPr>
-        <w:t>【第一幕：开场总览与背景切入】（00:00 - 00:45，时长45秒）</w:t>
+        <w:t>📍 当前界面位置：停留在 Tab 1：全流程决策工作台</w:t>
       </w:r>
     </w:p>
     <w:tbl>
@@ -727,43 +927,66 @@
           <w:tcPr>
             <w:tcW w:type="dxa" w:w="2160"/>
             <w:shd w:fill="F1F5F9"/>
+            <w:tcMar>
+              <w:top w:w="100" w:type="dxa"/>
+              <w:bottom w:w="100" w:type="dxa"/>
+              <w:left w:w="120" w:type="dxa"/>
+              <w:right w:w="120" w:type="dxa"/>
+            </w:tcMar>
           </w:tcPr>
           <w:p>
-            <w:pPr>
-              <w:spacing w:before="80" w:after="80"/>
-            </w:pPr>
             <w:r>
               <w:rPr>
-                <w:rFonts w:ascii="微软雅黑" w:hAnsi="微软雅黑" w:eastAsia="微软雅黑"/>
+                <w:rFonts w:ascii="微软雅黑" w:hAnsi="微软雅黑"/>
                 <w:b/>
-                <w:color w:val="0E7490"/>
+                <w:color w:val="1E293B"/>
                 <w:sz w:val="19"/>
               </w:rPr>
-              <w:t>🖥️ 画面焦点与实操动作</w:t>
+              <w:t>🖥️ 画面焦点与</w:t>
+              <w:br/>
+              <w:t>鼠标实操动作</w:t>
             </w:r>
           </w:p>
         </w:tc>
         <w:tc>
           <w:tcPr>
             <w:tcW w:type="dxa" w:w="7632"/>
-            <w:shd w:fill="FFFFFF"/>
+            <w:shd w:fill="FAFAFA"/>
+            <w:tcMar>
+              <w:top w:w="100" w:type="dxa"/>
+              <w:bottom w:w="100" w:type="dxa"/>
+              <w:left w:w="120" w:type="dxa"/>
+              <w:right w:w="120" w:type="dxa"/>
+            </w:tcMar>
           </w:tcPr>
           <w:p>
-            <w:pPr>
-              <w:spacing w:before="80" w:after="80"/>
-            </w:pPr>
             <w:r>
               <w:rPr>
-                <w:rFonts w:ascii="微软雅黑" w:hAnsi="微软雅黑" w:eastAsia="微软雅黑"/>
-                <w:b w:val="0"/>
-                <w:color w:val="0F172A"/>
+                <w:rFonts w:ascii="微软雅黑" w:hAnsi="微软雅黑"/>
+                <w:color w:val="334155"/>
                 <w:sz w:val="19"/>
               </w:rPr>
-              <w:t>1. 浏览器全屏展示网页，初始页面停留在 Tab 1（极速诊断决策工作台）；</w:t>
-              <w:br/>
+              <w:t>1. 浏览器全屏呈现，页面停留在 Tab 1（极速诊断决策工作台）；</w:t>
+            </w:r>
+          </w:p>
+          <w:p>
+            <w:r>
+              <w:rPr>
+                <w:rFonts w:ascii="微软雅黑" w:hAnsi="微软雅黑"/>
+                <w:color w:val="334155"/>
+                <w:sz w:val="19"/>
+              </w:rPr>
               <w:t>2. 鼠标平缓从顶部大标题《焕芯·电愈智策》划过，顺次滑过左侧输入控制台与右侧决策看板大卡片；</w:t>
-              <w:br/>
-              <w:t>3. 鼠标在右上方状态徽标与导航标签上稍作停留。</w:t>
+            </w:r>
+          </w:p>
+          <w:p>
+            <w:r>
+              <w:rPr>
+                <w:rFonts w:ascii="微软雅黑" w:hAnsi="微软雅黑"/>
+                <w:color w:val="334155"/>
+                <w:sz w:val="19"/>
+              </w:rPr>
+              <w:t>3. 鼠标在右上方材料体系状态徽标与导航标签上稍作停留，展现全景架构。</w:t>
             </w:r>
           </w:p>
         </w:tc>
@@ -772,45 +995,66 @@
         <w:tc>
           <w:tcPr>
             <w:tcW w:type="dxa" w:w="2160"/>
-            <w:shd w:fill="F1F5F9"/>
+            <w:shd w:fill="E0F2FE"/>
+            <w:tcMar>
+              <w:top w:w="120" w:type="dxa"/>
+              <w:bottom w:w="120" w:type="dxa"/>
+              <w:left w:w="120" w:type="dxa"/>
+              <w:right w:w="120" w:type="dxa"/>
+            </w:tcMar>
           </w:tcPr>
           <w:p>
-            <w:pPr>
-              <w:spacing w:before="80" w:after="80"/>
-            </w:pPr>
             <w:r>
               <w:rPr>
-                <w:rFonts w:ascii="微软雅黑" w:hAnsi="微软雅黑" w:eastAsia="微软雅黑"/>
+                <w:rFonts w:ascii="微软雅黑" w:hAnsi="微软雅黑"/>
                 <w:b/>
-                <w:color w:val="0E7490"/>
+                <w:color w:val="0369A1"/>
                 <w:sz w:val="19"/>
               </w:rPr>
-              <w:t>🎙️ 同步解说台词逐字稿</w:t>
+              <w:t>🎙️ 同步解说</w:t>
+              <w:br/>
+              <w:t>台词逐字稿</w:t>
             </w:r>
           </w:p>
         </w:tc>
         <w:tc>
           <w:tcPr>
             <w:tcW w:type="dxa" w:w="7632"/>
-            <w:shd w:fill="FAFAFA"/>
+            <w:shd w:fill="F0F9FF"/>
+            <w:tcMar>
+              <w:top w:w="120" w:type="dxa"/>
+              <w:bottom w:w="120" w:type="dxa"/>
+              <w:left w:w="120" w:type="dxa"/>
+              <w:right w:w="120" w:type="dxa"/>
+            </w:tcMar>
           </w:tcPr>
           <w:p>
-            <w:pPr>
-              <w:spacing w:before="80" w:after="80"/>
-            </w:pPr>
             <w:r>
               <w:rPr>
-                <w:rFonts w:ascii="微软雅黑" w:hAnsi="微软雅黑" w:eastAsia="微软雅黑"/>
-                <w:b/>
+                <w:rFonts w:ascii="微软雅黑" w:hAnsi="微软雅黑"/>
                 <w:color w:val="0F172A"/>
-                <w:sz w:val="19"/>
+                <w:sz w:val="20"/>
               </w:rPr>
               <w:t>“大家好，欢迎观看《焕芯·电愈智策》系统的功能演示。</w:t>
-              <w:br/>
-              <w:br/>
+            </w:r>
+          </w:p>
+          <w:p>
+            <w:r>
+              <w:rPr>
+                <w:rFonts w:ascii="微软雅黑" w:hAnsi="微软雅黑"/>
+                <w:color w:val="0F172A"/>
+                <w:sz w:val="20"/>
+              </w:rPr>
               <w:t>在退役动力与储能电池的回收利用环节中，传统容量检测通常需要完整的充放电循环，单次测试耗时约 6 至 8 小时。同时，常规检测多聚焦于当前的静态容量衰减，较少涉及微调理对可逆容量的恢复评估。</w:t>
-              <w:br/>
-              <w:br/>
+            </w:r>
+          </w:p>
+          <w:p>
+            <w:r>
+              <w:rPr>
+                <w:rFonts w:ascii="微软雅黑" w:hAnsi="微软雅黑"/>
+                <w:color w:val="0F172A"/>
+                <w:sz w:val="20"/>
+              </w:rPr>
               <w:t>针对上述实际工况，本系统构建了一套面向多材料体系电池的快速诊断与循环决策平台，涵盖微观特征提取、SOH 健康度评估、容量恢复量预估、模组梯次分选以及制造端碳减排核算等功能。”</w:t>
             </w:r>
           </w:p>
@@ -820,63 +1064,71 @@
         <w:tc>
           <w:tcPr>
             <w:tcW w:type="dxa" w:w="2160"/>
-            <w:shd w:fill="F1F5F9"/>
+            <w:shd w:fill="FEF3C7"/>
+            <w:tcMar>
+              <w:top w:w="80" w:type="dxa"/>
+              <w:bottom w:w="80" w:type="dxa"/>
+              <w:left w:w="120" w:type="dxa"/>
+              <w:right w:w="120" w:type="dxa"/>
+            </w:tcMar>
           </w:tcPr>
           <w:p>
-            <w:pPr>
-              <w:spacing w:before="80" w:after="80"/>
-            </w:pPr>
             <w:r>
               <w:rPr>
-                <w:rFonts w:ascii="微软雅黑" w:hAnsi="微软雅黑" w:eastAsia="微软雅黑"/>
+                <w:rFonts w:ascii="微软雅黑" w:hAnsi="微软雅黑"/>
                 <w:b/>
-                <w:color w:val="0E7490"/>
-                <w:sz w:val="19"/>
+                <w:color w:val="B45309"/>
+                <w:sz w:val="18"/>
               </w:rPr>
-              <w:t>💡 录屏关键提示</w:t>
+              <w:t>💡 录屏关键指引</w:t>
             </w:r>
           </w:p>
         </w:tc>
         <w:tc>
           <w:tcPr>
             <w:tcW w:type="dxa" w:w="7632"/>
-            <w:shd w:fill="FFFFFF"/>
+            <w:shd w:fill="FFFBEB"/>
+            <w:tcMar>
+              <w:top w:w="80" w:type="dxa"/>
+              <w:bottom w:w="80" w:type="dxa"/>
+              <w:left w:w="120" w:type="dxa"/>
+              <w:right w:w="120" w:type="dxa"/>
+            </w:tcMar>
           </w:tcPr>
           <w:p>
-            <w:pPr>
-              <w:spacing w:before="80" w:after="80"/>
-            </w:pPr>
             <w:r>
               <w:rPr>
-                <w:rFonts w:ascii="微软雅黑" w:hAnsi="微软雅黑" w:eastAsia="微软雅黑"/>
-                <w:b w:val="0"/>
-                <w:color w:val="0F172A"/>
-                <w:sz w:val="19"/>
+                <w:rFonts w:ascii="微软雅黑" w:hAnsi="微软雅黑"/>
+                <w:color w:val="92400E"/>
+                <w:sz w:val="18"/>
               </w:rPr>
-              <w:t>语速沉稳自然，客观陈述行业实际测试痛点，避免任何夸张词汇。</w:t>
+              <w:t>语速沉稳自然，客观陈述行业实际测试痛点，避免浮夸词汇。</w:t>
             </w:r>
           </w:p>
         </w:tc>
       </w:tr>
     </w:tbl>
+    <w:p/>
     <w:p>
-      <w:pPr>
-        <w:spacing w:after="120"/>
-      </w:pPr>
+      <w:r>
+        <w:rPr>
+          <w:rFonts w:ascii="微软雅黑" w:hAnsi="微软雅黑"/>
+          <w:b/>
+          <w:color w:val="0F172A"/>
+          <w:sz w:val="24"/>
+        </w:rPr>
+        <w:t>【第二幕：脉冲测试与微观特征提取】（00:45 - 01:35，时长50秒）</w:t>
+      </w:r>
     </w:p>
     <w:p>
-      <w:pPr>
-        <w:pStyle w:val="Heading2"/>
-        <w:spacing w:before="280" w:after="80"/>
-      </w:pPr>
       <w:r>
         <w:rPr>
-          <w:rFonts w:ascii="微软雅黑" w:hAnsi="微软雅黑" w:eastAsia="微软雅黑"/>
+          <w:rFonts w:ascii="微软雅黑" w:hAnsi="微软雅黑"/>
           <w:b/>
           <w:color w:val="0E7490"/>
-          <w:sz w:val="25"/>
+          <w:sz w:val="20"/>
         </w:rPr>
-        <w:t>【第二幕：脉冲测试与微观特征提取】（00:45 - 01:40，时长55秒）</w:t>
+        <w:t>📍 当前界面位置：Tab 1：全流程决策工作台</w:t>
       </w:r>
     </w:p>
     <w:tbl>
@@ -894,43 +1146,66 @@
           <w:tcPr>
             <w:tcW w:type="dxa" w:w="2160"/>
             <w:shd w:fill="F1F5F9"/>
+            <w:tcMar>
+              <w:top w:w="100" w:type="dxa"/>
+              <w:bottom w:w="100" w:type="dxa"/>
+              <w:left w:w="120" w:type="dxa"/>
+              <w:right w:w="120" w:type="dxa"/>
+            </w:tcMar>
           </w:tcPr>
           <w:p>
-            <w:pPr>
-              <w:spacing w:before="80" w:after="80"/>
-            </w:pPr>
             <w:r>
               <w:rPr>
-                <w:rFonts w:ascii="微软雅黑" w:hAnsi="微软雅黑" w:eastAsia="微软雅黑"/>
+                <w:rFonts w:ascii="微软雅黑" w:hAnsi="微软雅黑"/>
                 <w:b/>
-                <w:color w:val="0E7490"/>
+                <w:color w:val="1E293B"/>
                 <w:sz w:val="19"/>
               </w:rPr>
-              <w:t>🖥️ 画面焦点与实操动作</w:t>
+              <w:t>🖥️ 画面焦点与</w:t>
+              <w:br/>
+              <w:t>鼠标实操动作</w:t>
             </w:r>
           </w:p>
         </w:tc>
         <w:tc>
           <w:tcPr>
             <w:tcW w:type="dxa" w:w="7632"/>
-            <w:shd w:fill="FFFFFF"/>
+            <w:shd w:fill="FAFAFA"/>
+            <w:tcMar>
+              <w:top w:w="100" w:type="dxa"/>
+              <w:bottom w:w="100" w:type="dxa"/>
+              <w:left w:w="120" w:type="dxa"/>
+              <w:right w:w="120" w:type="dxa"/>
+            </w:tcMar>
           </w:tcPr>
           <w:p>
-            <w:pPr>
-              <w:spacing w:before="80" w:after="80"/>
-            </w:pPr>
             <w:r>
               <w:rPr>
-                <w:rFonts w:ascii="微软雅黑" w:hAnsi="微软雅黑" w:eastAsia="微软雅黑"/>
-                <w:b w:val="0"/>
-                <w:color w:val="0F172A"/>
+                <w:rFonts w:ascii="微软雅黑" w:hAnsi="微软雅黑"/>
+                <w:color w:val="334155"/>
                 <w:sz w:val="19"/>
               </w:rPr>
-              <w:t>1. 【展示待测留空机制】：鼠标点击左侧材料体系下拉框，切换到【硅碳复合体系】（界面保持待测留空）；点击下方‘⚡ 运行全流程智能评估’，系统弹出提示提示接入数据；</w:t>
-              <w:br/>
+              <w:t>1. 【演示待测留空机制】：鼠标点击左侧材料体系下拉框，切换到【硅碳复合体系】（界面保持待测留空状态）；点击下方‘⚡ 运行全流程智能评估’，系统弹出规范说明指引接入数据；</w:t>
+            </w:r>
+          </w:p>
+          <w:p>
+            <w:r>
+              <w:rPr>
+                <w:rFonts w:ascii="微软雅黑" w:hAnsi="微软雅黑"/>
+                <w:color w:val="334155"/>
+                <w:sz w:val="19"/>
+              </w:rPr>
               <w:t>2. 【载入真实实测样本】：点击左上方标定电芯库下拉框，选中【实测#3】车载退役电芯 (1800次循环)；</w:t>
-              <w:br/>
-              <w:t>3. 鼠标移动至右侧更新后的 SOH 能量表盘（79.05%），并划过下方的【送检电芯微观物理特征解析】8项特征数据卡片。</w:t>
+            </w:r>
+          </w:p>
+          <w:p>
+            <w:r>
+              <w:rPr>
+                <w:rFonts w:ascii="微软雅黑" w:hAnsi="微软雅黑"/>
+                <w:color w:val="334155"/>
+                <w:sz w:val="19"/>
+              </w:rPr>
+              <w:t>3. 鼠标移动至右侧更新后的 SOH 能量表盘（79.05%），并划过下方【送检电芯微观物理特征解析】的 8 项物理参数卡片。</w:t>
             </w:r>
           </w:p>
         </w:tc>
@@ -939,48 +1214,76 @@
         <w:tc>
           <w:tcPr>
             <w:tcW w:type="dxa" w:w="2160"/>
-            <w:shd w:fill="F1F5F9"/>
+            <w:shd w:fill="E0F2FE"/>
+            <w:tcMar>
+              <w:top w:w="120" w:type="dxa"/>
+              <w:bottom w:w="120" w:type="dxa"/>
+              <w:left w:w="120" w:type="dxa"/>
+              <w:right w:w="120" w:type="dxa"/>
+            </w:tcMar>
           </w:tcPr>
           <w:p>
-            <w:pPr>
-              <w:spacing w:before="80" w:after="80"/>
-            </w:pPr>
             <w:r>
               <w:rPr>
-                <w:rFonts w:ascii="微软雅黑" w:hAnsi="微软雅黑" w:eastAsia="微软雅黑"/>
+                <w:rFonts w:ascii="微软雅黑" w:hAnsi="微软雅黑"/>
                 <w:b/>
-                <w:color w:val="0E7490"/>
+                <w:color w:val="0369A1"/>
                 <w:sz w:val="19"/>
               </w:rPr>
-              <w:t>🎙️ 同步解说台词逐字稿</w:t>
+              <w:t>🎙️ 同步解说</w:t>
+              <w:br/>
+              <w:t>台词逐字稿</w:t>
             </w:r>
           </w:p>
         </w:tc>
         <w:tc>
           <w:tcPr>
             <w:tcW w:type="dxa" w:w="7632"/>
-            <w:shd w:fill="FAFAFA"/>
+            <w:shd w:fill="F0F9FF"/>
+            <w:tcMar>
+              <w:top w:w="120" w:type="dxa"/>
+              <w:bottom w:w="120" w:type="dxa"/>
+              <w:left w:w="120" w:type="dxa"/>
+              <w:right w:w="120" w:type="dxa"/>
+            </w:tcMar>
           </w:tcPr>
           <w:p>
-            <w:pPr>
-              <w:spacing w:before="80" w:after="80"/>
-            </w:pPr>
             <w:r>
               <w:rPr>
-                <w:rFonts w:ascii="微软雅黑" w:hAnsi="微软雅黑" w:eastAsia="微软雅黑"/>
-                <w:b/>
+                <w:rFonts w:ascii="微软雅黑" w:hAnsi="微软雅黑"/>
                 <w:color w:val="0F172A"/>
-                <w:sz w:val="19"/>
+                <w:sz w:val="20"/>
               </w:rPr>
               <w:t>“首先来看 Tab 1 的诊断工作台。</w:t>
-              <w:br/>
-              <w:br/>
-              <w:t>系统设计了数据完整性校验逻辑：当尚未导入测试仪数据或脉冲采样时，界面保持待测状态，避免产生无依据的计算结果。</w:t>
-              <w:br/>
-              <w:br/>
-              <w:t>当我们载入一组退役动力电芯的实测数据后，系统随即开展计算。在测试方法上，系统采用 50% SOC 下的短时充放电脉冲测试规程，测试时长约为 180 秒。在此期间，算法从瞬态响应中提取 8 项关键电化学物理特征，例如稳态开路电压、放电直流内阻、极化过电位以及充放电响应不对称度等。</w:t>
-              <w:br/>
-              <w:br/>
+            </w:r>
+          </w:p>
+          <w:p>
+            <w:r>
+              <w:rPr>
+                <w:rFonts w:ascii="微软雅黑" w:hAnsi="微软雅黑"/>
+                <w:color w:val="0F172A"/>
+                <w:sz w:val="20"/>
+              </w:rPr>
+              <w:t>系统设计了严格的数据完整性校验逻辑：当尚未导入测试仪数据或脉冲采样时，界面保持待测状态，避免产生无依据的计算结果。</w:t>
+            </w:r>
+          </w:p>
+          <w:p>
+            <w:r>
+              <w:rPr>
+                <w:rFonts w:ascii="微软雅黑" w:hAnsi="微软雅黑"/>
+                <w:color w:val="0F172A"/>
+                <w:sz w:val="20"/>
+              </w:rPr>
+              <w:t>当我们载入一组退役动力电芯的实测数据后，系统随即开展推演。在测试方法上，系统采用 50% SOC 下的短时充放电脉冲测试规程，测试时长约为 180 秒。在此期间，算法从瞬态响应中提取 8 项关键电化学物理特征，例如稳态开路电压、放电直流内阻、极化过电位以及充放电响应不对称度等。</w:t>
+            </w:r>
+          </w:p>
+          <w:p>
+            <w:r>
+              <w:rPr>
+                <w:rFonts w:ascii="微软雅黑" w:hAnsi="微软雅黑"/>
+                <w:color w:val="0F172A"/>
+                <w:sz w:val="20"/>
+              </w:rPr>
               <w:t>基于梯度提升决策树等机器学习模型，系统对电芯健康度 SOH 进行快速评估，验证误差 MAE 保持在 1% 以内，显著缩减了测试所需的时间周期。”</w:t>
             </w:r>
           </w:p>
@@ -990,38 +1293,43 @@
         <w:tc>
           <w:tcPr>
             <w:tcW w:type="dxa" w:w="2160"/>
-            <w:shd w:fill="F1F5F9"/>
+            <w:shd w:fill="FEF3C7"/>
+            <w:tcMar>
+              <w:top w:w="80" w:type="dxa"/>
+              <w:bottom w:w="80" w:type="dxa"/>
+              <w:left w:w="120" w:type="dxa"/>
+              <w:right w:w="120" w:type="dxa"/>
+            </w:tcMar>
           </w:tcPr>
           <w:p>
-            <w:pPr>
-              <w:spacing w:before="80" w:after="80"/>
-            </w:pPr>
             <w:r>
               <w:rPr>
-                <w:rFonts w:ascii="微软雅黑" w:hAnsi="微软雅黑" w:eastAsia="微软雅黑"/>
+                <w:rFonts w:ascii="微软雅黑" w:hAnsi="微软雅黑"/>
                 <w:b/>
-                <w:color w:val="0E7490"/>
-                <w:sz w:val="19"/>
+                <w:color w:val="B45309"/>
+                <w:sz w:val="18"/>
               </w:rPr>
-              <w:t>💡 录屏关键提示</w:t>
+              <w:t>💡 录屏关键指引</w:t>
             </w:r>
           </w:p>
         </w:tc>
         <w:tc>
           <w:tcPr>
             <w:tcW w:type="dxa" w:w="7632"/>
-            <w:shd w:fill="FFFFFF"/>
+            <w:shd w:fill="FFFBEB"/>
+            <w:tcMar>
+              <w:top w:w="80" w:type="dxa"/>
+              <w:bottom w:w="80" w:type="dxa"/>
+              <w:left w:w="120" w:type="dxa"/>
+              <w:right w:w="120" w:type="dxa"/>
+            </w:tcMar>
           </w:tcPr>
           <w:p>
-            <w:pPr>
-              <w:spacing w:before="80" w:after="80"/>
-            </w:pPr>
             <w:r>
               <w:rPr>
-                <w:rFonts w:ascii="微软雅黑" w:hAnsi="微软雅黑" w:eastAsia="微软雅黑"/>
-                <w:b w:val="0"/>
-                <w:color w:val="0F172A"/>
-                <w:sz w:val="19"/>
+                <w:rFonts w:ascii="微软雅黑" w:hAnsi="微软雅黑"/>
+                <w:color w:val="92400E"/>
+                <w:sz w:val="18"/>
               </w:rPr>
               <w:t>动作流畅展示‘未测待测留空 -&gt; 载入数据激活推演’，体现系统严谨的数据流转逻辑。</w:t>
             </w:r>
@@ -1029,24 +1337,27 @@
         </w:tc>
       </w:tr>
     </w:tbl>
+    <w:p/>
     <w:p>
-      <w:pPr>
-        <w:spacing w:after="120"/>
-      </w:pPr>
+      <w:r>
+        <w:rPr>
+          <w:rFonts w:ascii="微软雅黑" w:hAnsi="微软雅黑"/>
+          <w:b/>
+          <w:color w:val="0F172A"/>
+          <w:sz w:val="24"/>
+        </w:rPr>
+        <w:t>【第三幕：实时测试示波器与通道采样】（01:35 - 02:05，时长30秒）</w:t>
+      </w:r>
     </w:p>
     <w:p>
-      <w:pPr>
-        <w:pStyle w:val="Heading2"/>
-        <w:spacing w:before="280" w:after="80"/>
-      </w:pPr>
       <w:r>
         <w:rPr>
-          <w:rFonts w:ascii="微软雅黑" w:hAnsi="微软雅黑" w:eastAsia="微软雅黑"/>
+          <w:rFonts w:ascii="微软雅黑" w:hAnsi="微软雅黑"/>
           <w:b/>
           <w:color w:val="0E7490"/>
-          <w:sz w:val="25"/>
+          <w:sz w:val="20"/>
         </w:rPr>
-        <w:t>【第三幕：容量恢复预测与模组批量分选】（01:40 - 02:35，时长55秒）</w:t>
+        <w:t>📍 当前界面位置：点击切换至 Tab 2：实时测试示波器</w:t>
       </w:r>
     </w:p>
     <w:tbl>
@@ -1064,43 +1375,66 @@
           <w:tcPr>
             <w:tcW w:type="dxa" w:w="2160"/>
             <w:shd w:fill="F1F5F9"/>
+            <w:tcMar>
+              <w:top w:w="100" w:type="dxa"/>
+              <w:bottom w:w="100" w:type="dxa"/>
+              <w:left w:w="120" w:type="dxa"/>
+              <w:right w:w="120" w:type="dxa"/>
+            </w:tcMar>
           </w:tcPr>
           <w:p>
-            <w:pPr>
-              <w:spacing w:before="80" w:after="80"/>
-            </w:pPr>
             <w:r>
               <w:rPr>
-                <w:rFonts w:ascii="微软雅黑" w:hAnsi="微软雅黑" w:eastAsia="微软雅黑"/>
+                <w:rFonts w:ascii="微软雅黑" w:hAnsi="微软雅黑"/>
                 <w:b/>
-                <w:color w:val="0E7490"/>
+                <w:color w:val="1E293B"/>
                 <w:sz w:val="19"/>
               </w:rPr>
-              <w:t>🖥️ 画面焦点与实操动作</w:t>
+              <w:t>🖥️ 画面焦点与</w:t>
+              <w:br/>
+              <w:t>鼠标实操动作</w:t>
             </w:r>
           </w:p>
         </w:tc>
         <w:tc>
           <w:tcPr>
             <w:tcW w:type="dxa" w:w="7632"/>
-            <w:shd w:fill="FFFFFF"/>
+            <w:shd w:fill="FAFAFA"/>
+            <w:tcMar>
+              <w:top w:w="100" w:type="dxa"/>
+              <w:bottom w:w="100" w:type="dxa"/>
+              <w:left w:w="120" w:type="dxa"/>
+              <w:right w:w="120" w:type="dxa"/>
+            </w:tcMar>
           </w:tcPr>
           <w:p>
-            <w:pPr>
-              <w:spacing w:before="80" w:after="80"/>
-            </w:pPr>
             <w:r>
               <w:rPr>
-                <w:rFonts w:ascii="微软雅黑" w:hAnsi="微软雅黑" w:eastAsia="微软雅黑"/>
-                <w:b w:val="0"/>
-                <w:color w:val="0F172A"/>
+                <w:rFonts w:ascii="微软雅黑" w:hAnsi="微软雅黑"/>
+                <w:color w:val="334155"/>
                 <w:sz w:val="19"/>
               </w:rPr>
-              <w:t>1. 鼠标点击顶部导航栏，切换至 Tab 4（容量恢复与再生定级）；</w:t>
-              <w:br/>
-              <w:t>2. 鼠标划过上方【22 只典型循环电芯恢复预测值与 90% 保角区间】散点与误差置信带；</w:t>
-              <w:br/>
-              <w:t>3. 鼠标滚动至下方【100 只退役电芯批量矩阵看板】与【再利用等级分布环形图】，点击一下分类药丸按钮（如点击 B级(42)，表格联动筛选）。</w:t>
+              <w:t>1. 鼠标点击顶部导航栏 Tab 2（实时测试示波器）；</w:t>
+            </w:r>
+          </w:p>
+          <w:p>
+            <w:r>
+              <w:rPr>
+                <w:rFonts w:ascii="微软雅黑" w:hAnsi="微软雅黑"/>
+                <w:color w:val="334155"/>
+                <w:sz w:val="19"/>
+              </w:rPr>
+              <w:t>2. 鼠标指向右上角‘60 FPS’与双通道 HUD 读数（Trace-V 与 Trace-I）；</w:t>
+            </w:r>
+          </w:p>
+          <w:p>
+            <w:r>
+              <w:rPr>
+                <w:rFonts w:ascii="微软雅黑" w:hAnsi="微软雅黑"/>
+                <w:color w:val="334155"/>
+                <w:sz w:val="19"/>
+              </w:rPr>
+              <w:t>3. 鼠标滑过正在实时绘制的充放电瞬态波形与左侧四端子开尔文采样状态卡片。</w:t>
             </w:r>
           </w:p>
         </w:tc>
@@ -1109,46 +1443,67 @@
         <w:tc>
           <w:tcPr>
             <w:tcW w:type="dxa" w:w="2160"/>
-            <w:shd w:fill="F1F5F9"/>
+            <w:shd w:fill="E0F2FE"/>
+            <w:tcMar>
+              <w:top w:w="120" w:type="dxa"/>
+              <w:bottom w:w="120" w:type="dxa"/>
+              <w:left w:w="120" w:type="dxa"/>
+              <w:right w:w="120" w:type="dxa"/>
+            </w:tcMar>
           </w:tcPr>
           <w:p>
-            <w:pPr>
-              <w:spacing w:before="80" w:after="80"/>
-            </w:pPr>
             <w:r>
               <w:rPr>
-                <w:rFonts w:ascii="微软雅黑" w:hAnsi="微软雅黑" w:eastAsia="微软雅黑"/>
+                <w:rFonts w:ascii="微软雅黑" w:hAnsi="微软雅黑"/>
                 <w:b/>
-                <w:color w:val="0E7490"/>
+                <w:color w:val="0369A1"/>
                 <w:sz w:val="19"/>
               </w:rPr>
-              <w:t>🎙️ 同步解说台词逐字稿</w:t>
+              <w:t>🎙️ 同步解说</w:t>
+              <w:br/>
+              <w:t>台词逐字稿</w:t>
             </w:r>
           </w:p>
         </w:tc>
         <w:tc>
           <w:tcPr>
             <w:tcW w:type="dxa" w:w="7632"/>
-            <w:shd w:fill="FAFAFA"/>
+            <w:shd w:fill="F0F9FF"/>
+            <w:tcMar>
+              <w:top w:w="120" w:type="dxa"/>
+              <w:bottom w:w="120" w:type="dxa"/>
+              <w:left w:w="120" w:type="dxa"/>
+              <w:right w:w="120" w:type="dxa"/>
+            </w:tcMar>
           </w:tcPr>
           <w:p>
-            <w:pPr>
-              <w:spacing w:before="80" w:after="80"/>
-            </w:pPr>
             <w:r>
               <w:rPr>
-                <w:rFonts w:ascii="微软雅黑" w:hAnsi="微软雅黑" w:eastAsia="微软雅黑"/>
-                <w:b/>
+                <w:rFonts w:ascii="微软雅黑" w:hAnsi="微软雅黑"/>
                 <w:color w:val="0F172A"/>
-                <w:sz w:val="19"/>
+                <w:sz w:val="20"/>
               </w:rPr>
-              <w:t>“切换到 Tab 4 的容量恢复与再生评估模块。</w:t>
-              <w:br/>
-              <w:br/>
-              <w:t>在实际退役电池中，部分活性锂损失在特定电化学调理条件下具有一定的可逆性。系统通过弹性网络回归模型，对恒压调理后的容量恢复量 Q_rec 进行量化预估，并引入 90% 保角预测区间，为预测结果提供统计学上的置信上下界。例如当前这只电芯，模型预测其调理后预期 SOH 可提升至约 86.8%。</w:t>
-              <w:br/>
-              <w:br/>
-              <w:t>在下方，系统还集成了模组级 100 只电芯的批量快速分选功能，依据健康状态与恢复潜力将电芯划分为四类梯次利用等级，并支持数据导出为 CSV 格式，方便工程应用中的成组与筛选。”</w:t>
+              <w:t>“切换到 Tab 2 的实时测试示波器界面。</w:t>
+            </w:r>
+          </w:p>
+          <w:p>
+            <w:r>
+              <w:rPr>
+                <w:rFonts w:ascii="微软雅黑" w:hAnsi="微软雅黑"/>
+                <w:color w:val="0F172A"/>
+                <w:sz w:val="20"/>
+              </w:rPr>
+              <w:t>系统可直接配合电化学测试硬件与四端子开尔文采集夹具，实时采集测试过程中的动态响应。右侧示波器以 60 帧每秒的平滑度绘制电压与电流瞬态轨迹，有效表征了脱嵌锂阻抗与弛豫响应过程。</w:t>
+            </w:r>
+          </w:p>
+          <w:p>
+            <w:r>
+              <w:rPr>
+                <w:rFonts w:ascii="微软雅黑" w:hAnsi="微软雅黑"/>
+                <w:color w:val="0F172A"/>
+                <w:sz w:val="20"/>
+              </w:rPr>
+              <w:t>采集到的高频脉冲时序可一键同步至计算内核，形成‘台架硬件采集-瞬态特征提取-模型智能推理’的完整工程闭环。”</w:t>
             </w:r>
           </w:p>
         </w:tc>
@@ -1157,63 +1512,71 @@
         <w:tc>
           <w:tcPr>
             <w:tcW w:type="dxa" w:w="2160"/>
-            <w:shd w:fill="F1F5F9"/>
+            <w:shd w:fill="FEF3C7"/>
+            <w:tcMar>
+              <w:top w:w="80" w:type="dxa"/>
+              <w:bottom w:w="80" w:type="dxa"/>
+              <w:left w:w="120" w:type="dxa"/>
+              <w:right w:w="120" w:type="dxa"/>
+            </w:tcMar>
           </w:tcPr>
           <w:p>
-            <w:pPr>
-              <w:spacing w:before="80" w:after="80"/>
-            </w:pPr>
             <w:r>
               <w:rPr>
-                <w:rFonts w:ascii="微软雅黑" w:hAnsi="微软雅黑" w:eastAsia="微软雅黑"/>
+                <w:rFonts w:ascii="微软雅黑" w:hAnsi="微软雅黑"/>
                 <w:b/>
-                <w:color w:val="0E7490"/>
-                <w:sz w:val="19"/>
+                <w:color w:val="B45309"/>
+                <w:sz w:val="18"/>
               </w:rPr>
-              <w:t>💡 录屏关键提示</w:t>
+              <w:t>💡 录屏关键指引</w:t>
             </w:r>
           </w:p>
         </w:tc>
         <w:tc>
           <w:tcPr>
             <w:tcW w:type="dxa" w:w="7632"/>
-            <w:shd w:fill="FFFFFF"/>
+            <w:shd w:fill="FFFBEB"/>
+            <w:tcMar>
+              <w:top w:w="80" w:type="dxa"/>
+              <w:bottom w:w="80" w:type="dxa"/>
+              <w:left w:w="120" w:type="dxa"/>
+              <w:right w:w="120" w:type="dxa"/>
+            </w:tcMar>
           </w:tcPr>
           <w:p>
-            <w:pPr>
-              <w:spacing w:before="80" w:after="80"/>
-            </w:pPr>
             <w:r>
               <w:rPr>
-                <w:rFonts w:ascii="微软雅黑" w:hAnsi="微软雅黑" w:eastAsia="微软雅黑"/>
-                <w:b w:val="0"/>
-                <w:color w:val="0F172A"/>
-                <w:sz w:val="19"/>
+                <w:rFonts w:ascii="微软雅黑" w:hAnsi="微软雅黑"/>
+                <w:color w:val="92400E"/>
+                <w:sz w:val="18"/>
               </w:rPr>
-              <w:t>清晰阐释可逆容量预测原理，突出 90% 保角置信区间在工程上的可靠性。</w:t>
+              <w:t>展示动态示波器波形，突出硬件采集直连能力。</w:t>
             </w:r>
           </w:p>
         </w:tc>
       </w:tr>
     </w:tbl>
+    <w:p/>
     <w:p>
-      <w:pPr>
-        <w:spacing w:after="120"/>
-      </w:pPr>
+      <w:r>
+        <w:rPr>
+          <w:rFonts w:ascii="微软雅黑" w:hAnsi="微软雅黑"/>
+          <w:b/>
+          <w:color w:val="0F172A"/>
+          <w:sz w:val="24"/>
+        </w:rPr>
+        <w:t>【第四幕：特征工程与多模型交叉验证】（02:05 - 02:25，时长20秒）</w:t>
+      </w:r>
     </w:p>
     <w:p>
-      <w:pPr>
-        <w:pStyle w:val="Heading2"/>
-        <w:spacing w:before="280" w:after="80"/>
-      </w:pPr>
       <w:r>
         <w:rPr>
-          <w:rFonts w:ascii="微软雅黑" w:hAnsi="微软雅黑" w:eastAsia="微软雅黑"/>
+          <w:rFonts w:ascii="微软雅黑" w:hAnsi="微软雅黑"/>
           <w:b/>
           <w:color w:val="0E7490"/>
-          <w:sz w:val="25"/>
+          <w:sz w:val="20"/>
         </w:rPr>
-        <w:t>【第四幕：实时采样与制造端碳减排核算】（02:35 - 03:25，时长50秒）</w:t>
+        <w:t>📍 当前界面位置：点击切换至 Tab 3：SOH 健康诊断 (M1)</w:t>
       </w:r>
     </w:p>
     <w:tbl>
@@ -1231,41 +1594,66 @@
           <w:tcPr>
             <w:tcW w:type="dxa" w:w="2160"/>
             <w:shd w:fill="F1F5F9"/>
+            <w:tcMar>
+              <w:top w:w="100" w:type="dxa"/>
+              <w:bottom w:w="100" w:type="dxa"/>
+              <w:left w:w="120" w:type="dxa"/>
+              <w:right w:w="120" w:type="dxa"/>
+            </w:tcMar>
           </w:tcPr>
           <w:p>
-            <w:pPr>
-              <w:spacing w:before="80" w:after="80"/>
-            </w:pPr>
             <w:r>
               <w:rPr>
-                <w:rFonts w:ascii="微软雅黑" w:hAnsi="微软雅黑" w:eastAsia="微软雅黑"/>
+                <w:rFonts w:ascii="微软雅黑" w:hAnsi="微软雅黑"/>
                 <w:b/>
-                <w:color w:val="0E7490"/>
+                <w:color w:val="1E293B"/>
                 <w:sz w:val="19"/>
               </w:rPr>
-              <w:t>🖥️ 画面焦点与实操动作</w:t>
+              <w:t>🖥️ 画面焦点与</w:t>
+              <w:br/>
+              <w:t>鼠标实操动作</w:t>
             </w:r>
           </w:p>
         </w:tc>
         <w:tc>
           <w:tcPr>
             <w:tcW w:type="dxa" w:w="7632"/>
-            <w:shd w:fill="FFFFFF"/>
+            <w:shd w:fill="FAFAFA"/>
+            <w:tcMar>
+              <w:top w:w="100" w:type="dxa"/>
+              <w:bottom w:w="100" w:type="dxa"/>
+              <w:left w:w="120" w:type="dxa"/>
+              <w:right w:w="120" w:type="dxa"/>
+            </w:tcMar>
           </w:tcPr>
           <w:p>
-            <w:pPr>
-              <w:spacing w:before="80" w:after="80"/>
-            </w:pPr>
             <w:r>
               <w:rPr>
-                <w:rFonts w:ascii="微软雅黑" w:hAnsi="微软雅黑" w:eastAsia="微软雅黑"/>
-                <w:b w:val="0"/>
-                <w:color w:val="0F172A"/>
+                <w:rFonts w:ascii="微软雅黑" w:hAnsi="微软雅黑"/>
+                <w:color w:val="334155"/>
                 <w:sz w:val="19"/>
               </w:rPr>
-              <w:t>1. 快速点击切换至 Tab 2（实时测试直连与示波器），展示动态刷新的示波器双迹线波形与开尔文采样状态；</w:t>
-              <w:br/>
-              <w:t>2. 点击切换至 Tab 5（制造端碳减排），鼠标划过碳减排链路明细表（恢复电量、制造端因子、净减排量）与下方的【碳减排瀑布分解图】。</w:t>
+              <w:t>1. 鼠标顺畅点击切换至 Tab 3（SOH 健康诊断 M1）；</w:t>
+            </w:r>
+          </w:p>
+          <w:p>
+            <w:r>
+              <w:rPr>
+                <w:rFonts w:ascii="微软雅黑" w:hAnsi="微软雅黑"/>
+                <w:color w:val="334155"/>
+                <w:sz w:val="19"/>
+              </w:rPr>
+              <w:t>2. 鼠标划过左侧【物理特征重要性得分】柱状图，指向前两位主导特征；</w:t>
+            </w:r>
+          </w:p>
+          <w:p>
+            <w:r>
+              <w:rPr>
+                <w:rFonts w:ascii="微软雅黑" w:hAnsi="微软雅黑"/>
+                <w:color w:val="334155"/>
+                <w:sz w:val="19"/>
+              </w:rPr>
+              <w:t>3. 鼠标划过右侧【多模型 LOBO 误差横向对比】与下方对照矩阵，展示 XGBoost 与随机森林等多模型比对结果。</w:t>
             </w:r>
           </w:p>
         </w:tc>
@@ -1274,46 +1662,67 @@
         <w:tc>
           <w:tcPr>
             <w:tcW w:type="dxa" w:w="2160"/>
-            <w:shd w:fill="F1F5F9"/>
+            <w:shd w:fill="E0F2FE"/>
+            <w:tcMar>
+              <w:top w:w="120" w:type="dxa"/>
+              <w:bottom w:w="120" w:type="dxa"/>
+              <w:left w:w="120" w:type="dxa"/>
+              <w:right w:w="120" w:type="dxa"/>
+            </w:tcMar>
           </w:tcPr>
           <w:p>
-            <w:pPr>
-              <w:spacing w:before="80" w:after="80"/>
-            </w:pPr>
             <w:r>
               <w:rPr>
-                <w:rFonts w:ascii="微软雅黑" w:hAnsi="微软雅黑" w:eastAsia="微软雅黑"/>
+                <w:rFonts w:ascii="微软雅黑" w:hAnsi="微软雅黑"/>
                 <w:b/>
-                <w:color w:val="0E7490"/>
+                <w:color w:val="0369A1"/>
                 <w:sz w:val="19"/>
               </w:rPr>
-              <w:t>🎙️ 同步解说台词逐字稿</w:t>
+              <w:t>🎙️ 同步解说</w:t>
+              <w:br/>
+              <w:t>台词逐字稿</w:t>
             </w:r>
           </w:p>
         </w:tc>
         <w:tc>
           <w:tcPr>
             <w:tcW w:type="dxa" w:w="7632"/>
-            <w:shd w:fill="FAFAFA"/>
+            <w:shd w:fill="F0F9FF"/>
+            <w:tcMar>
+              <w:top w:w="120" w:type="dxa"/>
+              <w:bottom w:w="120" w:type="dxa"/>
+              <w:left w:w="120" w:type="dxa"/>
+              <w:right w:w="120" w:type="dxa"/>
+            </w:tcMar>
           </w:tcPr>
           <w:p>
-            <w:pPr>
-              <w:spacing w:before="80" w:after="80"/>
-            </w:pPr>
             <w:r>
               <w:rPr>
-                <w:rFonts w:ascii="微软雅黑" w:hAnsi="微软雅黑" w:eastAsia="微软雅黑"/>
-                <w:b/>
+                <w:rFonts w:ascii="微软雅黑" w:hAnsi="微软雅黑"/>
                 <w:color w:val="0F172A"/>
-                <w:sz w:val="19"/>
+                <w:sz w:val="20"/>
               </w:rPr>
-              <w:t>“在 Tab 2 中，系统提供了实时采样展示界面，可配合测试硬件与四端子采集设备，同步监测脉冲过程中的电压与内阻响应曲线。</w:t>
-              <w:br/>
-              <w:br/>
-              <w:t>进入 Tab 5 的碳减排核算模块。系统参照产品碳足迹与全生命周期核算方法，将电芯再生恢复的容量等效为替代新电池制造所规避的碳排放量。</w:t>
-              <w:br/>
-              <w:br/>
-              <w:t>界面通过碳排分解瀑布图，展示新电池生产碳排放因数、调理过程消耗的电网碳排放以及最终的净减排收益，同时给出了二氧化碳当量与环境效益指标，为梯次电池的低碳价值核算提供数据支撑。”</w:t>
+              <w:t>“紧接着来看 Tab 3 的算法机理剖析。</w:t>
+            </w:r>
+          </w:p>
+          <w:p>
+            <w:r>
+              <w:rPr>
+                <w:rFonts w:ascii="微软雅黑" w:hAnsi="微软雅黑"/>
+                <w:color w:val="0F172A"/>
+                <w:sz w:val="20"/>
+              </w:rPr>
+              <w:t>为了保障诊断模型的物理可解释性，左侧量化了各项微观特征的重要性得分，表明松弛电压与极化过电位是主导 SOH 衰退的关键参数，与电化学扩散极化规律高度吻合。</w:t>
+            </w:r>
+          </w:p>
+          <w:p>
+            <w:r>
+              <w:rPr>
+                <w:rFonts w:ascii="微软雅黑" w:hAnsi="微软雅黑"/>
+                <w:color w:val="0F172A"/>
+                <w:sz w:val="20"/>
+              </w:rPr>
+              <w:t>右侧及下方则通过严格的留一电池组交叉验证，横向呈现了统一 XGBoost 与随机森林、支持向量机等对比模型的误差表现，证实了所选模型在精度与泛化能力上的综合优势。”</w:t>
             </w:r>
           </w:p>
         </w:tc>
@@ -1322,63 +1731,71 @@
         <w:tc>
           <w:tcPr>
             <w:tcW w:type="dxa" w:w="2160"/>
-            <w:shd w:fill="F1F5F9"/>
+            <w:shd w:fill="FEF3C7"/>
+            <w:tcMar>
+              <w:top w:w="80" w:type="dxa"/>
+              <w:bottom w:w="80" w:type="dxa"/>
+              <w:left w:w="120" w:type="dxa"/>
+              <w:right w:w="120" w:type="dxa"/>
+            </w:tcMar>
           </w:tcPr>
           <w:p>
-            <w:pPr>
-              <w:spacing w:before="80" w:after="80"/>
-            </w:pPr>
             <w:r>
               <w:rPr>
-                <w:rFonts w:ascii="微软雅黑" w:hAnsi="微软雅黑" w:eastAsia="微软雅黑"/>
+                <w:rFonts w:ascii="微软雅黑" w:hAnsi="微软雅黑"/>
                 <w:b/>
-                <w:color w:val="0E7490"/>
-                <w:sz w:val="19"/>
+                <w:color w:val="B45309"/>
+                <w:sz w:val="18"/>
               </w:rPr>
-              <w:t>💡 录屏关键提示</w:t>
+              <w:t>💡 录屏关键指引</w:t>
             </w:r>
           </w:p>
         </w:tc>
         <w:tc>
           <w:tcPr>
             <w:tcW w:type="dxa" w:w="7632"/>
-            <w:shd w:fill="FFFFFF"/>
+            <w:shd w:fill="FFFBEB"/>
+            <w:tcMar>
+              <w:top w:w="80" w:type="dxa"/>
+              <w:bottom w:w="80" w:type="dxa"/>
+              <w:left w:w="120" w:type="dxa"/>
+              <w:right w:w="120" w:type="dxa"/>
+            </w:tcMar>
           </w:tcPr>
           <w:p>
-            <w:pPr>
-              <w:spacing w:before="80" w:after="80"/>
-            </w:pPr>
             <w:r>
               <w:rPr>
-                <w:rFonts w:ascii="微软雅黑" w:hAnsi="微软雅黑" w:eastAsia="微软雅黑"/>
-                <w:b w:val="0"/>
-                <w:color w:val="0F172A"/>
-                <w:sz w:val="19"/>
+                <w:rFonts w:ascii="微软雅黑" w:hAnsi="微软雅黑"/>
+                <w:color w:val="92400E"/>
+                <w:sz w:val="18"/>
               </w:rPr>
-              <w:t>在碳排瀑布图上稍作停顿，体现核算链路的清晰性与完整性。</w:t>
+              <w:t>用约 20 秒干脆利落带过，展示算法可解释性与多模型 PK 的学术严谨度。</w:t>
             </w:r>
           </w:p>
         </w:tc>
       </w:tr>
     </w:tbl>
+    <w:p/>
     <w:p>
-      <w:pPr>
-        <w:spacing w:after="120"/>
-      </w:pPr>
+      <w:r>
+        <w:rPr>
+          <w:rFonts w:ascii="微软雅黑" w:hAnsi="微软雅黑"/>
+          <w:b/>
+          <w:color w:val="0F172A"/>
+          <w:sz w:val="24"/>
+        </w:rPr>
+        <w:t>【第五幕：容量恢复预测与模组批量分选】（02:25 - 03:15，时长50秒）</w:t>
+      </w:r>
     </w:p>
     <w:p>
-      <w:pPr>
-        <w:pStyle w:val="Heading2"/>
-        <w:spacing w:before="280" w:after="80"/>
-      </w:pPr>
       <w:r>
         <w:rPr>
-          <w:rFonts w:ascii="微软雅黑" w:hAnsi="微软雅黑" w:eastAsia="微软雅黑"/>
+          <w:rFonts w:ascii="微软雅黑" w:hAnsi="微软雅黑"/>
           <w:b/>
           <w:color w:val="0E7490"/>
-          <w:sz w:val="25"/>
+          <w:sz w:val="20"/>
         </w:rPr>
-        <w:t>【第五幕：商业资产评估与报告管理】（03:25 - 04:20，时长55秒）</w:t>
+        <w:t>📍 当前界面位置：点击切换至 Tab 4：容量恢复与再生定级 (M2)</w:t>
       </w:r>
     </w:p>
     <w:tbl>
@@ -1396,43 +1813,66 @@
           <w:tcPr>
             <w:tcW w:type="dxa" w:w="2160"/>
             <w:shd w:fill="F1F5F9"/>
+            <w:tcMar>
+              <w:top w:w="100" w:type="dxa"/>
+              <w:bottom w:w="100" w:type="dxa"/>
+              <w:left w:w="120" w:type="dxa"/>
+              <w:right w:w="120" w:type="dxa"/>
+            </w:tcMar>
           </w:tcPr>
           <w:p>
-            <w:pPr>
-              <w:spacing w:before="80" w:after="80"/>
-            </w:pPr>
             <w:r>
               <w:rPr>
-                <w:rFonts w:ascii="微软雅黑" w:hAnsi="微软雅黑" w:eastAsia="微软雅黑"/>
+                <w:rFonts w:ascii="微软雅黑" w:hAnsi="微软雅黑"/>
                 <w:b/>
-                <w:color w:val="0E7490"/>
+                <w:color w:val="1E293B"/>
                 <w:sz w:val="19"/>
               </w:rPr>
-              <w:t>🖥️ 画面焦点与实操动作</w:t>
+              <w:t>🖥️ 画面焦点与</w:t>
+              <w:br/>
+              <w:t>鼠标实操动作</w:t>
             </w:r>
           </w:p>
         </w:tc>
         <w:tc>
           <w:tcPr>
             <w:tcW w:type="dxa" w:w="7632"/>
-            <w:shd w:fill="FFFFFF"/>
+            <w:shd w:fill="FAFAFA"/>
+            <w:tcMar>
+              <w:top w:w="100" w:type="dxa"/>
+              <w:bottom w:w="100" w:type="dxa"/>
+              <w:left w:w="120" w:type="dxa"/>
+              <w:right w:w="120" w:type="dxa"/>
+            </w:tcMar>
           </w:tcPr>
           <w:p>
-            <w:pPr>
-              <w:spacing w:before="80" w:after="80"/>
-            </w:pPr>
             <w:r>
               <w:rPr>
-                <w:rFonts w:ascii="微软雅黑" w:hAnsi="微软雅黑" w:eastAsia="微软雅黑"/>
-                <w:b w:val="0"/>
-                <w:color w:val="0F172A"/>
+                <w:rFonts w:ascii="微软雅黑" w:hAnsi="微软雅黑"/>
+                <w:color w:val="334155"/>
                 <w:sz w:val="19"/>
               </w:rPr>
-              <w:t>1. 点击切换到 Tab 6（电池档案与数字护照）；</w:t>
-              <w:br/>
-              <w:t>2. 点击按钮‘📋 详细登记送检电池商业档案与体检建档’，展示送检登记弹窗，点击顶部的案例载入，滚动浏览后关闭；</w:t>
-              <w:br/>
-              <w:t>3. 在下方病历列表点击‘📜 质检公证书’，弹出标准格式的电池健康资产评估报告，鼠标在评估参数与打印按钮上稍作停留。</w:t>
+              <w:t>1. 鼠标点击切换至 Tab 4（容量恢复与再生定级）；</w:t>
+            </w:r>
+          </w:p>
+          <w:p>
+            <w:r>
+              <w:rPr>
+                <w:rFonts w:ascii="微软雅黑" w:hAnsi="微软雅黑"/>
+                <w:color w:val="334155"/>
+                <w:sz w:val="19"/>
+              </w:rPr>
+              <w:t>2. 鼠标划过上方【22 只典型循环电芯恢复预测值与 90% 保角区间】散点与误差置信带；</w:t>
+            </w:r>
+          </w:p>
+          <w:p>
+            <w:r>
+              <w:rPr>
+                <w:rFonts w:ascii="微软雅黑" w:hAnsi="微软雅黑"/>
+                <w:color w:val="334155"/>
+                <w:sz w:val="19"/>
+              </w:rPr>
+              <w:t>3. 鼠标滚动至下方【100 只退役电芯批量矩阵看板】与【再利用等级分布环形图】，点击分类药丸按钮（如点击 B级(42)，表格联动筛选），并指向‘📥 导出 CSV’按钮。</w:t>
             </w:r>
           </w:p>
         </w:tc>
@@ -1441,46 +1881,67 @@
         <w:tc>
           <w:tcPr>
             <w:tcW w:type="dxa" w:w="2160"/>
-            <w:shd w:fill="F1F5F9"/>
+            <w:shd w:fill="E0F2FE"/>
+            <w:tcMar>
+              <w:top w:w="120" w:type="dxa"/>
+              <w:bottom w:w="120" w:type="dxa"/>
+              <w:left w:w="120" w:type="dxa"/>
+              <w:right w:w="120" w:type="dxa"/>
+            </w:tcMar>
           </w:tcPr>
           <w:p>
-            <w:pPr>
-              <w:spacing w:before="80" w:after="80"/>
-            </w:pPr>
             <w:r>
               <w:rPr>
-                <w:rFonts w:ascii="微软雅黑" w:hAnsi="微软雅黑" w:eastAsia="微软雅黑"/>
+                <w:rFonts w:ascii="微软雅黑" w:hAnsi="微软雅黑"/>
                 <w:b/>
-                <w:color w:val="0E7490"/>
+                <w:color w:val="0369A1"/>
                 <w:sz w:val="19"/>
               </w:rPr>
-              <w:t>🎙️ 同步解说台词逐字稿</w:t>
+              <w:t>🎙️ 同步解说</w:t>
+              <w:br/>
+              <w:t>台词逐字稿</w:t>
             </w:r>
           </w:p>
         </w:tc>
         <w:tc>
           <w:tcPr>
             <w:tcW w:type="dxa" w:w="7632"/>
-            <w:shd w:fill="FAFAFA"/>
+            <w:shd w:fill="F0F9FF"/>
+            <w:tcMar>
+              <w:top w:w="120" w:type="dxa"/>
+              <w:bottom w:w="120" w:type="dxa"/>
+              <w:left w:w="120" w:type="dxa"/>
+              <w:right w:w="120" w:type="dxa"/>
+            </w:tcMar>
           </w:tcPr>
           <w:p>
-            <w:pPr>
-              <w:spacing w:before="80" w:after="80"/>
-            </w:pPr>
             <w:r>
               <w:rPr>
-                <w:rFonts w:ascii="微软雅黑" w:hAnsi="微软雅黑" w:eastAsia="微软雅黑"/>
-                <w:b/>
+                <w:rFonts w:ascii="微软雅黑" w:hAnsi="微软雅黑"/>
                 <w:color w:val="0F172A"/>
-                <w:sz w:val="19"/>
+                <w:sz w:val="20"/>
               </w:rPr>
-              <w:t>“在 Tab 6 电池档案与数字护照模块中，系统提供了标准化的送检登记流程。</w:t>
-              <w:br/>
-              <w:br/>
-              <w:t>用户可记录送检单位、电芯出厂规格、役龄年限以及历史运行工况等信息。系统基于电芯实测健康度与恢复量，结合折旧模型计算残值评估参考价格。</w:t>
-              <w:br/>
-              <w:br/>
-              <w:t>在此基础上，系统支持生成标准格式的电池健康资产评估报告。报告包含受检电芯序列号、关键性能参数、残值测算依据及签章确认区域，支持打印与 PDF 导出，方便在二手交易、梯次利用交接以及资产档案归档中作为技术参考凭证。”</w:t>
+              <w:t>“切换到 Tab 4 的容量恢复与再生定级模块。</w:t>
+            </w:r>
+          </w:p>
+          <w:p>
+            <w:r>
+              <w:rPr>
+                <w:rFonts w:ascii="微软雅黑" w:hAnsi="微软雅黑"/>
+                <w:color w:val="0F172A"/>
+                <w:sz w:val="20"/>
+              </w:rPr>
+              <w:t>在实际退役电池中，部分活性锂损失在特定电化学调理条件下具有一定的可逆性。系统通过弹性网络回归模型，对恒压调理后的容量恢复量 Q_rec 进行量化预估，并引入 90% 保角预测区间，为预测结果提供统计学上的置信上下界。例如当前这只电芯，模型预测其调理后预期 SOH 可回升至约 85.2%。</w:t>
+            </w:r>
+          </w:p>
+          <w:p>
+            <w:r>
+              <w:rPr>
+                <w:rFonts w:ascii="微软雅黑" w:hAnsi="微软雅黑"/>
+                <w:color w:val="0F172A"/>
+                <w:sz w:val="20"/>
+              </w:rPr>
+              <w:t>在下方，系统还集成了模组级 100 只电芯的批量快速分选功能，依据健康状态与恢复潜力将电芯划分为四类梯次利用等级，并支持数据导出为 CSV 格式，方便工程应用中的成组与筛选。”</w:t>
             </w:r>
           </w:p>
         </w:tc>
@@ -1489,63 +1950,71 @@
         <w:tc>
           <w:tcPr>
             <w:tcW w:type="dxa" w:w="2160"/>
-            <w:shd w:fill="F1F5F9"/>
+            <w:shd w:fill="FEF3C7"/>
+            <w:tcMar>
+              <w:top w:w="80" w:type="dxa"/>
+              <w:bottom w:w="80" w:type="dxa"/>
+              <w:left w:w="120" w:type="dxa"/>
+              <w:right w:w="120" w:type="dxa"/>
+            </w:tcMar>
           </w:tcPr>
           <w:p>
-            <w:pPr>
-              <w:spacing w:before="80" w:after="80"/>
-            </w:pPr>
             <w:r>
               <w:rPr>
-                <w:rFonts w:ascii="微软雅黑" w:hAnsi="微软雅黑" w:eastAsia="微软雅黑"/>
+                <w:rFonts w:ascii="微软雅黑" w:hAnsi="微软雅黑"/>
                 <w:b/>
-                <w:color w:val="0E7490"/>
-                <w:sz w:val="19"/>
+                <w:color w:val="B45309"/>
+                <w:sz w:val="18"/>
               </w:rPr>
-              <w:t>💡 录屏关键提示</w:t>
+              <w:t>💡 录屏关键指引</w:t>
             </w:r>
           </w:p>
         </w:tc>
         <w:tc>
           <w:tcPr>
             <w:tcW w:type="dxa" w:w="7632"/>
-            <w:shd w:fill="FFFFFF"/>
+            <w:shd w:fill="FFFBEB"/>
+            <w:tcMar>
+              <w:top w:w="80" w:type="dxa"/>
+              <w:bottom w:w="80" w:type="dxa"/>
+              <w:left w:w="120" w:type="dxa"/>
+              <w:right w:w="120" w:type="dxa"/>
+            </w:tcMar>
           </w:tcPr>
           <w:p>
-            <w:pPr>
-              <w:spacing w:before="80" w:after="80"/>
-            </w:pPr>
             <w:r>
               <w:rPr>
-                <w:rFonts w:ascii="微软雅黑" w:hAnsi="微软雅黑" w:eastAsia="微软雅黑"/>
-                <w:b w:val="0"/>
-                <w:color w:val="0F172A"/>
-                <w:sz w:val="19"/>
+                <w:rFonts w:ascii="微软雅黑" w:hAnsi="微软雅黑"/>
+                <w:color w:val="92400E"/>
+                <w:sz w:val="18"/>
               </w:rPr>
-              <w:t>重点展示报告格式的标准性与档案记录的完整性，语气平稳务实。</w:t>
+              <w:t>清晰阐释可逆容量预测原理，突出 90% 保角置信区间在工程上的可靠性。</w:t>
             </w:r>
           </w:p>
         </w:tc>
       </w:tr>
     </w:tbl>
+    <w:p/>
     <w:p>
-      <w:pPr>
-        <w:spacing w:after="120"/>
-      </w:pPr>
+      <w:r>
+        <w:rPr>
+          <w:rFonts w:ascii="微软雅黑" w:hAnsi="微软雅黑"/>
+          <w:b/>
+          <w:color w:val="0F172A"/>
+          <w:sz w:val="24"/>
+        </w:rPr>
+        <w:t>【第六幕：制造端碳减排核算与低碳效益】（03:15 - 03:55，时长40秒）</w:t>
+      </w:r>
     </w:p>
     <w:p>
-      <w:pPr>
-        <w:pStyle w:val="Heading2"/>
-        <w:spacing w:before="280" w:after="80"/>
-      </w:pPr>
       <w:r>
         <w:rPr>
-          <w:rFonts w:ascii="微软雅黑" w:hAnsi="微软雅黑" w:eastAsia="微软雅黑"/>
+          <w:rFonts w:ascii="微软雅黑" w:hAnsi="微软雅黑"/>
           <w:b/>
           <w:color w:val="0E7490"/>
-          <w:sz w:val="25"/>
+          <w:sz w:val="20"/>
         </w:rPr>
-        <w:t>【第六幕：决策报告整合与总结】（04:20 - 04:45，时长25秒）</w:t>
+        <w:t>📍 当前界面位置：点击切换至 Tab 5：制造端碳减排 (M3)</w:t>
       </w:r>
     </w:p>
     <w:tbl>
@@ -1563,41 +2032,66 @@
           <w:tcPr>
             <w:tcW w:type="dxa" w:w="2160"/>
             <w:shd w:fill="F1F5F9"/>
+            <w:tcMar>
+              <w:top w:w="100" w:type="dxa"/>
+              <w:bottom w:w="100" w:type="dxa"/>
+              <w:left w:w="120" w:type="dxa"/>
+              <w:right w:w="120" w:type="dxa"/>
+            </w:tcMar>
           </w:tcPr>
           <w:p>
-            <w:pPr>
-              <w:spacing w:before="80" w:after="80"/>
-            </w:pPr>
             <w:r>
               <w:rPr>
-                <w:rFonts w:ascii="微软雅黑" w:hAnsi="微软雅黑" w:eastAsia="微软雅黑"/>
+                <w:rFonts w:ascii="微软雅黑" w:hAnsi="微软雅黑"/>
                 <w:b/>
-                <w:color w:val="0E7490"/>
+                <w:color w:val="1E293B"/>
                 <w:sz w:val="19"/>
               </w:rPr>
-              <w:t>🖥️ 画面焦点与实操动作</w:t>
+              <w:t>🖥️ 画面焦点与</w:t>
+              <w:br/>
+              <w:t>鼠标实操动作</w:t>
             </w:r>
           </w:p>
         </w:tc>
         <w:tc>
           <w:tcPr>
             <w:tcW w:type="dxa" w:w="7632"/>
-            <w:shd w:fill="FFFFFF"/>
+            <w:shd w:fill="FAFAFA"/>
+            <w:tcMar>
+              <w:top w:w="100" w:type="dxa"/>
+              <w:bottom w:w="100" w:type="dxa"/>
+              <w:left w:w="120" w:type="dxa"/>
+              <w:right w:w="120" w:type="dxa"/>
+            </w:tcMar>
           </w:tcPr>
           <w:p>
-            <w:pPr>
-              <w:spacing w:before="80" w:after="80"/>
-            </w:pPr>
             <w:r>
               <w:rPr>
-                <w:rFonts w:ascii="微软雅黑" w:hAnsi="微软雅黑" w:eastAsia="微软雅黑"/>
-                <w:b w:val="0"/>
-                <w:color w:val="0F172A"/>
+                <w:rFonts w:ascii="微软雅黑" w:hAnsi="微软雅黑"/>
+                <w:color w:val="334155"/>
                 <w:sz w:val="19"/>
               </w:rPr>
-              <w:t>1. 切换到 Tab 7（综合决策评估报告），平滑向下滑动展示技术汇总报告；</w:t>
-              <w:br/>
-              <w:t>2. 最后切换回 Tab 1 工作台，鼠标停留在主界面。</w:t>
+              <w:t>1. 鼠标点击切换至 Tab 5（制造端碳减排）；</w:t>
+            </w:r>
+          </w:p>
+          <w:p>
+            <w:r>
+              <w:rPr>
+                <w:rFonts w:ascii="微软雅黑" w:hAnsi="微软雅黑"/>
+                <w:color w:val="334155"/>
+                <w:sz w:val="19"/>
+              </w:rPr>
+              <w:t>2. 鼠标滑过上方核心指标卡片（恢复洁净电量、制造端排放因数、净减排总量）；</w:t>
+            </w:r>
+          </w:p>
+          <w:p>
+            <w:r>
+              <w:rPr>
+                <w:rFonts w:ascii="微软雅黑" w:hAnsi="微软雅黑"/>
+                <w:color w:val="334155"/>
+                <w:sz w:val="19"/>
+              </w:rPr>
+              <w:t>3. 鼠标在下方的【碳减排瀑布分解图】各阶段柱状条上稍作悬停，展示分解链路。</w:t>
             </w:r>
           </w:p>
         </w:tc>
@@ -1606,20 +2100,175 @@
         <w:tc>
           <w:tcPr>
             <w:tcW w:type="dxa" w:w="2160"/>
-            <w:shd w:fill="F1F5F9"/>
+            <w:shd w:fill="E0F2FE"/>
+            <w:tcMar>
+              <w:top w:w="120" w:type="dxa"/>
+              <w:bottom w:w="120" w:type="dxa"/>
+              <w:left w:w="120" w:type="dxa"/>
+              <w:right w:w="120" w:type="dxa"/>
+            </w:tcMar>
           </w:tcPr>
           <w:p>
-            <w:pPr>
-              <w:spacing w:before="80" w:after="80"/>
-            </w:pPr>
             <w:r>
               <w:rPr>
-                <w:rFonts w:ascii="微软雅黑" w:hAnsi="微软雅黑" w:eastAsia="微软雅黑"/>
+                <w:rFonts w:ascii="微软雅黑" w:hAnsi="微软雅黑"/>
                 <w:b/>
-                <w:color w:val="0E7490"/>
+                <w:color w:val="0369A1"/>
                 <w:sz w:val="19"/>
               </w:rPr>
-              <w:t>🎙️ 同步解说台词逐字稿</w:t>
+              <w:t>🎙️ 同步解说</w:t>
+              <w:br/>
+              <w:t>台词逐字稿</w:t>
+            </w:r>
+          </w:p>
+        </w:tc>
+        <w:tc>
+          <w:tcPr>
+            <w:tcW w:type="dxa" w:w="7632"/>
+            <w:shd w:fill="F0F9FF"/>
+            <w:tcMar>
+              <w:top w:w="120" w:type="dxa"/>
+              <w:bottom w:w="120" w:type="dxa"/>
+              <w:left w:w="120" w:type="dxa"/>
+              <w:right w:w="120" w:type="dxa"/>
+            </w:tcMar>
+          </w:tcPr>
+          <w:p>
+            <w:r>
+              <w:rPr>
+                <w:rFonts w:ascii="微软雅黑" w:hAnsi="微软雅黑"/>
+                <w:color w:val="0F172A"/>
+                <w:sz w:val="20"/>
+              </w:rPr>
+              <w:t>“进入 Tab 5 的制造端碳减排核算模块。</w:t>
+            </w:r>
+          </w:p>
+          <w:p>
+            <w:r>
+              <w:rPr>
+                <w:rFonts w:ascii="微软雅黑" w:hAnsi="微软雅黑"/>
+                <w:color w:val="0F172A"/>
+                <w:sz w:val="20"/>
+              </w:rPr>
+              <w:t>系统参照产品碳足迹与全生命周期评价规范，将电芯微调理恢复的可用电量，等效折算为替代新电池生产制造所规避的温室气体排放。</w:t>
+            </w:r>
+          </w:p>
+          <w:p>
+            <w:r>
+              <w:rPr>
+                <w:rFonts w:ascii="微软雅黑" w:hAnsi="微软雅黑"/>
+                <w:color w:val="0F172A"/>
+                <w:sz w:val="20"/>
+              </w:rPr>
+              <w:t>界面通过碳排分解瀑布图，清晰量化了新电池生产端排放因数、调理过程消耗的电网碳排放以及最终的净碳减排量，为退役电池梯次循环的绿色低碳价值核算提供了可量化的技术支撑。”</w:t>
+            </w:r>
+          </w:p>
+        </w:tc>
+      </w:tr>
+      <w:tr>
+        <w:tc>
+          <w:tcPr>
+            <w:tcW w:type="dxa" w:w="2160"/>
+            <w:shd w:fill="FEF3C7"/>
+            <w:tcMar>
+              <w:top w:w="80" w:type="dxa"/>
+              <w:bottom w:w="80" w:type="dxa"/>
+              <w:left w:w="120" w:type="dxa"/>
+              <w:right w:w="120" w:type="dxa"/>
+            </w:tcMar>
+          </w:tcPr>
+          <w:p>
+            <w:r>
+              <w:rPr>
+                <w:rFonts w:ascii="微软雅黑" w:hAnsi="微软雅黑"/>
+                <w:b/>
+                <w:color w:val="B45309"/>
+                <w:sz w:val="18"/>
+              </w:rPr>
+              <w:t>💡 录屏关键指引</w:t>
+            </w:r>
+          </w:p>
+        </w:tc>
+        <w:tc>
+          <w:tcPr>
+            <w:tcW w:type="dxa" w:w="7632"/>
+            <w:shd w:fill="FFFBEB"/>
+            <w:tcMar>
+              <w:top w:w="80" w:type="dxa"/>
+              <w:bottom w:w="80" w:type="dxa"/>
+              <w:left w:w="120" w:type="dxa"/>
+              <w:right w:w="120" w:type="dxa"/>
+            </w:tcMar>
+          </w:tcPr>
+          <w:p>
+            <w:r>
+              <w:rPr>
+                <w:rFonts w:ascii="微软雅黑" w:hAnsi="微软雅黑"/>
+                <w:color w:val="92400E"/>
+                <w:sz w:val="18"/>
+              </w:rPr>
+              <w:t>在碳排瀑布图上稍作停顿，体现核算链路的清晰性与完整性。</w:t>
+            </w:r>
+          </w:p>
+        </w:tc>
+      </w:tr>
+    </w:tbl>
+    <w:p/>
+    <w:p>
+      <w:r>
+        <w:rPr>
+          <w:rFonts w:ascii="微软雅黑" w:hAnsi="微软雅黑"/>
+          <w:b/>
+          <w:color w:val="0F172A"/>
+          <w:sz w:val="24"/>
+        </w:rPr>
+        <w:t>【第七幕：商业资产评估与质检公证书】（03:55 - 04:35，时长40秒）</w:t>
+      </w:r>
+    </w:p>
+    <w:p>
+      <w:r>
+        <w:rPr>
+          <w:rFonts w:ascii="微软雅黑" w:hAnsi="微软雅黑"/>
+          <w:b/>
+          <w:color w:val="0E7490"/>
+          <w:sz w:val="20"/>
+        </w:rPr>
+        <w:t>📍 当前界面位置：点击切换至 Tab 6：电池档案与数字护照</w:t>
+      </w:r>
+    </w:p>
+    <w:tbl>
+      <w:tblPr>
+        <w:tblW w:type="auto" w:w="0"/>
+        <w:jc w:val="center"/>
+        <w:tblLook w:firstColumn="1" w:firstRow="1" w:lastColumn="0" w:lastRow="0" w:noHBand="0" w:noVBand="1" w:val="04A0"/>
+      </w:tblPr>
+      <w:tblGrid>
+        <w:gridCol w:w="4968"/>
+        <w:gridCol w:w="4968"/>
+      </w:tblGrid>
+      <w:tr>
+        <w:tc>
+          <w:tcPr>
+            <w:tcW w:type="dxa" w:w="2160"/>
+            <w:shd w:fill="F1F5F9"/>
+            <w:tcMar>
+              <w:top w:w="100" w:type="dxa"/>
+              <w:bottom w:w="100" w:type="dxa"/>
+              <w:left w:w="120" w:type="dxa"/>
+              <w:right w:w="120" w:type="dxa"/>
+            </w:tcMar>
+          </w:tcPr>
+          <w:p>
+            <w:r>
+              <w:rPr>
+                <w:rFonts w:ascii="微软雅黑" w:hAnsi="微软雅黑"/>
+                <w:b/>
+                <w:color w:val="1E293B"/>
+                <w:sz w:val="19"/>
+              </w:rPr>
+              <w:t>🖥️ 画面焦点与</w:t>
+              <w:br/>
+              <w:t>鼠标实操动作</w:t>
             </w:r>
           </w:p>
         </w:tc>
@@ -1627,24 +2276,328 @@
           <w:tcPr>
             <w:tcW w:type="dxa" w:w="7632"/>
             <w:shd w:fill="FAFAFA"/>
+            <w:tcMar>
+              <w:top w:w="100" w:type="dxa"/>
+              <w:bottom w:w="100" w:type="dxa"/>
+              <w:left w:w="120" w:type="dxa"/>
+              <w:right w:w="120" w:type="dxa"/>
+            </w:tcMar>
           </w:tcPr>
           <w:p>
-            <w:pPr>
-              <w:spacing w:before="80" w:after="80"/>
-            </w:pPr>
             <w:r>
               <w:rPr>
-                <w:rFonts w:ascii="微软雅黑" w:hAnsi="微软雅黑" w:eastAsia="微软雅黑"/>
-                <w:b/>
-                <w:color w:val="0F172A"/>
+                <w:rFonts w:ascii="微软雅黑" w:hAnsi="微软雅黑"/>
+                <w:color w:val="334155"/>
                 <w:sz w:val="19"/>
               </w:rPr>
+              <w:t>1. 点击切换到 Tab 6（电池档案与数字护照）；</w:t>
+            </w:r>
+          </w:p>
+          <w:p>
+            <w:r>
+              <w:rPr>
+                <w:rFonts w:ascii="微软雅黑" w:hAnsi="微软雅黑"/>
+                <w:color w:val="334155"/>
+                <w:sz w:val="19"/>
+              </w:rPr>
+              <w:t>2. 点击按钮‘📋 详细登记送检电池商业档案与体检建档’，展示送检登记弹窗，浏览后关闭；</w:t>
+            </w:r>
+          </w:p>
+          <w:p>
+            <w:r>
+              <w:rPr>
+                <w:rFonts w:ascii="微软雅黑" w:hAnsi="微软雅黑"/>
+                <w:color w:val="334155"/>
+                <w:sz w:val="19"/>
+              </w:rPr>
+              <w:t>3. 在历史体检表格中点击‘📜 质检公证书’，弹出采用科技深色表格的资产评估公证书；</w:t>
+            </w:r>
+          </w:p>
+          <w:p>
+            <w:r>
+              <w:rPr>
+                <w:rFonts w:ascii="微软雅黑" w:hAnsi="微软雅黑"/>
+                <w:color w:val="334155"/>
+                <w:sz w:val="19"/>
+              </w:rPr>
+              <w:t>4. 鼠标高亮指向直流内阻（10.9 mΩ）、可恢复潜力（全新电芯标定为 0.00Ah，退役电芯真实呈现恢复量）及底部的打印导出按钮。</w:t>
+            </w:r>
+          </w:p>
+        </w:tc>
+      </w:tr>
+      <w:tr>
+        <w:tc>
+          <w:tcPr>
+            <w:tcW w:type="dxa" w:w="2160"/>
+            <w:shd w:fill="E0F2FE"/>
+            <w:tcMar>
+              <w:top w:w="120" w:type="dxa"/>
+              <w:bottom w:w="120" w:type="dxa"/>
+              <w:left w:w="120" w:type="dxa"/>
+              <w:right w:w="120" w:type="dxa"/>
+            </w:tcMar>
+          </w:tcPr>
+          <w:p>
+            <w:r>
+              <w:rPr>
+                <w:rFonts w:ascii="微软雅黑" w:hAnsi="微软雅黑"/>
+                <w:b/>
+                <w:color w:val="0369A1"/>
+                <w:sz w:val="19"/>
+              </w:rPr>
+              <w:t>🎙️ 同步解说</w:t>
+              <w:br/>
+              <w:t>台词逐字稿</w:t>
+            </w:r>
+          </w:p>
+        </w:tc>
+        <w:tc>
+          <w:tcPr>
+            <w:tcW w:type="dxa" w:w="7632"/>
+            <w:shd w:fill="F0F9FF"/>
+            <w:tcMar>
+              <w:top w:w="120" w:type="dxa"/>
+              <w:bottom w:w="120" w:type="dxa"/>
+              <w:left w:w="120" w:type="dxa"/>
+              <w:right w:w="120" w:type="dxa"/>
+            </w:tcMar>
+          </w:tcPr>
+          <w:p>
+            <w:r>
+              <w:rPr>
+                <w:rFonts w:ascii="微软雅黑" w:hAnsi="微软雅黑"/>
+                <w:color w:val="0F172A"/>
+                <w:sz w:val="20"/>
+              </w:rPr>
+              <w:t>“在 Tab 6 电池档案与数字护照模块中，系统提供了标准化的送检建档流程。</w:t>
+            </w:r>
+          </w:p>
+          <w:p>
+            <w:r>
+              <w:rPr>
+                <w:rFonts w:ascii="微软雅黑" w:hAnsi="微软雅黑"/>
+                <w:color w:val="0F172A"/>
+                <w:sz w:val="20"/>
+              </w:rPr>
+              <w:t>用户可登记送检单位、出厂规格、役龄年限以及历史运行工况等信息。系统基于实测健康度与恢复量，结合折旧模型计算残值评估参考价格。</w:t>
+            </w:r>
+          </w:p>
+          <w:p>
+            <w:r>
+              <w:rPr>
+                <w:rFonts w:ascii="微软雅黑" w:hAnsi="微软雅黑"/>
+                <w:color w:val="0F172A"/>
+                <w:sz w:val="20"/>
+              </w:rPr>
+              <w:t>在此基础上，系统支持生成标准格式的电池健康资产评估公证书。报告清晰呈现直流内阻、微调理恢复潜力以及梯次利用处置建议。例如对于全新电芯如实标定恢复量为零，而对于衰退电芯则定量给出可恢复容量与回升预期，支持一键打印与导出，作为资产流转的技术凭证。”</w:t>
+            </w:r>
+          </w:p>
+        </w:tc>
+      </w:tr>
+      <w:tr>
+        <w:tc>
+          <w:tcPr>
+            <w:tcW w:type="dxa" w:w="2160"/>
+            <w:shd w:fill="FEF3C7"/>
+            <w:tcMar>
+              <w:top w:w="80" w:type="dxa"/>
+              <w:bottom w:w="80" w:type="dxa"/>
+              <w:left w:w="120" w:type="dxa"/>
+              <w:right w:w="120" w:type="dxa"/>
+            </w:tcMar>
+          </w:tcPr>
+          <w:p>
+            <w:r>
+              <w:rPr>
+                <w:rFonts w:ascii="微软雅黑" w:hAnsi="微软雅黑"/>
+                <w:b/>
+                <w:color w:val="B45309"/>
+                <w:sz w:val="18"/>
+              </w:rPr>
+              <w:t>💡 录屏关键指引</w:t>
+            </w:r>
+          </w:p>
+        </w:tc>
+        <w:tc>
+          <w:tcPr>
+            <w:tcW w:type="dxa" w:w="7632"/>
+            <w:shd w:fill="FFFBEB"/>
+            <w:tcMar>
+              <w:top w:w="80" w:type="dxa"/>
+              <w:bottom w:w="80" w:type="dxa"/>
+              <w:left w:w="120" w:type="dxa"/>
+              <w:right w:w="120" w:type="dxa"/>
+            </w:tcMar>
+          </w:tcPr>
+          <w:p>
+            <w:r>
+              <w:rPr>
+                <w:rFonts w:ascii="微软雅黑" w:hAnsi="微软雅黑"/>
+                <w:color w:val="92400E"/>
+                <w:sz w:val="18"/>
+              </w:rPr>
+              <w:t>重点展示公证书格式的规范性与实测参数的严密性，展现商业闭环。</w:t>
+            </w:r>
+          </w:p>
+        </w:tc>
+      </w:tr>
+    </w:tbl>
+    <w:p/>
+    <w:p>
+      <w:r>
+        <w:rPr>
+          <w:rFonts w:ascii="微软雅黑" w:hAnsi="微软雅黑"/>
+          <w:b/>
+          <w:color w:val="0F172A"/>
+          <w:sz w:val="24"/>
+        </w:rPr>
+        <w:t>【第八幕：综合决策报告整合与总结】（04:35 - 04:55，时长20秒）</w:t>
+      </w:r>
+    </w:p>
+    <w:p>
+      <w:r>
+        <w:rPr>
+          <w:rFonts w:ascii="微软雅黑" w:hAnsi="微软雅黑"/>
+          <w:b/>
+          <w:color w:val="0E7490"/>
+          <w:sz w:val="20"/>
+        </w:rPr>
+        <w:t>📍 当前界面位置：点击切换至 Tab 7：决策评估报告，最后切回 Tab 1</w:t>
+      </w:r>
+    </w:p>
+    <w:tbl>
+      <w:tblPr>
+        <w:tblW w:type="auto" w:w="0"/>
+        <w:jc w:val="center"/>
+        <w:tblLook w:firstColumn="1" w:firstRow="1" w:lastColumn="0" w:lastRow="0" w:noHBand="0" w:noVBand="1" w:val="04A0"/>
+      </w:tblPr>
+      <w:tblGrid>
+        <w:gridCol w:w="4968"/>
+        <w:gridCol w:w="4968"/>
+      </w:tblGrid>
+      <w:tr>
+        <w:tc>
+          <w:tcPr>
+            <w:tcW w:type="dxa" w:w="2160"/>
+            <w:shd w:fill="F1F5F9"/>
+            <w:tcMar>
+              <w:top w:w="100" w:type="dxa"/>
+              <w:bottom w:w="100" w:type="dxa"/>
+              <w:left w:w="120" w:type="dxa"/>
+              <w:right w:w="120" w:type="dxa"/>
+            </w:tcMar>
+          </w:tcPr>
+          <w:p>
+            <w:r>
+              <w:rPr>
+                <w:rFonts w:ascii="微软雅黑" w:hAnsi="微软雅黑"/>
+                <w:b/>
+                <w:color w:val="1E293B"/>
+                <w:sz w:val="19"/>
+              </w:rPr>
+              <w:t>🖥️ 画面焦点与</w:t>
+              <w:br/>
+              <w:t>鼠标实操动作</w:t>
+            </w:r>
+          </w:p>
+        </w:tc>
+        <w:tc>
+          <w:tcPr>
+            <w:tcW w:type="dxa" w:w="7632"/>
+            <w:shd w:fill="FAFAFA"/>
+            <w:tcMar>
+              <w:top w:w="100" w:type="dxa"/>
+              <w:bottom w:w="100" w:type="dxa"/>
+              <w:left w:w="120" w:type="dxa"/>
+              <w:right w:w="120" w:type="dxa"/>
+            </w:tcMar>
+          </w:tcPr>
+          <w:p>
+            <w:r>
+              <w:rPr>
+                <w:rFonts w:ascii="微软雅黑" w:hAnsi="微软雅黑"/>
+                <w:color w:val="334155"/>
+                <w:sz w:val="19"/>
+              </w:rPr>
+              <w:t>1. 切换到 Tab 7（综合决策评估报告），平滑向下滑动展示技术汇总报告；</w:t>
+            </w:r>
+          </w:p>
+          <w:p>
+            <w:r>
+              <w:rPr>
+                <w:rFonts w:ascii="微软雅黑" w:hAnsi="微软雅黑"/>
+                <w:color w:val="334155"/>
+                <w:sz w:val="19"/>
+              </w:rPr>
+              <w:t>2. 顺畅切换回 Tab 1 首页工作台，鼠标平稳悬停在主界面。</w:t>
+            </w:r>
+          </w:p>
+        </w:tc>
+      </w:tr>
+      <w:tr>
+        <w:tc>
+          <w:tcPr>
+            <w:tcW w:type="dxa" w:w="2160"/>
+            <w:shd w:fill="E0F2FE"/>
+            <w:tcMar>
+              <w:top w:w="120" w:type="dxa"/>
+              <w:bottom w:w="120" w:type="dxa"/>
+              <w:left w:w="120" w:type="dxa"/>
+              <w:right w:w="120" w:type="dxa"/>
+            </w:tcMar>
+          </w:tcPr>
+          <w:p>
+            <w:r>
+              <w:rPr>
+                <w:rFonts w:ascii="微软雅黑" w:hAnsi="微软雅黑"/>
+                <w:b/>
+                <w:color w:val="0369A1"/>
+                <w:sz w:val="19"/>
+              </w:rPr>
+              <w:t>🎙️ 同步解说</w:t>
+              <w:br/>
+              <w:t>台词逐字稿</w:t>
+            </w:r>
+          </w:p>
+        </w:tc>
+        <w:tc>
+          <w:tcPr>
+            <w:tcW w:type="dxa" w:w="7632"/>
+            <w:shd w:fill="F0F9FF"/>
+            <w:tcMar>
+              <w:top w:w="120" w:type="dxa"/>
+              <w:bottom w:w="120" w:type="dxa"/>
+              <w:left w:w="120" w:type="dxa"/>
+              <w:right w:w="120" w:type="dxa"/>
+            </w:tcMar>
+          </w:tcPr>
+          <w:p>
+            <w:r>
+              <w:rPr>
+                <w:rFonts w:ascii="微软雅黑" w:hAnsi="微软雅黑"/>
+                <w:color w:val="0F172A"/>
+                <w:sz w:val="20"/>
+              </w:rPr>
               <w:t>“最后在 Tab 7 中，系统自动汇总前述所有模块的分析结论，生成结构化的综合决策评估报告，集中呈现 SOH 诊断、容量恢复预期、梯次利用建议与碳减排指标。</w:t>
-              <w:br/>
-              <w:br/>
-              <w:t>总体而言，本系统通过短时脉冲特征提取与机器学习算法，实现了退役电池的快速健康评估与容量恢复潜力分析，并结合梯次分选与碳核算，为退役电池的高效循环利用提供了一套较为完整的技术参考方案。</w:t>
-              <w:br/>
-              <w:br/>
+            </w:r>
+          </w:p>
+          <w:p>
+            <w:r>
+              <w:rPr>
+                <w:rFonts w:ascii="微软雅黑" w:hAnsi="微软雅黑"/>
+                <w:color w:val="0F172A"/>
+                <w:sz w:val="20"/>
+              </w:rPr>
+              <w:t>总体而言，本系统通过短时脉冲特征提取与机器学习算法，实现了退役电池的快速健康评估与容量恢复潜力分析，并结合梯次分选与碳核算，为退役电池的高效循环利用提供了一套较为完整的技术方案。</w:t>
+            </w:r>
+          </w:p>
+          <w:p>
+            <w:r>
+              <w:rPr>
+                <w:rFonts w:ascii="微软雅黑" w:hAnsi="微软雅黑"/>
+                <w:color w:val="0F172A"/>
+                <w:sz w:val="20"/>
+              </w:rPr>
               <w:t>以上就是本系统的主要功能介绍，谢谢大家。”</w:t>
             </w:r>
           </w:p>
@@ -1654,38 +2607,43 @@
         <w:tc>
           <w:tcPr>
             <w:tcW w:type="dxa" w:w="2160"/>
-            <w:shd w:fill="F1F5F9"/>
+            <w:shd w:fill="FEF3C7"/>
+            <w:tcMar>
+              <w:top w:w="80" w:type="dxa"/>
+              <w:bottom w:w="80" w:type="dxa"/>
+              <w:left w:w="120" w:type="dxa"/>
+              <w:right w:w="120" w:type="dxa"/>
+            </w:tcMar>
           </w:tcPr>
           <w:p>
-            <w:pPr>
-              <w:spacing w:before="80" w:after="80"/>
-            </w:pPr>
             <w:r>
               <w:rPr>
-                <w:rFonts w:ascii="微软雅黑" w:hAnsi="微软雅黑" w:eastAsia="微软雅黑"/>
+                <w:rFonts w:ascii="微软雅黑" w:hAnsi="微软雅黑"/>
                 <w:b/>
-                <w:color w:val="0E7490"/>
-                <w:sz w:val="19"/>
+                <w:color w:val="B45309"/>
+                <w:sz w:val="18"/>
               </w:rPr>
-              <w:t>💡 录屏关键提示</w:t>
+              <w:t>💡 录屏关键指引</w:t>
             </w:r>
           </w:p>
         </w:tc>
         <w:tc>
           <w:tcPr>
             <w:tcW w:type="dxa" w:w="7632"/>
-            <w:shd w:fill="FFFFFF"/>
+            <w:shd w:fill="FFFBEB"/>
+            <w:tcMar>
+              <w:top w:w="80" w:type="dxa"/>
+              <w:bottom w:w="80" w:type="dxa"/>
+              <w:left w:w="120" w:type="dxa"/>
+              <w:right w:w="120" w:type="dxa"/>
+            </w:tcMar>
           </w:tcPr>
           <w:p>
-            <w:pPr>
-              <w:spacing w:before="80" w:after="80"/>
-            </w:pPr>
             <w:r>
               <w:rPr>
-                <w:rFonts w:ascii="微软雅黑" w:hAnsi="微软雅黑" w:eastAsia="微软雅黑"/>
-                <w:b w:val="0"/>
-                <w:color w:val="0F172A"/>
-                <w:sz w:val="19"/>
+                <w:rFonts w:ascii="微软雅黑" w:hAnsi="微软雅黑"/>
+                <w:color w:val="92400E"/>
+                <w:sz w:val="18"/>
               </w:rPr>
               <w:t>平稳收尾，总结全篇核心工程逻辑，整片控制在 4 分 40 秒左右。</w:t>
             </w:r>
@@ -1693,54 +2651,136 @@
         </w:tc>
       </w:tr>
     </w:tbl>
+    <w:p/>
     <w:p>
-      <w:pPr>
-        <w:spacing w:after="120"/>
-      </w:pPr>
-    </w:p>
-    <w:p>
-      <w:pPr>
-        <w:pStyle w:val="Heading1"/>
-        <w:spacing w:before="280" w:after="80"/>
-      </w:pPr>
       <w:r>
         <w:rPr>
-          <w:rFonts w:ascii="微软雅黑" w:hAnsi="微软雅黑" w:eastAsia="微软雅黑"/>
+          <w:rFonts w:ascii="微软雅黑" w:hAnsi="微软雅黑"/>
           <w:b/>
-          <w:color w:val="0284C7"/>
-          <w:sz w:val="30"/>
+          <w:color w:val="0E7490"/>
+          <w:sz w:val="28"/>
         </w:rPr>
-        <w:t>三、 录屏实战建议与准备清单</w:t>
+        <w:t>三、 录屏实操准备清单与避坑指引</w:t>
       </w:r>
     </w:p>
     <w:p>
-      <w:pPr>
-        <w:spacing w:line="312" w:lineRule="auto"/>
-      </w:pPr>
       <w:r>
         <w:rPr>
-          <w:rFonts w:ascii="微软雅黑" w:hAnsi="微软雅黑" w:eastAsia="微软雅黑"/>
-          <w:b w:val="0"/>
-          <w:color w:val="334155"/>
-          <w:sz w:val="20"/>
+          <w:b/>
+          <w:color w:val="0E7490"/>
         </w:rPr>
-        <w:t>1. 录制环境建议：</w:t>
-        <w:br/>
-        <w:t xml:space="preserve">   • 使用 Chrome 或 Edge 浏览器，按 F11 进入全屏模式，隐藏书签栏；</w:t>
-        <w:br/>
-        <w:t xml:space="preserve">   • 录制分辨率建议 1920x1080，帧率设为 60 FPS，保证图表动效流畅。</w:t>
-        <w:br/>
-        <w:br/>
-        <w:t>2. 语速与节奏把控：</w:t>
-        <w:br/>
-        <w:t xml:space="preserve">   • 演说语速建议保持在每分钟 220 ~ 240 字，发音平稳自然；</w:t>
-        <w:br/>
-        <w:t xml:space="preserve">   • 在切换标签页时稍作停顿半秒，待图表完全渲染后再开展下一步讲解。</w:t>
-        <w:br/>
-        <w:br/>
-        <w:t>3. 鼠标指示操作：</w:t>
-        <w:br/>
-        <w:t xml:space="preserve">   • 鼠标移动保持平稳，在提及关键数值（如 79.05%、86.8%）时作短暂停留，引导观众视觉焦点。</w:t>
+        <w:t xml:space="preserve">• </w:t>
+      </w:r>
+      <w:r>
+        <w:rPr>
+          <w:rFonts w:ascii="微软雅黑" w:hAnsi="微软雅黑"/>
+          <w:b/>
+          <w:color w:val="1E293B"/>
+        </w:rPr>
+        <w:t>【浏览器分辨率与缩放】：</w:t>
+      </w:r>
+      <w:r>
+        <w:rPr>
+          <w:rFonts w:ascii="微软雅黑" w:hAnsi="微软雅黑"/>
+          <w:color w:val="475569"/>
+        </w:rPr>
+        <w:t>建议设置为 1920x1080 分辨率，浏览器缩放调整为 100% 或 90%，按 F11 键进入全屏沉浸式录制。</w:t>
+      </w:r>
+    </w:p>
+    <w:p>
+      <w:r>
+        <w:rPr>
+          <w:b/>
+          <w:color w:val="0E7490"/>
+        </w:rPr>
+        <w:t xml:space="preserve">• </w:t>
+      </w:r>
+      <w:r>
+        <w:rPr>
+          <w:rFonts w:ascii="微软雅黑" w:hAnsi="微软雅黑"/>
+          <w:b/>
+          <w:color w:val="1E293B"/>
+        </w:rPr>
+        <w:t>【材料体系切换演示要点】：</w:t>
+      </w:r>
+      <w:r>
+        <w:rPr>
+          <w:rFonts w:ascii="微软雅黑" w:hAnsi="微软雅黑"/>
+          <w:color w:val="475569"/>
+        </w:rPr>
+        <w:t>第二幕切换到硅碳体系展示‘待测留空’后，切回磷酸铁锂时直接点击左上方【实测样本库】选中【实测#3】，系统将自动激活计算，整个过程顺畅自然。</w:t>
+      </w:r>
+    </w:p>
+    <w:p>
+      <w:r>
+        <w:rPr>
+          <w:b/>
+          <w:color w:val="0E7490"/>
+        </w:rPr>
+        <w:t xml:space="preserve">• </w:t>
+      </w:r>
+      <w:r>
+        <w:rPr>
+          <w:rFonts w:ascii="微软雅黑" w:hAnsi="微软雅黑"/>
+          <w:b/>
+          <w:color w:val="1E293B"/>
+        </w:rPr>
+        <w:t>【Tab 3 界面停留时长】：</w:t>
+      </w:r>
+      <w:r>
+        <w:rPr>
+          <w:rFonts w:ascii="微软雅黑" w:hAnsi="微软雅黑"/>
+          <w:color w:val="475569"/>
+        </w:rPr>
+        <w:t>Tab 3 介绍控制在 20 秒以内，鼠标顺次划过物理特征重要性柱状图与多模型 LOBO 对比矩阵即可，切勿冗长。</w:t>
+      </w:r>
+    </w:p>
+    <w:p>
+      <w:r>
+        <w:rPr>
+          <w:b/>
+          <w:color w:val="0E7490"/>
+        </w:rPr>
+        <w:t xml:space="preserve">• </w:t>
+      </w:r>
+      <w:r>
+        <w:rPr>
+          <w:rFonts w:ascii="微软雅黑" w:hAnsi="微软雅黑"/>
+          <w:b/>
+          <w:color w:val="1E293B"/>
+        </w:rPr>
+        <w:t>【公证书弹窗质检参数】：</w:t>
+      </w:r>
+      <w:r>
+        <w:rPr>
+          <w:rFonts w:ascii="微软雅黑" w:hAnsi="微软雅黑"/>
+          <w:color w:val="475569"/>
+        </w:rPr>
+        <w:t>在 Tab 6 打开质检公证书时，重点指向‘直流内阻 (10.9 mΩ)’与‘微调理恢复潜力’（全新电芯标示为 0.00Ah，退役电芯标示为 +2.71Ah），展现真实数据科学性。</w:t>
+      </w:r>
+    </w:p>
+    <w:p>
+      <w:r>
+        <w:rPr>
+          <w:b/>
+          <w:color w:val="0E7490"/>
+        </w:rPr>
+        <w:t xml:space="preserve">• </w:t>
+      </w:r>
+      <w:r>
+        <w:rPr>
+          <w:rFonts w:ascii="微软雅黑" w:hAnsi="微软雅黑"/>
+          <w:b/>
+          <w:color w:val="1E293B"/>
+        </w:rPr>
+        <w:t>【音质与环境噪音】：</w:t>
+      </w:r>
+      <w:r>
+        <w:rPr>
+          <w:rFonts w:ascii="微软雅黑" w:hAnsi="微软雅黑"/>
+          <w:color w:val="475569"/>
+        </w:rPr>
+        <w:t>录屏解说建议佩戴指向性麦克风，开启降噪；语调保持沉稳、专业、务实，避免使用浮夸煽情词汇。</w:t>
       </w:r>
     </w:p>
     <w:sectPr>

</xml_diff>

<commit_message>
docs: update 5-minute video script and add full 7-tab page guide to docx and txt
</commit_message>
<xml_diff>
--- a/焕芯电愈智策_5分钟网页录屏演示脚本与解说台词表.docx
+++ b/焕芯电愈智策_5分钟网页录屏演示脚本与解说台词表.docx
@@ -15,7 +15,7 @@
         </w:rPr>
         <w:t>《焕芯·电愈智策》系统</w:t>
         <w:br/>
-        <w:t>5分钟网页录屏演示脚本与解说台词表</w:t>
+        <w:t>七大功能页面全景解析与 5分钟录屏解说台词表</w:t>
       </w:r>
     </w:p>
     <w:p>
@@ -28,7 +28,7 @@
           <w:color w:val="475569"/>
           <w:sz w:val="22"/>
         </w:rPr>
-        <w:t>多体系电池智能快速诊断与低碳循环决策系统 | 专业演示实操手册（客观测验严谨版）</w:t>
+        <w:t>多体系电池智能快速诊断与低碳循环决策系统 | 界面功能详解与实操录制规范手册</w:t>
       </w:r>
     </w:p>
     <w:p/>
@@ -48,10 +48,10 @@
             <w:tcW w:type="dxa" w:w="2592"/>
             <w:shd w:fill="F1F5F9"/>
             <w:tcMar>
-              <w:top w:w="120" w:type="dxa"/>
-              <w:bottom w:w="120" w:type="dxa"/>
-              <w:left w:w="150" w:type="dxa"/>
-              <w:right w:w="150" w:type="dxa"/>
+              <w:top w:w="100" w:type="dxa"/>
+              <w:bottom w:w="100" w:type="dxa"/>
+              <w:left w:w="140" w:type="dxa"/>
+              <w:right w:w="140" w:type="dxa"/>
             </w:tcMar>
           </w:tcPr>
           <w:p>
@@ -60,7 +60,7 @@
                 <w:rFonts w:ascii="微软雅黑" w:hAnsi="微软雅黑"/>
                 <w:b/>
                 <w:color w:val="1E293B"/>
-                <w:sz w:val="20"/>
+                <w:sz w:val="19"/>
               </w:rPr>
               <w:t>演示总时长</w:t>
             </w:r>
@@ -71,10 +71,10 @@
             <w:tcW w:type="dxa" w:w="7200"/>
             <w:shd w:fill="FFFFFF"/>
             <w:tcMar>
-              <w:top w:w="120" w:type="dxa"/>
-              <w:bottom w:w="120" w:type="dxa"/>
-              <w:left w:w="150" w:type="dxa"/>
-              <w:right w:w="150" w:type="dxa"/>
+              <w:top w:w="100" w:type="dxa"/>
+              <w:bottom w:w="100" w:type="dxa"/>
+              <w:left w:w="140" w:type="dxa"/>
+              <w:right w:w="140" w:type="dxa"/>
             </w:tcMar>
           </w:tcPr>
           <w:p>
@@ -82,7 +82,7 @@
               <w:rPr>
                 <w:rFonts w:ascii="微软雅黑" w:hAnsi="微软雅黑"/>
                 <w:color w:val="334155"/>
-                <w:sz w:val="20"/>
+                <w:sz w:val="19"/>
               </w:rPr>
               <w:t>严格把控在 4 分 30 秒 ~ 4 分 45 秒（5 分钟以内）</w:t>
             </w:r>
@@ -95,10 +95,10 @@
             <w:tcW w:type="dxa" w:w="2592"/>
             <w:shd w:fill="F1F5F9"/>
             <w:tcMar>
-              <w:top w:w="120" w:type="dxa"/>
-              <w:bottom w:w="120" w:type="dxa"/>
-              <w:left w:w="150" w:type="dxa"/>
-              <w:right w:w="150" w:type="dxa"/>
+              <w:top w:w="100" w:type="dxa"/>
+              <w:bottom w:w="100" w:type="dxa"/>
+              <w:left w:w="140" w:type="dxa"/>
+              <w:right w:w="140" w:type="dxa"/>
             </w:tcMar>
           </w:tcPr>
           <w:p>
@@ -107,7 +107,7 @@
                 <w:rFonts w:ascii="微软雅黑" w:hAnsi="微软雅黑"/>
                 <w:b/>
                 <w:color w:val="1E293B"/>
-                <w:sz w:val="20"/>
+                <w:sz w:val="19"/>
               </w:rPr>
               <w:t>演说语速建议</w:t>
             </w:r>
@@ -118,10 +118,10 @@
             <w:tcW w:type="dxa" w:w="7200"/>
             <w:shd w:fill="FFFFFF"/>
             <w:tcMar>
-              <w:top w:w="120" w:type="dxa"/>
-              <w:bottom w:w="120" w:type="dxa"/>
-              <w:left w:w="150" w:type="dxa"/>
-              <w:right w:w="150" w:type="dxa"/>
+              <w:top w:w="100" w:type="dxa"/>
+              <w:bottom w:w="100" w:type="dxa"/>
+              <w:left w:w="140" w:type="dxa"/>
+              <w:right w:w="140" w:type="dxa"/>
             </w:tcMar>
           </w:tcPr>
           <w:p>
@@ -129,9 +129,9 @@
               <w:rPr>
                 <w:rFonts w:ascii="微软雅黑" w:hAnsi="微软雅黑"/>
                 <w:color w:val="334155"/>
-                <w:sz w:val="20"/>
+                <w:sz w:val="19"/>
               </w:rPr>
-              <w:t>220 ~ 240 字/分钟，全篇逐字稿约 1,120 字，节奏沉稳流畅</w:t>
+              <w:t>220 ~ 240 字/分钟，全篇逐字稿约 1,150 字，节奏沉稳流畅、富有工程质感</w:t>
             </w:r>
           </w:p>
         </w:tc>
@@ -142,10 +142,10 @@
             <w:tcW w:type="dxa" w:w="2592"/>
             <w:shd w:fill="F1F5F9"/>
             <w:tcMar>
-              <w:top w:w="120" w:type="dxa"/>
-              <w:bottom w:w="120" w:type="dxa"/>
-              <w:left w:w="150" w:type="dxa"/>
-              <w:right w:w="150" w:type="dxa"/>
+              <w:top w:w="100" w:type="dxa"/>
+              <w:bottom w:w="100" w:type="dxa"/>
+              <w:left w:w="140" w:type="dxa"/>
+              <w:right w:w="140" w:type="dxa"/>
             </w:tcMar>
           </w:tcPr>
           <w:p>
@@ -154,9 +154,9 @@
                 <w:rFonts w:ascii="微软雅黑" w:hAnsi="微软雅黑"/>
                 <w:b/>
                 <w:color w:val="1E293B"/>
-                <w:sz w:val="20"/>
+                <w:sz w:val="19"/>
               </w:rPr>
-              <w:t>演示推进路径</w:t>
+              <w:t>页面导航路径</w:t>
             </w:r>
           </w:p>
         </w:tc>
@@ -165,10 +165,10 @@
             <w:tcW w:type="dxa" w:w="7200"/>
             <w:shd w:fill="FFFFFF"/>
             <w:tcMar>
-              <w:top w:w="120" w:type="dxa"/>
-              <w:bottom w:w="120" w:type="dxa"/>
-              <w:left w:w="150" w:type="dxa"/>
-              <w:right w:w="150" w:type="dxa"/>
+              <w:top w:w="100" w:type="dxa"/>
+              <w:bottom w:w="100" w:type="dxa"/>
+              <w:left w:w="140" w:type="dxa"/>
+              <w:right w:w="140" w:type="dxa"/>
             </w:tcMar>
           </w:tcPr>
           <w:p>
@@ -176,9 +176,9 @@
               <w:rPr>
                 <w:rFonts w:ascii="微软雅黑" w:hAnsi="微软雅黑"/>
                 <w:color w:val="334155"/>
-                <w:sz w:val="20"/>
+                <w:sz w:val="19"/>
               </w:rPr>
-              <w:t>Tab 1 -&gt; Tab 2 -&gt; Tab 3 -&gt; Tab 4 -&gt; Tab 5 -&gt; Tab 6 -&gt; Tab 7（全流程顺时针闭环）</w:t>
+              <w:t>Tab 1 -&gt; Tab 2 -&gt; Tab 3 -&gt; Tab 4 -&gt; Tab 5 -&gt; Tab 6 -&gt; Tab 7（全流程闭环推进）</w:t>
             </w:r>
           </w:p>
         </w:tc>
@@ -189,10 +189,10 @@
             <w:tcW w:type="dxa" w:w="2592"/>
             <w:shd w:fill="F1F5F9"/>
             <w:tcMar>
-              <w:top w:w="120" w:type="dxa"/>
-              <w:bottom w:w="120" w:type="dxa"/>
-              <w:left w:w="150" w:type="dxa"/>
-              <w:right w:w="150" w:type="dxa"/>
+              <w:top w:w="100" w:type="dxa"/>
+              <w:bottom w:w="100" w:type="dxa"/>
+              <w:left w:w="140" w:type="dxa"/>
+              <w:right w:w="140" w:type="dxa"/>
             </w:tcMar>
           </w:tcPr>
           <w:p>
@@ -201,7 +201,54 @@
                 <w:rFonts w:ascii="微软雅黑" w:hAnsi="微软雅黑"/>
                 <w:b/>
                 <w:color w:val="1E293B"/>
-                <w:sz w:val="20"/>
+                <w:sz w:val="19"/>
+              </w:rPr>
+              <w:t>材料体系覆盖</w:t>
+            </w:r>
+          </w:p>
+        </w:tc>
+        <w:tc>
+          <w:tcPr>
+            <w:tcW w:type="dxa" w:w="7200"/>
+            <w:shd w:fill="FFFFFF"/>
+            <w:tcMar>
+              <w:top w:w="100" w:type="dxa"/>
+              <w:bottom w:w="100" w:type="dxa"/>
+              <w:left w:w="140" w:type="dxa"/>
+              <w:right w:w="140" w:type="dxa"/>
+            </w:tcMar>
+          </w:tcPr>
+          <w:p>
+            <w:r>
+              <w:rPr>
+                <w:rFonts w:ascii="微软雅黑" w:hAnsi="微软雅黑"/>
+                <w:color w:val="334155"/>
+                <w:sz w:val="19"/>
+              </w:rPr>
+              <w:t>仅涵盖真实台架实测的 3 大体系：磷酸铁锂 (LFP)、三元高镍 (NCM)、硅碳复合 (NCM-SiC)</w:t>
+            </w:r>
+          </w:p>
+        </w:tc>
+      </w:tr>
+      <w:tr>
+        <w:tc>
+          <w:tcPr>
+            <w:tcW w:type="dxa" w:w="2592"/>
+            <w:shd w:fill="F1F5F9"/>
+            <w:tcMar>
+              <w:top w:w="100" w:type="dxa"/>
+              <w:bottom w:w="100" w:type="dxa"/>
+              <w:left w:w="140" w:type="dxa"/>
+              <w:right w:w="140" w:type="dxa"/>
+            </w:tcMar>
+          </w:tcPr>
+          <w:p>
+            <w:r>
+              <w:rPr>
+                <w:rFonts w:ascii="微软雅黑" w:hAnsi="微软雅黑"/>
+                <w:b/>
+                <w:color w:val="1E293B"/>
+                <w:sz w:val="19"/>
               </w:rPr>
               <w:t>演说风格规范</w:t>
             </w:r>
@@ -212,10 +259,10 @@
             <w:tcW w:type="dxa" w:w="7200"/>
             <w:shd w:fill="FFFFFF"/>
             <w:tcMar>
-              <w:top w:w="120" w:type="dxa"/>
-              <w:bottom w:w="120" w:type="dxa"/>
-              <w:left w:w="150" w:type="dxa"/>
-              <w:right w:w="150" w:type="dxa"/>
+              <w:top w:w="100" w:type="dxa"/>
+              <w:bottom w:w="100" w:type="dxa"/>
+              <w:left w:w="140" w:type="dxa"/>
+              <w:right w:w="140" w:type="dxa"/>
             </w:tcMar>
           </w:tcPr>
           <w:p>
@@ -223,9 +270,9 @@
               <w:rPr>
                 <w:rFonts w:ascii="微软雅黑" w:hAnsi="微软雅黑"/>
                 <w:color w:val="334155"/>
-                <w:sz w:val="20"/>
+                <w:sz w:val="19"/>
               </w:rPr>
-              <w:t>客观、严谨、沉稳；紧扣电化学机理与工程实际，杜绝浮夸营销措辞</w:t>
+              <w:t>客观、严谨、沉稳；紧扣电化学机理与工程实际，杜绝虚浮与过度营销用词</w:t>
             </w:r>
           </w:p>
         </w:tc>
@@ -240,7 +287,1590 @@
           <w:color w:val="0E7490"/>
           <w:sz w:val="28"/>
         </w:rPr>
-        <w:t>一、 整体时间轴与导航 Tab 分配一览表</w:t>
+        <w:t>一、 系统七大功能页面 (Tabs) 全景架构与模块功能详解</w:t>
+      </w:r>
+    </w:p>
+    <w:p>
+      <w:r>
+        <w:rPr>
+          <w:rFonts w:ascii="微软雅黑" w:hAnsi="微软雅黑"/>
+          <w:b/>
+          <w:color w:val="0F172A"/>
+          <w:sz w:val="23"/>
+        </w:rPr>
+        <w:t>【Tab 1：极速诊断决策工作台 (Dashboard)】</w:t>
+      </w:r>
+    </w:p>
+    <w:tbl>
+      <w:tblPr>
+        <w:tblW w:type="auto" w:w="0"/>
+        <w:jc w:val="center"/>
+        <w:tblLook w:firstColumn="1" w:firstRow="1" w:lastColumn="0" w:lastRow="0" w:noHBand="0" w:noVBand="1" w:val="04A0"/>
+      </w:tblPr>
+      <w:tblGrid>
+        <w:gridCol w:w="4968"/>
+        <w:gridCol w:w="4968"/>
+      </w:tblGrid>
+      <w:tr>
+        <w:tc>
+          <w:tcPr>
+            <w:tcW w:type="dxa" w:w="2160"/>
+            <w:shd w:fill="F1F5F9"/>
+            <w:tcMar>
+              <w:top w:w="80" w:type="dxa"/>
+              <w:bottom w:w="80" w:type="dxa"/>
+              <w:left w:w="100" w:type="dxa"/>
+              <w:right w:w="100" w:type="dxa"/>
+            </w:tcMar>
+          </w:tcPr>
+          <w:p>
+            <w:r>
+              <w:rPr>
+                <w:rFonts w:ascii="微软雅黑" w:hAnsi="微软雅黑"/>
+                <w:b/>
+                <w:color w:val="1E293B"/>
+                <w:sz w:val="18"/>
+              </w:rPr>
+              <w:t>📍 页面定位与目标</w:t>
+            </w:r>
+          </w:p>
+        </w:tc>
+        <w:tc>
+          <w:tcPr>
+            <w:tcW w:type="dxa" w:w="7632"/>
+            <w:shd w:fill="FFFFFF"/>
+            <w:tcMar>
+              <w:top w:w="80" w:type="dxa"/>
+              <w:bottom w:w="80" w:type="dxa"/>
+              <w:left w:w="100" w:type="dxa"/>
+              <w:right w:w="100" w:type="dxa"/>
+            </w:tcMar>
+          </w:tcPr>
+          <w:p>
+            <w:r>
+              <w:rPr>
+                <w:rFonts w:ascii="微软雅黑" w:hAnsi="微软雅黑"/>
+                <w:color w:val="334155"/>
+                <w:sz w:val="18"/>
+              </w:rPr>
+              <w:t>系统的总览与主操作台，负责全局参数配置、真实数据源载入、极速评估总览与定级决策。</w:t>
+            </w:r>
+          </w:p>
+        </w:tc>
+      </w:tr>
+      <w:tr>
+        <w:tc>
+          <w:tcPr>
+            <w:tcW w:type="dxa" w:w="2160"/>
+            <w:shd w:fill="F8FAFC"/>
+            <w:tcMar>
+              <w:top w:w="80" w:type="dxa"/>
+              <w:bottom w:w="80" w:type="dxa"/>
+              <w:left w:w="100" w:type="dxa"/>
+              <w:right w:w="100" w:type="dxa"/>
+            </w:tcMar>
+          </w:tcPr>
+          <w:p>
+            <w:r>
+              <w:rPr>
+                <w:rFonts w:ascii="微软雅黑" w:hAnsi="微软雅黑"/>
+                <w:b/>
+                <w:color w:val="1E293B"/>
+                <w:sz w:val="18"/>
+              </w:rPr>
+              <w:t>🧱 核心板块与组件</w:t>
+            </w:r>
+          </w:p>
+        </w:tc>
+        <w:tc>
+          <w:tcPr>
+            <w:tcW w:type="dxa" w:w="7632"/>
+            <w:shd w:fill="FAFAFA"/>
+            <w:tcMar>
+              <w:top w:w="80" w:type="dxa"/>
+              <w:bottom w:w="80" w:type="dxa"/>
+              <w:left w:w="100" w:type="dxa"/>
+              <w:right w:w="100" w:type="dxa"/>
+            </w:tcMar>
+          </w:tcPr>
+          <w:p>
+            <w:r>
+              <w:rPr>
+                <w:rFonts w:ascii="微软雅黑" w:hAnsi="微软雅黑"/>
+                <w:b/>
+                <w:color w:val="0E7490"/>
+                <w:sz w:val="17"/>
+              </w:rPr>
+              <w:t>• 左侧参数控制台：</w:t>
+            </w:r>
+            <w:r>
+              <w:rPr>
+                <w:rFonts w:ascii="微软雅黑" w:hAnsi="微软雅黑"/>
+                <w:color w:val="475569"/>
+                <w:sz w:val="17"/>
+              </w:rPr>
+              <w:t>材料体系选择（LFP/NCM/SiC）、国家台架实测样本库一键载入、测试仪脉冲 CSV 导入、标称容量/电压设置，以及折叠的 8 项微观电化学物理特征手动配置抽屉。</w:t>
+            </w:r>
+          </w:p>
+          <w:p>
+            <w:r>
+              <w:rPr>
+                <w:rFonts w:ascii="微软雅黑" w:hAnsi="微软雅黑"/>
+                <w:b/>
+                <w:color w:val="0E7490"/>
+                <w:sz w:val="17"/>
+              </w:rPr>
+              <w:t>• 核心决策看板大卡片：</w:t>
+            </w:r>
+            <w:r>
+              <w:rPr>
+                <w:rFonts w:ascii="微软雅黑" w:hAnsi="微软雅黑"/>
+                <w:color w:val="475569"/>
+                <w:sz w:val="17"/>
+              </w:rPr>
+              <w:t>多色环形 SOH 健康度能量仪表盘（平滑渐变无文字遮挡）、健康等级徽标、模型选择标签、预估恢复容量 (Ah)、90% 保角置信区间与恢复潜力 RPI。</w:t>
+            </w:r>
+          </w:p>
+          <w:p>
+            <w:r>
+              <w:rPr>
+                <w:rFonts w:ascii="微软雅黑" w:hAnsi="微软雅黑"/>
+                <w:b/>
+                <w:color w:val="0E7490"/>
+                <w:sz w:val="17"/>
+              </w:rPr>
+              <w:t>• 二次服役梯次定级卡片：</w:t>
+            </w:r>
+            <w:r>
+              <w:rPr>
+                <w:rFonts w:ascii="微软雅黑" w:hAnsi="微软雅黑"/>
+                <w:color w:val="475569"/>
+                <w:sz w:val="17"/>
+              </w:rPr>
+              <w:t>清晰给出 A/B/C/D 四级再利用评级、匹配应用场景（如储能/备电/轻载/提锂回收）、微调理建议与预期残值；右侧配套五维度机理雷达图。</w:t>
+            </w:r>
+          </w:p>
+          <w:p>
+            <w:r>
+              <w:rPr>
+                <w:rFonts w:ascii="微软雅黑" w:hAnsi="微软雅黑"/>
+                <w:b/>
+                <w:color w:val="0E7490"/>
+                <w:sz w:val="17"/>
+              </w:rPr>
+              <w:t>• 8项微观物理机理解析矩阵：</w:t>
+            </w:r>
+            <w:r>
+              <w:rPr>
+                <w:rFonts w:ascii="微软雅黑" w:hAnsi="微软雅黑"/>
+                <w:color w:val="475569"/>
+                <w:sz w:val="17"/>
+              </w:rPr>
+              <w:t>网格化卡片详细解析开路电压 U₀、放电内阻 R_dc,dis、充电内阻 R_dc,chg、倍率内阻差 ΔR_dc、极化过电位 η、不对称度 A_sym、松弛电压 ΔU_relax、库仑效率 CE 的实测数值与对应电化学演化机制。</w:t>
+            </w:r>
+          </w:p>
+        </w:tc>
+      </w:tr>
+      <w:tr>
+        <w:tc>
+          <w:tcPr>
+            <w:tcW w:type="dxa" w:w="2160"/>
+            <w:shd w:fill="FEF3C7"/>
+            <w:tcMar>
+              <w:top w:w="80" w:type="dxa"/>
+              <w:bottom w:w="80" w:type="dxa"/>
+              <w:left w:w="100" w:type="dxa"/>
+              <w:right w:w="100" w:type="dxa"/>
+            </w:tcMar>
+          </w:tcPr>
+          <w:p>
+            <w:r>
+              <w:rPr>
+                <w:rFonts w:ascii="微软雅黑" w:hAnsi="微软雅黑"/>
+                <w:b/>
+                <w:color w:val="B45309"/>
+                <w:sz w:val="18"/>
+              </w:rPr>
+              <w:t>🎥 录屏解说核心点</w:t>
+            </w:r>
+          </w:p>
+        </w:tc>
+        <w:tc>
+          <w:tcPr>
+            <w:tcW w:type="dxa" w:w="7632"/>
+            <w:shd w:fill="FFFBEB"/>
+            <w:tcMar>
+              <w:top w:w="80" w:type="dxa"/>
+              <w:bottom w:w="80" w:type="dxa"/>
+              <w:left w:w="100" w:type="dxa"/>
+              <w:right w:w="100" w:type="dxa"/>
+            </w:tcMar>
+          </w:tcPr>
+          <w:p>
+            <w:r>
+              <w:rPr>
+                <w:rFonts w:ascii="微软雅黑" w:hAnsi="微软雅黑"/>
+                <w:color w:val="92400E"/>
+                <w:sz w:val="18"/>
+              </w:rPr>
+              <w:t>演示未接入数据时的待测留空机制（体现严谨性）；载入实测退役电芯样本，演示 180 秒短时脉冲提取微观特征并秒级驱动全站推演的过程。</w:t>
+            </w:r>
+          </w:p>
+        </w:tc>
+      </w:tr>
+    </w:tbl>
+    <w:p/>
+    <w:p>
+      <w:r>
+        <w:rPr>
+          <w:rFonts w:ascii="微软雅黑" w:hAnsi="微软雅黑"/>
+          <w:b/>
+          <w:color w:val="0F172A"/>
+          <w:sz w:val="23"/>
+        </w:rPr>
+        <w:t>【Tab 2：实时测试示波器 (Realtime Oscilloscope)】</w:t>
+      </w:r>
+    </w:p>
+    <w:tbl>
+      <w:tblPr>
+        <w:tblW w:type="auto" w:w="0"/>
+        <w:jc w:val="center"/>
+        <w:tblLook w:firstColumn="1" w:firstRow="1" w:lastColumn="0" w:lastRow="0" w:noHBand="0" w:noVBand="1" w:val="04A0"/>
+      </w:tblPr>
+      <w:tblGrid>
+        <w:gridCol w:w="4968"/>
+        <w:gridCol w:w="4968"/>
+      </w:tblGrid>
+      <w:tr>
+        <w:tc>
+          <w:tcPr>
+            <w:tcW w:type="dxa" w:w="2160"/>
+            <w:shd w:fill="F1F5F9"/>
+            <w:tcMar>
+              <w:top w:w="80" w:type="dxa"/>
+              <w:bottom w:w="80" w:type="dxa"/>
+              <w:left w:w="100" w:type="dxa"/>
+              <w:right w:w="100" w:type="dxa"/>
+            </w:tcMar>
+          </w:tcPr>
+          <w:p>
+            <w:r>
+              <w:rPr>
+                <w:rFonts w:ascii="微软雅黑" w:hAnsi="微软雅黑"/>
+                <w:b/>
+                <w:color w:val="1E293B"/>
+                <w:sz w:val="18"/>
+              </w:rPr>
+              <w:t>📍 页面定位与目标</w:t>
+            </w:r>
+          </w:p>
+        </w:tc>
+        <w:tc>
+          <w:tcPr>
+            <w:tcW w:type="dxa" w:w="7632"/>
+            <w:shd w:fill="FFFFFF"/>
+            <w:tcMar>
+              <w:top w:w="80" w:type="dxa"/>
+              <w:bottom w:w="80" w:type="dxa"/>
+              <w:left w:w="100" w:type="dxa"/>
+              <w:right w:w="100" w:type="dxa"/>
+            </w:tcMar>
+          </w:tcPr>
+          <w:p>
+            <w:r>
+              <w:rPr>
+                <w:rFonts w:ascii="微软雅黑" w:hAnsi="微软雅黑"/>
+                <w:color w:val="334155"/>
+                <w:sz w:val="18"/>
+              </w:rPr>
+              <w:t>电化学硬件测试直连与高频动态瞬态信号采集工作站，证实系统具备硬件闭环落地能力。</w:t>
+            </w:r>
+          </w:p>
+        </w:tc>
+      </w:tr>
+      <w:tr>
+        <w:tc>
+          <w:tcPr>
+            <w:tcW w:type="dxa" w:w="2160"/>
+            <w:shd w:fill="F8FAFC"/>
+            <w:tcMar>
+              <w:top w:w="80" w:type="dxa"/>
+              <w:bottom w:w="80" w:type="dxa"/>
+              <w:left w:w="100" w:type="dxa"/>
+              <w:right w:w="100" w:type="dxa"/>
+            </w:tcMar>
+          </w:tcPr>
+          <w:p>
+            <w:r>
+              <w:rPr>
+                <w:rFonts w:ascii="微软雅黑" w:hAnsi="微软雅黑"/>
+                <w:b/>
+                <w:color w:val="1E293B"/>
+                <w:sz w:val="18"/>
+              </w:rPr>
+              <w:t>🧱 核心板块与组件</w:t>
+            </w:r>
+          </w:p>
+        </w:tc>
+        <w:tc>
+          <w:tcPr>
+            <w:tcW w:type="dxa" w:w="7632"/>
+            <w:shd w:fill="FAFAFA"/>
+            <w:tcMar>
+              <w:top w:w="80" w:type="dxa"/>
+              <w:bottom w:w="80" w:type="dxa"/>
+              <w:left w:w="100" w:type="dxa"/>
+              <w:right w:w="100" w:type="dxa"/>
+            </w:tcMar>
+          </w:tcPr>
+          <w:p>
+            <w:r>
+              <w:rPr>
+                <w:rFonts w:ascii="微软雅黑" w:hAnsi="微软雅黑"/>
+                <w:b/>
+                <w:color w:val="0E7490"/>
+                <w:sz w:val="17"/>
+              </w:rPr>
+              <w:t>• 60 FPS 动态波形画布：</w:t>
+            </w:r>
+            <w:r>
+              <w:rPr>
+                <w:rFonts w:ascii="微软雅黑" w:hAnsi="微软雅黑"/>
+                <w:color w:val="475569"/>
+                <w:sz w:val="17"/>
+              </w:rPr>
+              <w:t>实时绘制充放电测试过程中的动态瞬态曲线：Trace-V 电压轨迹（青色曲线）与 Trace-I 电流轨迹（琥珀色曲线）。</w:t>
+            </w:r>
+          </w:p>
+          <w:p>
+            <w:r>
+              <w:rPr>
+                <w:rFonts w:ascii="微软雅黑" w:hAnsi="微软雅黑"/>
+                <w:b/>
+                <w:color w:val="0E7490"/>
+                <w:sz w:val="17"/>
+              </w:rPr>
+              <w:t>• 双通道 HUD 读数与切换：</w:t>
+            </w:r>
+            <w:r>
+              <w:rPr>
+                <w:rFonts w:ascii="微软雅黑" w:hAnsi="微软雅黑"/>
+                <w:color w:val="475569"/>
+                <w:sz w:val="17"/>
+              </w:rPr>
+              <w:t>实时呈现当前采样时刻的瞬态电压（V）与瞬态电流（A）读数，支持切换 CH1 电压通道、CH2 电流通道或双通道同步模式。</w:t>
+            </w:r>
+          </w:p>
+          <w:p>
+            <w:r>
+              <w:rPr>
+                <w:rFonts w:ascii="微软雅黑" w:hAnsi="微软雅黑"/>
+                <w:b/>
+                <w:color w:val="0E7490"/>
+                <w:sz w:val="17"/>
+              </w:rPr>
+              <w:t>• 脉冲工况注入控制台：</w:t>
+            </w:r>
+            <w:r>
+              <w:rPr>
+                <w:rFonts w:ascii="微软雅黑" w:hAnsi="微软雅黑"/>
+                <w:color w:val="475569"/>
+                <w:sz w:val="17"/>
+              </w:rPr>
+              <w:t>支持一键向测试回路注入 0.5C 恒流充电、1.0C 恒流放电以及 2.0C 脉冲放电等标准测试工况。</w:t>
+            </w:r>
+          </w:p>
+          <w:p>
+            <w:r>
+              <w:rPr>
+                <w:rFonts w:ascii="微软雅黑" w:hAnsi="微软雅黑"/>
+                <w:b/>
+                <w:color w:val="0E7490"/>
+                <w:sz w:val="17"/>
+              </w:rPr>
+              <w:t>• 硬件采样参数卡片：</w:t>
+            </w:r>
+            <w:r>
+              <w:rPr>
+                <w:rFonts w:ascii="微软雅黑" w:hAnsi="微软雅黑"/>
+                <w:color w:val="475569"/>
+                <w:sz w:val="17"/>
+              </w:rPr>
+              <w:t>标明四端子开尔文夹具消除引线接触内阻状态、1000 Hz 高速采集率以及时序同步健康度。</w:t>
+            </w:r>
+          </w:p>
+        </w:tc>
+      </w:tr>
+      <w:tr>
+        <w:tc>
+          <w:tcPr>
+            <w:tcW w:type="dxa" w:w="2160"/>
+            <w:shd w:fill="FEF3C7"/>
+            <w:tcMar>
+              <w:top w:w="80" w:type="dxa"/>
+              <w:bottom w:w="80" w:type="dxa"/>
+              <w:left w:w="100" w:type="dxa"/>
+              <w:right w:w="100" w:type="dxa"/>
+            </w:tcMar>
+          </w:tcPr>
+          <w:p>
+            <w:r>
+              <w:rPr>
+                <w:rFonts w:ascii="微软雅黑" w:hAnsi="微软雅黑"/>
+                <w:b/>
+                <w:color w:val="B45309"/>
+                <w:sz w:val="18"/>
+              </w:rPr>
+              <w:t>🎥 录屏解说核心点</w:t>
+            </w:r>
+          </w:p>
+        </w:tc>
+        <w:tc>
+          <w:tcPr>
+            <w:tcW w:type="dxa" w:w="7632"/>
+            <w:shd w:fill="FFFBEB"/>
+            <w:tcMar>
+              <w:top w:w="80" w:type="dxa"/>
+              <w:bottom w:w="80" w:type="dxa"/>
+              <w:left w:w="100" w:type="dxa"/>
+              <w:right w:w="100" w:type="dxa"/>
+            </w:tcMar>
+          </w:tcPr>
+          <w:p>
+            <w:r>
+              <w:rPr>
+                <w:rFonts w:ascii="微软雅黑" w:hAnsi="微软雅黑"/>
+                <w:color w:val="92400E"/>
+                <w:sz w:val="18"/>
+              </w:rPr>
+              <w:t>展示动态示波器波形，强调与四端子开尔文夹具等测试仪器的直连能力，体现‘台架采集-特征提取-模型推理’工程闭环。</w:t>
+            </w:r>
+          </w:p>
+        </w:tc>
+      </w:tr>
+    </w:tbl>
+    <w:p/>
+    <w:p>
+      <w:r>
+        <w:rPr>
+          <w:rFonts w:ascii="微软雅黑" w:hAnsi="微软雅黑"/>
+          <w:b/>
+          <w:color w:val="0F172A"/>
+          <w:sz w:val="23"/>
+        </w:rPr>
+        <w:t>【Tab 3：SOH 健康诊断算法评估 (M1)】</w:t>
+      </w:r>
+    </w:p>
+    <w:tbl>
+      <w:tblPr>
+        <w:tblW w:type="auto" w:w="0"/>
+        <w:jc w:val="center"/>
+        <w:tblLook w:firstColumn="1" w:firstRow="1" w:lastColumn="0" w:lastRow="0" w:noHBand="0" w:noVBand="1" w:val="04A0"/>
+      </w:tblPr>
+      <w:tblGrid>
+        <w:gridCol w:w="4968"/>
+        <w:gridCol w:w="4968"/>
+      </w:tblGrid>
+      <w:tr>
+        <w:tc>
+          <w:tcPr>
+            <w:tcW w:type="dxa" w:w="2160"/>
+            <w:shd w:fill="F1F5F9"/>
+            <w:tcMar>
+              <w:top w:w="80" w:type="dxa"/>
+              <w:bottom w:w="80" w:type="dxa"/>
+              <w:left w:w="100" w:type="dxa"/>
+              <w:right w:w="100" w:type="dxa"/>
+            </w:tcMar>
+          </w:tcPr>
+          <w:p>
+            <w:r>
+              <w:rPr>
+                <w:rFonts w:ascii="微软雅黑" w:hAnsi="微软雅黑"/>
+                <w:b/>
+                <w:color w:val="1E293B"/>
+                <w:sz w:val="18"/>
+              </w:rPr>
+              <w:t>📍 页面定位与目标</w:t>
+            </w:r>
+          </w:p>
+        </w:tc>
+        <w:tc>
+          <w:tcPr>
+            <w:tcW w:type="dxa" w:w="7632"/>
+            <w:shd w:fill="FFFFFF"/>
+            <w:tcMar>
+              <w:top w:w="80" w:type="dxa"/>
+              <w:bottom w:w="80" w:type="dxa"/>
+              <w:left w:w="100" w:type="dxa"/>
+              <w:right w:w="100" w:type="dxa"/>
+            </w:tcMar>
+          </w:tcPr>
+          <w:p>
+            <w:r>
+              <w:rPr>
+                <w:rFonts w:ascii="微软雅黑" w:hAnsi="微软雅黑"/>
+                <w:color w:val="334155"/>
+                <w:sz w:val="18"/>
+              </w:rPr>
+              <w:t>微观电化学特征可解释性与多模型留一交叉验证 (LOBO) 严格比对平台，展示算法学术严谨性。</w:t>
+            </w:r>
+          </w:p>
+        </w:tc>
+      </w:tr>
+      <w:tr>
+        <w:tc>
+          <w:tcPr>
+            <w:tcW w:type="dxa" w:w="2160"/>
+            <w:shd w:fill="F8FAFC"/>
+            <w:tcMar>
+              <w:top w:w="80" w:type="dxa"/>
+              <w:bottom w:w="80" w:type="dxa"/>
+              <w:left w:w="100" w:type="dxa"/>
+              <w:right w:w="100" w:type="dxa"/>
+            </w:tcMar>
+          </w:tcPr>
+          <w:p>
+            <w:r>
+              <w:rPr>
+                <w:rFonts w:ascii="微软雅黑" w:hAnsi="微软雅黑"/>
+                <w:b/>
+                <w:color w:val="1E293B"/>
+                <w:sz w:val="18"/>
+              </w:rPr>
+              <w:t>🧱 核心板块与组件</w:t>
+            </w:r>
+          </w:p>
+        </w:tc>
+        <w:tc>
+          <w:tcPr>
+            <w:tcW w:type="dxa" w:w="7632"/>
+            <w:shd w:fill="FAFAFA"/>
+            <w:tcMar>
+              <w:top w:w="80" w:type="dxa"/>
+              <w:bottom w:w="80" w:type="dxa"/>
+              <w:left w:w="100" w:type="dxa"/>
+              <w:right w:w="100" w:type="dxa"/>
+            </w:tcMar>
+          </w:tcPr>
+          <w:p>
+            <w:r>
+              <w:rPr>
+                <w:rFonts w:ascii="微软雅黑" w:hAnsi="微软雅黑"/>
+                <w:b/>
+                <w:color w:val="0E7490"/>
+                <w:sz w:val="17"/>
+              </w:rPr>
+              <w:t>• 物理特征重要性得分排序图：</w:t>
+            </w:r>
+            <w:r>
+              <w:rPr>
+                <w:rFonts w:ascii="微软雅黑" w:hAnsi="微软雅黑"/>
+                <w:color w:val="475569"/>
+                <w:sz w:val="17"/>
+              </w:rPr>
+              <w:t>横向条形图量化 8 项特征对 SOH 衰退的边际贡献率，并标注对应材料体系特有的物理机制（如过电位表征电极接触衰退、松弛电压表征离子扩散迟滞）。</w:t>
+            </w:r>
+          </w:p>
+          <w:p>
+            <w:r>
+              <w:rPr>
+                <w:rFonts w:ascii="微软雅黑" w:hAnsi="微软雅黑"/>
+                <w:b/>
+                <w:color w:val="0E7490"/>
+                <w:sz w:val="17"/>
+              </w:rPr>
+              <w:t>• 多模型 LOBO 误差对比柱状图：</w:t>
+            </w:r>
+            <w:r>
+              <w:rPr>
+                <w:rFonts w:ascii="微软雅黑" w:hAnsi="微软雅黑"/>
+                <w:color w:val="475569"/>
+                <w:sz w:val="17"/>
+              </w:rPr>
+              <w:t>严格通过留一电池组交叉验证 (Leave-One-Battery-Out)，横向对比统一 XGBoost 与随机森林、岭回归、偏最小二乘、支持向量机 (SVR) 等对比模型的 MAE 绝对误差。</w:t>
+            </w:r>
+          </w:p>
+          <w:p>
+            <w:r>
+              <w:rPr>
+                <w:rFonts w:ascii="微软雅黑" w:hAnsi="微软雅黑"/>
+                <w:b/>
+                <w:color w:val="0E7490"/>
+                <w:sz w:val="17"/>
+              </w:rPr>
+              <w:t>• 多模型横向对照矩阵明细表：</w:t>
+            </w:r>
+            <w:r>
+              <w:rPr>
+                <w:rFonts w:ascii="微软雅黑" w:hAnsi="微软雅黑"/>
+                <w:color w:val="475569"/>
+                <w:sz w:val="17"/>
+              </w:rPr>
+              <w:t>以表格形式完整列出各对比模型当前的预测 SOH 百分比、健康评级、验证误差与判定状态。</w:t>
+            </w:r>
+          </w:p>
+        </w:tc>
+      </w:tr>
+      <w:tr>
+        <w:tc>
+          <w:tcPr>
+            <w:tcW w:type="dxa" w:w="2160"/>
+            <w:shd w:fill="FEF3C7"/>
+            <w:tcMar>
+              <w:top w:w="80" w:type="dxa"/>
+              <w:bottom w:w="80" w:type="dxa"/>
+              <w:left w:w="100" w:type="dxa"/>
+              <w:right w:w="100" w:type="dxa"/>
+            </w:tcMar>
+          </w:tcPr>
+          <w:p>
+            <w:r>
+              <w:rPr>
+                <w:rFonts w:ascii="微软雅黑" w:hAnsi="微软雅黑"/>
+                <w:b/>
+                <w:color w:val="B45309"/>
+                <w:sz w:val="18"/>
+              </w:rPr>
+              <w:t>🎥 录屏解说核心点</w:t>
+            </w:r>
+          </w:p>
+        </w:tc>
+        <w:tc>
+          <w:tcPr>
+            <w:tcW w:type="dxa" w:w="7632"/>
+            <w:shd w:fill="FFFBEB"/>
+            <w:tcMar>
+              <w:top w:w="80" w:type="dxa"/>
+              <w:bottom w:w="80" w:type="dxa"/>
+              <w:left w:w="100" w:type="dxa"/>
+              <w:right w:w="100" w:type="dxa"/>
+            </w:tcMar>
+          </w:tcPr>
+          <w:p>
+            <w:r>
+              <w:rPr>
+                <w:rFonts w:ascii="微软雅黑" w:hAnsi="微软雅黑"/>
+                <w:color w:val="92400E"/>
+                <w:sz w:val="18"/>
+              </w:rPr>
+              <w:t>重点指出特征敏感度与电化学理论高度一致；通过留一交叉验证误差对比，证实统一 XGBoost 模型的精度优势与跨样本泛化性能。</w:t>
+            </w:r>
+          </w:p>
+        </w:tc>
+      </w:tr>
+    </w:tbl>
+    <w:p/>
+    <w:p>
+      <w:r>
+        <w:rPr>
+          <w:rFonts w:ascii="微软雅黑" w:hAnsi="微软雅黑"/>
+          <w:b/>
+          <w:color w:val="0F172A"/>
+          <w:sz w:val="23"/>
+        </w:rPr>
+        <w:t>【Tab 4：容量恢复与再生定级 (M2)】</w:t>
+      </w:r>
+    </w:p>
+    <w:tbl>
+      <w:tblPr>
+        <w:tblW w:type="auto" w:w="0"/>
+        <w:jc w:val="center"/>
+        <w:tblLook w:firstColumn="1" w:firstRow="1" w:lastColumn="0" w:lastRow="0" w:noHBand="0" w:noVBand="1" w:val="04A0"/>
+      </w:tblPr>
+      <w:tblGrid>
+        <w:gridCol w:w="4968"/>
+        <w:gridCol w:w="4968"/>
+      </w:tblGrid>
+      <w:tr>
+        <w:tc>
+          <w:tcPr>
+            <w:tcW w:type="dxa" w:w="2160"/>
+            <w:shd w:fill="F1F5F9"/>
+            <w:tcMar>
+              <w:top w:w="80" w:type="dxa"/>
+              <w:bottom w:w="80" w:type="dxa"/>
+              <w:left w:w="100" w:type="dxa"/>
+              <w:right w:w="100" w:type="dxa"/>
+            </w:tcMar>
+          </w:tcPr>
+          <w:p>
+            <w:r>
+              <w:rPr>
+                <w:rFonts w:ascii="微软雅黑" w:hAnsi="微软雅黑"/>
+                <w:b/>
+                <w:color w:val="1E293B"/>
+                <w:sz w:val="18"/>
+              </w:rPr>
+              <w:t>📍 页面定位与目标</w:t>
+            </w:r>
+          </w:p>
+        </w:tc>
+        <w:tc>
+          <w:tcPr>
+            <w:tcW w:type="dxa" w:w="7632"/>
+            <w:shd w:fill="FFFFFF"/>
+            <w:tcMar>
+              <w:top w:w="80" w:type="dxa"/>
+              <w:bottom w:w="80" w:type="dxa"/>
+              <w:left w:w="100" w:type="dxa"/>
+              <w:right w:w="100" w:type="dxa"/>
+            </w:tcMar>
+          </w:tcPr>
+          <w:p>
+            <w:r>
+              <w:rPr>
+                <w:rFonts w:ascii="微软雅黑" w:hAnsi="微软雅黑"/>
+                <w:color w:val="334155"/>
+                <w:sz w:val="18"/>
+              </w:rPr>
+              <w:t>容量恢复微调理潜力预测、90% 保角置信区间量化与 100 只电芯批量梯次分选中心。</w:t>
+            </w:r>
+          </w:p>
+        </w:tc>
+      </w:tr>
+      <w:tr>
+        <w:tc>
+          <w:tcPr>
+            <w:tcW w:type="dxa" w:w="2160"/>
+            <w:shd w:fill="F8FAFC"/>
+            <w:tcMar>
+              <w:top w:w="80" w:type="dxa"/>
+              <w:bottom w:w="80" w:type="dxa"/>
+              <w:left w:w="100" w:type="dxa"/>
+              <w:right w:w="100" w:type="dxa"/>
+            </w:tcMar>
+          </w:tcPr>
+          <w:p>
+            <w:r>
+              <w:rPr>
+                <w:rFonts w:ascii="微软雅黑" w:hAnsi="微软雅黑"/>
+                <w:b/>
+                <w:color w:val="1E293B"/>
+                <w:sz w:val="18"/>
+              </w:rPr>
+              <w:t>🧱 核心板块与组件</w:t>
+            </w:r>
+          </w:p>
+        </w:tc>
+        <w:tc>
+          <w:tcPr>
+            <w:tcW w:type="dxa" w:w="7632"/>
+            <w:shd w:fill="FAFAFA"/>
+            <w:tcMar>
+              <w:top w:w="80" w:type="dxa"/>
+              <w:bottom w:w="80" w:type="dxa"/>
+              <w:left w:w="100" w:type="dxa"/>
+              <w:right w:w="100" w:type="dxa"/>
+            </w:tcMar>
+          </w:tcPr>
+          <w:p>
+            <w:r>
+              <w:rPr>
+                <w:rFonts w:ascii="微软雅黑" w:hAnsi="微软雅黑"/>
+                <w:b/>
+                <w:color w:val="0E7490"/>
+                <w:sz w:val="17"/>
+              </w:rPr>
+              <w:t>• 选中电芯动态聚焦状态横幅：</w:t>
+            </w:r>
+            <w:r>
+              <w:rPr>
+                <w:rFonts w:ascii="微软雅黑" w:hAnsi="微软雅黑"/>
+                <w:color w:val="475569"/>
+                <w:sz w:val="17"/>
+              </w:rPr>
+              <w:t>顶部高亮条实时呈现当前聚焦选中的电芯编号、SOH、预估恢复容量、90% 保角置信区间以及恢复潜力 RPI。</w:t>
+            </w:r>
+          </w:p>
+          <w:p>
+            <w:r>
+              <w:rPr>
+                <w:rFonts w:ascii="微软雅黑" w:hAnsi="微软雅黑"/>
+                <w:b/>
+                <w:color w:val="0E7490"/>
+                <w:sz w:val="17"/>
+              </w:rPr>
+              <w:t>• 逐电芯恢复预测与保角区间图：</w:t>
+            </w:r>
+            <w:r>
+              <w:rPr>
+                <w:rFonts w:ascii="微软雅黑" w:hAnsi="微软雅黑"/>
+                <w:color w:val="475569"/>
+                <w:sz w:val="17"/>
+              </w:rPr>
+              <w:t>科学柱状区间图（Bar + 90% Conformal Error Bars）：每个柱体表征预估恢复量，误差棒给出 90% 置信区间；选定电芯呈现发光高亮与琥珀色标旗指针，支持点击柱体即时高亮居中。</w:t>
+            </w:r>
+          </w:p>
+          <w:p>
+            <w:r>
+              <w:rPr>
+                <w:rFonts w:ascii="微软雅黑" w:hAnsi="微软雅黑"/>
+                <w:b/>
+                <w:color w:val="0E7490"/>
+                <w:sz w:val="17"/>
+              </w:rPr>
+              <w:t>• 100只退役储能电芯矩阵看板：</w:t>
+            </w:r>
+            <w:r>
+              <w:rPr>
+                <w:rFonts w:ascii="微软雅黑" w:hAnsi="微软雅黑"/>
+                <w:color w:val="475569"/>
+                <w:sz w:val="17"/>
+              </w:rPr>
+              <w:t>以 100 颗四色芯片呈现完整模组，点击任意芯片可就地联动全站更新，绝对不跳页。</w:t>
+            </w:r>
+          </w:p>
+          <w:p>
+            <w:r>
+              <w:rPr>
+                <w:rFonts w:ascii="微软雅黑" w:hAnsi="微软雅黑"/>
+                <w:b/>
+                <w:color w:val="0E7490"/>
+                <w:sz w:val="17"/>
+              </w:rPr>
+              <w:t>• 批量分选明细表与 CSV 导出：</w:t>
+            </w:r>
+            <w:r>
+              <w:rPr>
+                <w:rFonts w:ascii="微软雅黑" w:hAnsi="微软雅黑"/>
+                <w:color w:val="475569"/>
+                <w:sz w:val="17"/>
+              </w:rPr>
+              <w:t>支持按全部及 A/B/C/D 级筛选 100 只电芯，支持一键导出包含电芯参数、恢复量与减排量的规范 CSV 文件。</w:t>
+            </w:r>
+          </w:p>
+          <w:p>
+            <w:r>
+              <w:rPr>
+                <w:rFonts w:ascii="微软雅黑" w:hAnsi="微软雅黑"/>
+                <w:b/>
+                <w:color w:val="0E7490"/>
+                <w:sz w:val="17"/>
+              </w:rPr>
+              <w:t>• 再利用等级分布占比环形图：</w:t>
+            </w:r>
+            <w:r>
+              <w:rPr>
+                <w:rFonts w:ascii="微软雅黑" w:hAnsi="微软雅黑"/>
+                <w:color w:val="475569"/>
+                <w:sz w:val="17"/>
+              </w:rPr>
+              <w:t>中心标注 100 只总评定样本量，环形图清晰呈现 A级(储能服役)、B级(调理再生)、C级(轻载利用)、D级(提锂再生) 的确切样本数量与百分比。</w:t>
+            </w:r>
+          </w:p>
+        </w:tc>
+      </w:tr>
+      <w:tr>
+        <w:tc>
+          <w:tcPr>
+            <w:tcW w:type="dxa" w:w="2160"/>
+            <w:shd w:fill="FEF3C7"/>
+            <w:tcMar>
+              <w:top w:w="80" w:type="dxa"/>
+              <w:bottom w:w="80" w:type="dxa"/>
+              <w:left w:w="100" w:type="dxa"/>
+              <w:right w:w="100" w:type="dxa"/>
+            </w:tcMar>
+          </w:tcPr>
+          <w:p>
+            <w:r>
+              <w:rPr>
+                <w:rFonts w:ascii="微软雅黑" w:hAnsi="微软雅黑"/>
+                <w:b/>
+                <w:color w:val="B45309"/>
+                <w:sz w:val="18"/>
+              </w:rPr>
+              <w:t>🎥 录屏解说核心点</w:t>
+            </w:r>
+          </w:p>
+        </w:tc>
+        <w:tc>
+          <w:tcPr>
+            <w:tcW w:type="dxa" w:w="7632"/>
+            <w:shd w:fill="FFFBEB"/>
+            <w:tcMar>
+              <w:top w:w="80" w:type="dxa"/>
+              <w:bottom w:w="80" w:type="dxa"/>
+              <w:left w:w="100" w:type="dxa"/>
+              <w:right w:w="100" w:type="dxa"/>
+            </w:tcMar>
+          </w:tcPr>
+          <w:p>
+            <w:r>
+              <w:rPr>
+                <w:rFonts w:ascii="微软雅黑" w:hAnsi="微软雅黑"/>
+                <w:color w:val="92400E"/>
+                <w:sz w:val="18"/>
+              </w:rPr>
+              <w:t>阐述活性锂可逆调理机理；强调 90% 保角预测区间在统计学上的置信界限；现场点击任意电芯展示全图表联动高亮；介绍批量分选矩阵与再利用占比环形图。</w:t>
+            </w:r>
+          </w:p>
+        </w:tc>
+      </w:tr>
+    </w:tbl>
+    <w:p/>
+    <w:p>
+      <w:r>
+        <w:rPr>
+          <w:rFonts w:ascii="微软雅黑" w:hAnsi="微软雅黑"/>
+          <w:b/>
+          <w:color w:val="0F172A"/>
+          <w:sz w:val="23"/>
+        </w:rPr>
+        <w:t>【Tab 5：制造端碳减排核算 (M3)】</w:t>
+      </w:r>
+    </w:p>
+    <w:tbl>
+      <w:tblPr>
+        <w:tblW w:type="auto" w:w="0"/>
+        <w:jc w:val="center"/>
+        <w:tblLook w:firstColumn="1" w:firstRow="1" w:lastColumn="0" w:lastRow="0" w:noHBand="0" w:noVBand="1" w:val="04A0"/>
+      </w:tblPr>
+      <w:tblGrid>
+        <w:gridCol w:w="4968"/>
+        <w:gridCol w:w="4968"/>
+      </w:tblGrid>
+      <w:tr>
+        <w:tc>
+          <w:tcPr>
+            <w:tcW w:type="dxa" w:w="2160"/>
+            <w:shd w:fill="F1F5F9"/>
+            <w:tcMar>
+              <w:top w:w="80" w:type="dxa"/>
+              <w:bottom w:w="80" w:type="dxa"/>
+              <w:left w:w="100" w:type="dxa"/>
+              <w:right w:w="100" w:type="dxa"/>
+            </w:tcMar>
+          </w:tcPr>
+          <w:p>
+            <w:r>
+              <w:rPr>
+                <w:rFonts w:ascii="微软雅黑" w:hAnsi="微软雅黑"/>
+                <w:b/>
+                <w:color w:val="1E293B"/>
+                <w:sz w:val="18"/>
+              </w:rPr>
+              <w:t>📍 页面定位与目标</w:t>
+            </w:r>
+          </w:p>
+        </w:tc>
+        <w:tc>
+          <w:tcPr>
+            <w:tcW w:type="dxa" w:w="7632"/>
+            <w:shd w:fill="FFFFFF"/>
+            <w:tcMar>
+              <w:top w:w="80" w:type="dxa"/>
+              <w:bottom w:w="80" w:type="dxa"/>
+              <w:left w:w="100" w:type="dxa"/>
+              <w:right w:w="100" w:type="dxa"/>
+            </w:tcMar>
+          </w:tcPr>
+          <w:p>
+            <w:r>
+              <w:rPr>
+                <w:rFonts w:ascii="微软雅黑" w:hAnsi="微软雅黑"/>
+                <w:color w:val="334155"/>
+                <w:sz w:val="18"/>
+              </w:rPr>
+              <w:t>基于全生命周期评价 (LCA) 与产品碳足迹标准，将调理恢复电量等效换算为制造端避碳贡献。</w:t>
+            </w:r>
+          </w:p>
+        </w:tc>
+      </w:tr>
+      <w:tr>
+        <w:tc>
+          <w:tcPr>
+            <w:tcW w:type="dxa" w:w="2160"/>
+            <w:shd w:fill="F8FAFC"/>
+            <w:tcMar>
+              <w:top w:w="80" w:type="dxa"/>
+              <w:bottom w:w="80" w:type="dxa"/>
+              <w:left w:w="100" w:type="dxa"/>
+              <w:right w:w="100" w:type="dxa"/>
+            </w:tcMar>
+          </w:tcPr>
+          <w:p>
+            <w:r>
+              <w:rPr>
+                <w:rFonts w:ascii="微软雅黑" w:hAnsi="微软雅黑"/>
+                <w:b/>
+                <w:color w:val="1E293B"/>
+                <w:sz w:val="18"/>
+              </w:rPr>
+              <w:t>🧱 核心板块与组件</w:t>
+            </w:r>
+          </w:p>
+        </w:tc>
+        <w:tc>
+          <w:tcPr>
+            <w:tcW w:type="dxa" w:w="7632"/>
+            <w:shd w:fill="FAFAFA"/>
+            <w:tcMar>
+              <w:top w:w="80" w:type="dxa"/>
+              <w:bottom w:w="80" w:type="dxa"/>
+              <w:left w:w="100" w:type="dxa"/>
+              <w:right w:w="100" w:type="dxa"/>
+            </w:tcMar>
+          </w:tcPr>
+          <w:p>
+            <w:r>
+              <w:rPr>
+                <w:rFonts w:ascii="微软雅黑" w:hAnsi="微软雅黑"/>
+                <w:b/>
+                <w:color w:val="0E7490"/>
+                <w:sz w:val="17"/>
+              </w:rPr>
+              <w:t>• 低碳指标 KPI 汇总卡片：</w:t>
+            </w:r>
+            <w:r>
+              <w:rPr>
+                <w:rFonts w:ascii="微软雅黑" w:hAnsi="微软雅黑"/>
+                <w:color w:val="475569"/>
+                <w:sz w:val="17"/>
+              </w:rPr>
+              <w:t>直观给出模组等效恢复电量 (kWh)、制造端避碳因数 (kgCO₂e/kWh)、调理消耗电网碳排放以及最终净碳减排量 (kgCO₂e)。</w:t>
+            </w:r>
+          </w:p>
+          <w:p>
+            <w:r>
+              <w:rPr>
+                <w:rFonts w:ascii="微软雅黑" w:hAnsi="微软雅黑"/>
+                <w:b/>
+                <w:color w:val="0E7490"/>
+                <w:sz w:val="17"/>
+              </w:rPr>
+              <w:t>• 制造端碳减排链路明细表：</w:t>
+            </w:r>
+            <w:r>
+              <w:rPr>
+                <w:rFonts w:ascii="微软雅黑" w:hAnsi="微软雅黑"/>
+                <w:color w:val="475569"/>
+                <w:sz w:val="17"/>
+              </w:rPr>
+              <w:t>表格自顶向下逐项拆解恢复电量、避碳因子、工序电耗与净减排核算逻辑。</w:t>
+            </w:r>
+          </w:p>
+          <w:p>
+            <w:r>
+              <w:rPr>
+                <w:rFonts w:ascii="微软雅黑" w:hAnsi="微软雅黑"/>
+                <w:b/>
+                <w:color w:val="0E7490"/>
+                <w:sz w:val="17"/>
+              </w:rPr>
+              <w:t>• 碳减排瀑布分解图 (Waterfall)：</w:t>
+            </w:r>
+            <w:r>
+              <w:rPr>
+                <w:rFonts w:ascii="微软雅黑" w:hAnsi="微软雅黑"/>
+                <w:color w:val="475569"/>
+                <w:sz w:val="17"/>
+              </w:rPr>
+              <w:t>阶梯式瀑布图清晰展现‘新电池制造端规避排放’扣除‘调理电网电耗’得到‘净减排量’的全链路。</w:t>
+            </w:r>
+          </w:p>
+          <w:p>
+            <w:r>
+              <w:rPr>
+                <w:rFonts w:ascii="微软雅黑" w:hAnsi="微软雅黑"/>
+                <w:b/>
+                <w:color w:val="0E7490"/>
+                <w:sz w:val="17"/>
+              </w:rPr>
+              <w:t>• 全生命周期环境效益指标：</w:t>
+            </w:r>
+            <w:r>
+              <w:rPr>
+                <w:rFonts w:ascii="微软雅黑" w:hAnsi="微软雅黑"/>
+                <w:color w:val="475569"/>
+                <w:sz w:val="17"/>
+              </w:rPr>
+              <w:t>等效植树造林吸收量（棵）、新能源汽车纯电清洁行驶里程（km）、单位容量减碳强度等。</w:t>
+            </w:r>
+          </w:p>
+        </w:tc>
+      </w:tr>
+      <w:tr>
+        <w:tc>
+          <w:tcPr>
+            <w:tcW w:type="dxa" w:w="2160"/>
+            <w:shd w:fill="FEF3C7"/>
+            <w:tcMar>
+              <w:top w:w="80" w:type="dxa"/>
+              <w:bottom w:w="80" w:type="dxa"/>
+              <w:left w:w="100" w:type="dxa"/>
+              <w:right w:w="100" w:type="dxa"/>
+            </w:tcMar>
+          </w:tcPr>
+          <w:p>
+            <w:r>
+              <w:rPr>
+                <w:rFonts w:ascii="微软雅黑" w:hAnsi="微软雅黑"/>
+                <w:b/>
+                <w:color w:val="B45309"/>
+                <w:sz w:val="18"/>
+              </w:rPr>
+              <w:t>🎥 录屏解说核心点</w:t>
+            </w:r>
+          </w:p>
+        </w:tc>
+        <w:tc>
+          <w:tcPr>
+            <w:tcW w:type="dxa" w:w="7632"/>
+            <w:shd w:fill="FFFBEB"/>
+            <w:tcMar>
+              <w:top w:w="80" w:type="dxa"/>
+              <w:bottom w:w="80" w:type="dxa"/>
+              <w:left w:w="100" w:type="dxa"/>
+              <w:right w:w="100" w:type="dxa"/>
+            </w:tcMar>
+          </w:tcPr>
+          <w:p>
+            <w:r>
+              <w:rPr>
+                <w:rFonts w:ascii="微软雅黑" w:hAnsi="微软雅黑"/>
+                <w:color w:val="92400E"/>
+                <w:sz w:val="18"/>
+              </w:rPr>
+              <w:t>阐明‘恢复可用电量等效替代新电池制造’的避碳逻辑，强调核算依照国家产品碳足迹规范，体现退役电池循环再生的低碳环境效益。</w:t>
+            </w:r>
+          </w:p>
+        </w:tc>
+      </w:tr>
+    </w:tbl>
+    <w:p/>
+    <w:p>
+      <w:r>
+        <w:rPr>
+          <w:rFonts w:ascii="微软雅黑" w:hAnsi="微软雅黑"/>
+          <w:b/>
+          <w:color w:val="0F172A"/>
+          <w:sz w:val="23"/>
+        </w:rPr>
+        <w:t>【Tab 6：电池档案与数字护照 (Vault &amp; Passport)】</w:t>
+      </w:r>
+    </w:p>
+    <w:tbl>
+      <w:tblPr>
+        <w:tblW w:type="auto" w:w="0"/>
+        <w:jc w:val="center"/>
+        <w:tblLook w:firstColumn="1" w:firstRow="1" w:lastColumn="0" w:lastRow="0" w:noHBand="0" w:noVBand="1" w:val="04A0"/>
+      </w:tblPr>
+      <w:tblGrid>
+        <w:gridCol w:w="4968"/>
+        <w:gridCol w:w="4968"/>
+      </w:tblGrid>
+      <w:tr>
+        <w:tc>
+          <w:tcPr>
+            <w:tcW w:type="dxa" w:w="2160"/>
+            <w:shd w:fill="F1F5F9"/>
+            <w:tcMar>
+              <w:top w:w="80" w:type="dxa"/>
+              <w:bottom w:w="80" w:type="dxa"/>
+              <w:left w:w="100" w:type="dxa"/>
+              <w:right w:w="100" w:type="dxa"/>
+            </w:tcMar>
+          </w:tcPr>
+          <w:p>
+            <w:r>
+              <w:rPr>
+                <w:rFonts w:ascii="微软雅黑" w:hAnsi="微软雅黑"/>
+                <w:b/>
+                <w:color w:val="1E293B"/>
+                <w:sz w:val="18"/>
+              </w:rPr>
+              <w:t>📍 页面定位与目标</w:t>
+            </w:r>
+          </w:p>
+        </w:tc>
+        <w:tc>
+          <w:tcPr>
+            <w:tcW w:type="dxa" w:w="7632"/>
+            <w:shd w:fill="FFFFFF"/>
+            <w:tcMar>
+              <w:top w:w="80" w:type="dxa"/>
+              <w:bottom w:w="80" w:type="dxa"/>
+              <w:left w:w="100" w:type="dxa"/>
+              <w:right w:w="100" w:type="dxa"/>
+            </w:tcMar>
+          </w:tcPr>
+          <w:p>
+            <w:r>
+              <w:rPr>
+                <w:rFonts w:ascii="微软雅黑" w:hAnsi="微软雅黑"/>
+                <w:color w:val="334155"/>
+                <w:sz w:val="18"/>
+              </w:rPr>
+              <w:t>电池终身全生命周期多节点体检建档、健康溯源与第三方商业评估公证书出具平台。</w:t>
+            </w:r>
+          </w:p>
+        </w:tc>
+      </w:tr>
+      <w:tr>
+        <w:tc>
+          <w:tcPr>
+            <w:tcW w:type="dxa" w:w="2160"/>
+            <w:shd w:fill="F8FAFC"/>
+            <w:tcMar>
+              <w:top w:w="80" w:type="dxa"/>
+              <w:bottom w:w="80" w:type="dxa"/>
+              <w:left w:w="100" w:type="dxa"/>
+              <w:right w:w="100" w:type="dxa"/>
+            </w:tcMar>
+          </w:tcPr>
+          <w:p>
+            <w:r>
+              <w:rPr>
+                <w:rFonts w:ascii="微软雅黑" w:hAnsi="微软雅黑"/>
+                <w:b/>
+                <w:color w:val="1E293B"/>
+                <w:sz w:val="18"/>
+              </w:rPr>
+              <w:t>🧱 核心板块与组件</w:t>
+            </w:r>
+          </w:p>
+        </w:tc>
+        <w:tc>
+          <w:tcPr>
+            <w:tcW w:type="dxa" w:w="7632"/>
+            <w:shd w:fill="FAFAFA"/>
+            <w:tcMar>
+              <w:top w:w="80" w:type="dxa"/>
+              <w:bottom w:w="80" w:type="dxa"/>
+              <w:left w:w="100" w:type="dxa"/>
+              <w:right w:w="100" w:type="dxa"/>
+            </w:tcMar>
+          </w:tcPr>
+          <w:p>
+            <w:r>
+              <w:rPr>
+                <w:rFonts w:ascii="微软雅黑" w:hAnsi="微软雅黑"/>
+                <w:b/>
+                <w:color w:val="0E7490"/>
+                <w:sz w:val="17"/>
+              </w:rPr>
+              <w:t>• 商业送检登记通道：</w:t>
+            </w:r>
+            <w:r>
+              <w:rPr>
+                <w:rFonts w:ascii="微软雅黑" w:hAnsi="微软雅黑"/>
+                <w:color w:val="475569"/>
+                <w:sz w:val="17"/>
+              </w:rPr>
+              <w:t>支持登记送检单位、电池型号、役龄年限与历史工况；点击‘登记送检电池’弹窗可录入完整商业档案。</w:t>
+            </w:r>
+          </w:p>
+          <w:p>
+            <w:r>
+              <w:rPr>
+                <w:rFonts w:ascii="微软雅黑" w:hAnsi="微软雅黑"/>
+                <w:b/>
+                <w:color w:val="0E7490"/>
+                <w:sz w:val="17"/>
+              </w:rPr>
+              <w:t>• 多节点衰减与恢复时序轨迹图：</w:t>
+            </w:r>
+            <w:r>
+              <w:rPr>
+                <w:rFonts w:ascii="微软雅黑" w:hAnsi="微软雅黑"/>
+                <w:color w:val="475569"/>
+                <w:sz w:val="17"/>
+              </w:rPr>
+              <w:t>横向坐标记录出厂初始、常规巡检、退役初检、微调理再生各节点 SOH 与直流内阻 R_dc 演变。</w:t>
+            </w:r>
+          </w:p>
+          <w:p>
+            <w:r>
+              <w:rPr>
+                <w:rFonts w:ascii="微软雅黑" w:hAnsi="微软雅黑"/>
+                <w:b/>
+                <w:color w:val="0E7490"/>
+                <w:sz w:val="17"/>
+              </w:rPr>
+              <w:t>• 第三方电池资产评估质检公证书：</w:t>
+            </w:r>
+            <w:r>
+              <w:rPr>
+                <w:rFonts w:ascii="微软雅黑" w:hAnsi="微软雅黑"/>
+                <w:color w:val="475569"/>
+                <w:sz w:val="17"/>
+              </w:rPr>
+              <w:t>点击‘📜 质检公证书’弹出科技深色质检证书：包含唯一样本识别码、直流内阻实测数据、微调理恢复潜力准确量（全新标定为 0.00Ah，退役电芯真实标定）、残值估价、定级建议、防伪核验码与权威签章，支持一键打印导出。</w:t>
+            </w:r>
+          </w:p>
+        </w:tc>
+      </w:tr>
+      <w:tr>
+        <w:tc>
+          <w:tcPr>
+            <w:tcW w:type="dxa" w:w="2160"/>
+            <w:shd w:fill="FEF3C7"/>
+            <w:tcMar>
+              <w:top w:w="80" w:type="dxa"/>
+              <w:bottom w:w="80" w:type="dxa"/>
+              <w:left w:w="100" w:type="dxa"/>
+              <w:right w:w="100" w:type="dxa"/>
+            </w:tcMar>
+          </w:tcPr>
+          <w:p>
+            <w:r>
+              <w:rPr>
+                <w:rFonts w:ascii="微软雅黑" w:hAnsi="微软雅黑"/>
+                <w:b/>
+                <w:color w:val="B45309"/>
+                <w:sz w:val="18"/>
+              </w:rPr>
+              <w:t>🎥 录屏解说核心点</w:t>
+            </w:r>
+          </w:p>
+        </w:tc>
+        <w:tc>
+          <w:tcPr>
+            <w:tcW w:type="dxa" w:w="7632"/>
+            <w:shd w:fill="FFFBEB"/>
+            <w:tcMar>
+              <w:top w:w="80" w:type="dxa"/>
+              <w:bottom w:w="80" w:type="dxa"/>
+              <w:left w:w="100" w:type="dxa"/>
+              <w:right w:w="100" w:type="dxa"/>
+            </w:tcMar>
+          </w:tcPr>
+          <w:p>
+            <w:r>
+              <w:rPr>
+                <w:rFonts w:ascii="微软雅黑" w:hAnsi="微软雅黑"/>
+                <w:color w:val="92400E"/>
+                <w:sz w:val="18"/>
+              </w:rPr>
+              <w:t>展示体检建档的数字化飞轮；调出资产评估质检公证书，重点解读直流内阻实测值、真实恢复潜力和残值评估，展现技术赋能商业二手交易流转。</w:t>
+            </w:r>
+          </w:p>
+        </w:tc>
+      </w:tr>
+    </w:tbl>
+    <w:p/>
+    <w:p>
+      <w:r>
+        <w:rPr>
+          <w:rFonts w:ascii="微软雅黑" w:hAnsi="微软雅黑"/>
+          <w:b/>
+          <w:color w:val="0F172A"/>
+          <w:sz w:val="23"/>
+        </w:rPr>
+        <w:t>【Tab 7：综合决策评估报告 (Comprehensive Report)】</w:t>
+      </w:r>
+    </w:p>
+    <w:tbl>
+      <w:tblPr>
+        <w:tblW w:type="auto" w:w="0"/>
+        <w:jc w:val="center"/>
+        <w:tblLook w:firstColumn="1" w:firstRow="1" w:lastColumn="0" w:lastRow="0" w:noHBand="0" w:noVBand="1" w:val="04A0"/>
+      </w:tblPr>
+      <w:tblGrid>
+        <w:gridCol w:w="4968"/>
+        <w:gridCol w:w="4968"/>
+      </w:tblGrid>
+      <w:tr>
+        <w:tc>
+          <w:tcPr>
+            <w:tcW w:type="dxa" w:w="2160"/>
+            <w:shd w:fill="F1F5F9"/>
+            <w:tcMar>
+              <w:top w:w="80" w:type="dxa"/>
+              <w:bottom w:w="80" w:type="dxa"/>
+              <w:left w:w="100" w:type="dxa"/>
+              <w:right w:w="100" w:type="dxa"/>
+            </w:tcMar>
+          </w:tcPr>
+          <w:p>
+            <w:r>
+              <w:rPr>
+                <w:rFonts w:ascii="微软雅黑" w:hAnsi="微软雅黑"/>
+                <w:b/>
+                <w:color w:val="1E293B"/>
+                <w:sz w:val="18"/>
+              </w:rPr>
+              <w:t>📍 页面定位与目标</w:t>
+            </w:r>
+          </w:p>
+        </w:tc>
+        <w:tc>
+          <w:tcPr>
+            <w:tcW w:type="dxa" w:w="7632"/>
+            <w:shd w:fill="FFFFFF"/>
+            <w:tcMar>
+              <w:top w:w="80" w:type="dxa"/>
+              <w:bottom w:w="80" w:type="dxa"/>
+              <w:left w:w="100" w:type="dxa"/>
+              <w:right w:w="100" w:type="dxa"/>
+            </w:tcMar>
+          </w:tcPr>
+          <w:p>
+            <w:r>
+              <w:rPr>
+                <w:rFonts w:ascii="微软雅黑" w:hAnsi="微软雅黑"/>
+                <w:color w:val="334155"/>
+                <w:sz w:val="18"/>
+              </w:rPr>
+              <w:t>全链条评估技术指标一键汇总与工程化决策交付成果输出平台。</w:t>
+            </w:r>
+          </w:p>
+        </w:tc>
+      </w:tr>
+      <w:tr>
+        <w:tc>
+          <w:tcPr>
+            <w:tcW w:type="dxa" w:w="2160"/>
+            <w:shd w:fill="F8FAFC"/>
+            <w:tcMar>
+              <w:top w:w="80" w:type="dxa"/>
+              <w:bottom w:w="80" w:type="dxa"/>
+              <w:left w:w="100" w:type="dxa"/>
+              <w:right w:w="100" w:type="dxa"/>
+            </w:tcMar>
+          </w:tcPr>
+          <w:p>
+            <w:r>
+              <w:rPr>
+                <w:rFonts w:ascii="微软雅黑" w:hAnsi="微软雅黑"/>
+                <w:b/>
+                <w:color w:val="1E293B"/>
+                <w:sz w:val="18"/>
+              </w:rPr>
+              <w:t>🧱 核心板块与组件</w:t>
+            </w:r>
+          </w:p>
+        </w:tc>
+        <w:tc>
+          <w:tcPr>
+            <w:tcW w:type="dxa" w:w="7632"/>
+            <w:shd w:fill="FAFAFA"/>
+            <w:tcMar>
+              <w:top w:w="80" w:type="dxa"/>
+              <w:bottom w:w="80" w:type="dxa"/>
+              <w:left w:w="100" w:type="dxa"/>
+              <w:right w:w="100" w:type="dxa"/>
+            </w:tcMar>
+          </w:tcPr>
+          <w:p>
+            <w:r>
+              <w:rPr>
+                <w:rFonts w:ascii="微软雅黑" w:hAnsi="微软雅黑"/>
+                <w:b/>
+                <w:color w:val="0E7490"/>
+                <w:sz w:val="17"/>
+              </w:rPr>
+              <w:t>• 报告卷首与基础信息：</w:t>
+            </w:r>
+            <w:r>
+              <w:rPr>
+                <w:rFonts w:ascii="微软雅黑" w:hAnsi="微软雅黑"/>
+                <w:color w:val="475569"/>
+                <w:sz w:val="17"/>
+              </w:rPr>
+              <w:t>送检单位、电池编号、材料体系、标称容量/电压、测试环境与检验时间戳。</w:t>
+            </w:r>
+          </w:p>
+          <w:p>
+            <w:r>
+              <w:rPr>
+                <w:rFonts w:ascii="微软雅黑" w:hAnsi="微软雅黑"/>
+                <w:b/>
+                <w:color w:val="0E7490"/>
+                <w:sz w:val="17"/>
+              </w:rPr>
+              <w:t>• 全维度结构化诊断结论：</w:t>
+            </w:r>
+            <w:r>
+              <w:rPr>
+                <w:rFonts w:ascii="微软雅黑" w:hAnsi="微软雅黑"/>
+                <w:color w:val="475569"/>
+                <w:sz w:val="17"/>
+              </w:rPr>
+              <w:t>M1 SOH 健康度评估与等级判定、M2 容量恢复量与 90% 保角预测区间、二次服役梯次定级与调理工艺建议、M3 制造端净碳减排量。</w:t>
+            </w:r>
+          </w:p>
+          <w:p>
+            <w:r>
+              <w:rPr>
+                <w:rFonts w:ascii="微软雅黑" w:hAnsi="微软雅黑"/>
+                <w:b/>
+                <w:color w:val="0E7490"/>
+                <w:sz w:val="17"/>
+              </w:rPr>
+              <w:t>• 工程交付与打印导出：</w:t>
+            </w:r>
+            <w:r>
+              <w:rPr>
+                <w:rFonts w:ascii="微软雅黑" w:hAnsi="微软雅黑"/>
+                <w:color w:val="475569"/>
+                <w:sz w:val="17"/>
+              </w:rPr>
+              <w:t>一键调用浏览器标准打印或导出为 PDF 格式工程交付决策书。</w:t>
+            </w:r>
+          </w:p>
+        </w:tc>
+      </w:tr>
+      <w:tr>
+        <w:tc>
+          <w:tcPr>
+            <w:tcW w:type="dxa" w:w="2160"/>
+            <w:shd w:fill="FEF3C7"/>
+            <w:tcMar>
+              <w:top w:w="80" w:type="dxa"/>
+              <w:bottom w:w="80" w:type="dxa"/>
+              <w:left w:w="100" w:type="dxa"/>
+              <w:right w:w="100" w:type="dxa"/>
+            </w:tcMar>
+          </w:tcPr>
+          <w:p>
+            <w:r>
+              <w:rPr>
+                <w:rFonts w:ascii="微软雅黑" w:hAnsi="微软雅黑"/>
+                <w:b/>
+                <w:color w:val="B45309"/>
+                <w:sz w:val="18"/>
+              </w:rPr>
+              <w:t>🎥 录屏解说核心点</w:t>
+            </w:r>
+          </w:p>
+        </w:tc>
+        <w:tc>
+          <w:tcPr>
+            <w:tcW w:type="dxa" w:w="7632"/>
+            <w:shd w:fill="FFFBEB"/>
+            <w:tcMar>
+              <w:top w:w="80" w:type="dxa"/>
+              <w:bottom w:w="80" w:type="dxa"/>
+              <w:left w:w="100" w:type="dxa"/>
+              <w:right w:w="100" w:type="dxa"/>
+            </w:tcMar>
+          </w:tcPr>
+          <w:p>
+            <w:r>
+              <w:rPr>
+                <w:rFonts w:ascii="微软雅黑" w:hAnsi="微软雅黑"/>
+                <w:color w:val="92400E"/>
+                <w:sz w:val="18"/>
+              </w:rPr>
+              <w:t>快速滑动展现该报告如何自动整合前述全部页面的运算结论，体现从数据采集到工程化决策报告的完整闭环，平稳收尾。</w:t>
+            </w:r>
+          </w:p>
+        </w:tc>
+      </w:tr>
+    </w:tbl>
+    <w:p/>
+    <w:p>
+      <w:r>
+        <w:rPr>
+          <w:rFonts w:ascii="微软雅黑" w:hAnsi="微软雅黑"/>
+          <w:b/>
+          <w:color w:val="0E7490"/>
+          <w:sz w:val="28"/>
+        </w:rPr>
+        <w:t>二、 录屏时间轴与 Tab 演进一览表</w:t>
       </w:r>
     </w:p>
     <w:tbl>
@@ -389,7 +2019,7 @@
                 <w:color w:val="334155"/>
                 <w:sz w:val="17"/>
               </w:rPr>
-              <w:t>行业痛点：阐述退役动力电池传统检测耗时长、缺少可逆容量恢复评估的实际瓶颈，引出系统定位。</w:t>
+              <w:t>行业痛点：阐述传统容量充放电检测耗时长、缺少可逆容量恢复评估的瓶颈，引出系统定位。</w:t>
             </w:r>
           </w:p>
         </w:tc>
@@ -665,7 +2295,7 @@
                 <w:color w:val="334155"/>
                 <w:sz w:val="17"/>
               </w:rPr>
-              <w:t>机理推演：基于电化学活化机理预测可恢复容量与 90% 保角置信区间；呈现 100 只电芯批量快筛矩阵与 CSV 导出。</w:t>
+              <w:t>机理推演：基于柱状区间图呈现可恢复容量预测与 90% 保角误差棒；演示点击电芯联动高亮；呈现 100 只矩阵、等级占比环形图与 CSV 导出。</w:t>
             </w:r>
           </w:p>
         </w:tc>
@@ -803,7 +2433,7 @@
                 <w:color w:val="334155"/>
                 <w:sz w:val="17"/>
               </w:rPr>
-              <w:t>商业闭环：演示多场景体检档案建档；呈现第三方商业质检评估公证书，明确给出直流内阻与真实可恢复潜力。</w:t>
+              <w:t>商业闭环：演示体检档案建档；呈现标准资产评估质检公证书，明确给出直流内阻实测值、真实可恢复潜力与残值估价。</w:t>
             </w:r>
           </w:p>
         </w:tc>
@@ -887,7 +2517,7 @@
           <w:color w:val="0E7490"/>
           <w:sz w:val="28"/>
         </w:rPr>
-        <w:t>二、 录屏实操分镜与解说台词逐字稿</w:t>
+        <w:t>三、 录屏实操分镜与解说台词逐字稿</w:t>
       </w:r>
     </w:p>
     <w:p>
@@ -909,7 +2539,7 @@
           <w:color w:val="0E7490"/>
           <w:sz w:val="20"/>
         </w:rPr>
-        <w:t>📍 当前界面位置：停留在 Tab 1：全流程决策工作台</w:t>
+        <w:t>📍 当前界面位置：停留在 Tab 1：极速诊断决策工作台</w:t>
       </w:r>
     </w:p>
     <w:tbl>
@@ -1128,7 +2758,7 @@
           <w:color w:val="0E7490"/>
           <w:sz w:val="20"/>
         </w:rPr>
-        <w:t>📍 当前界面位置：Tab 1：全流程决策工作台</w:t>
+        <w:t>📍 当前界面位置：Tab 1：极速诊断决策工作台</w:t>
       </w:r>
     </w:p>
     <w:tbl>
@@ -1862,7 +3492,7 @@
                 <w:color w:val="334155"/>
                 <w:sz w:val="19"/>
               </w:rPr>
-              <w:t>2. 鼠标划过上方【22 只典型循环电芯恢复预测值与 90% 保角区间】散点与误差置信带；</w:t>
+              <w:t>2. 鼠标划过上方【逐电芯容量恢复预测与 90% 保角置信区间】柱状区间图，在任意电芯（如 #15 或 #42）上单击：柱体发光高亮、出现琥珀色指针，顶部状态横幅同步呈现该电芯参数；</w:t>
             </w:r>
           </w:p>
           <w:p>
@@ -1872,7 +3502,7 @@
                 <w:color w:val="334155"/>
                 <w:sz w:val="19"/>
               </w:rPr>
-              <w:t>3. 鼠标滚动至下方【100 只退役电芯批量矩阵看板】与【再利用等级分布环形图】，点击分类药丸按钮（如点击 B级(42)，表格联动筛选），并指向‘📥 导出 CSV’按钮。</w:t>
+              <w:t>3. 鼠标滚动至下方【100 只退役电芯批量矩阵看板】与【再利用等级分布占比环形图】，点击分类药丸按钮（如点击 B级(42)，表格联动筛选），并指向‘📥 导出 CSV’按钮。</w:t>
             </w:r>
           </w:p>
         </w:tc>
@@ -1931,7 +3561,7 @@
                 <w:color w:val="0F172A"/>
                 <w:sz w:val="20"/>
               </w:rPr>
-              <w:t>在实际退役电池中，部分活性锂损失在特定电化学调理条件下具有一定的可逆性。系统通过弹性网络回归模型，对恒压调理后的容量恢复量 Q_rec 进行量化预估，并引入 90% 保角预测区间，为预测结果提供统计学上的置信上下界。例如当前这只电芯，模型预测其调理后预期 SOH 可回升至约 85.2%。</w:t>
+              <w:t>在实际退役电池中，部分活性锂损失在特定电化学调理条件下具有一定的可逆性。系统通过弹性网络回归模型，对恒压调理后的容量恢复量 Q_rec 进行量化预估，并以柱状区间图与 90% 保角置信误差棒，为离散电芯样本提供统计学上的置信上下界。当点击任意电芯柱体或下方矩阵芯片时，系统会即时居中高亮并同步呈现其恢复参数。</w:t>
             </w:r>
           </w:p>
           <w:p>
@@ -1941,7 +3571,7 @@
                 <w:color w:val="0F172A"/>
                 <w:sz w:val="20"/>
               </w:rPr>
-              <w:t>在下方，系统还集成了模组级 100 只电芯的批量快速分选功能，依据健康状态与恢复潜力将电芯划分为四类梯次利用等级，并支持数据导出为 CSV 格式，方便工程应用中的成组与筛选。”</w:t>
+              <w:t>在下方，系统集成了模组级 100 只电芯的批量快速分选功能，右侧环形图清晰量化了各等级占比（如 A级储能利用、B级调理再生等），并支持一键导出 CSV 表格，方便工程中的精准成组与流转。”</w:t>
             </w:r>
           </w:p>
         </w:tc>
@@ -1988,7 +3618,7 @@
                 <w:color w:val="92400E"/>
                 <w:sz w:val="18"/>
               </w:rPr>
-              <w:t>清晰阐释可逆容量预测原理，突出 90% 保角置信区间在工程上的可靠性。</w:t>
+              <w:t>演示点击电芯图表联动高亮，展示柱状误差棒与右侧环形图，突出 90% 保角置信区间的科学性。</w:t>
             </w:r>
           </w:p>
         </w:tc>
@@ -2660,7 +4290,7 @@
           <w:color w:val="0E7490"/>
           <w:sz w:val="28"/>
         </w:rPr>
-        <w:t>三、 录屏实操准备清单与避坑指引</w:t>
+        <w:t>四、 录屏实操准备清单与避坑指引</w:t>
       </w:r>
     </w:p>
     <w:p>
@@ -2733,6 +4363,30 @@
           <w:color w:val="475569"/>
         </w:rPr>
         <w:t>Tab 3 介绍控制在 20 秒以内，鼠标顺次划过物理特征重要性柱状图与多模型 LOBO 对比矩阵即可，切勿冗长。</w:t>
+      </w:r>
+    </w:p>
+    <w:p>
+      <w:r>
+        <w:rPr>
+          <w:b/>
+          <w:color w:val="0E7490"/>
+        </w:rPr>
+        <w:t xml:space="preserve">• </w:t>
+      </w:r>
+      <w:r>
+        <w:rPr>
+          <w:rFonts w:ascii="微软雅黑" w:hAnsi="微软雅黑"/>
+          <w:b/>
+          <w:color w:val="1E293B"/>
+        </w:rPr>
+        <w:t>【Tab 4 联动高亮互动点】：</w:t>
+      </w:r>
+      <w:r>
+        <w:rPr>
+          <w:rFonts w:ascii="微软雅黑" w:hAnsi="微软雅黑"/>
+          <w:color w:val="475569"/>
+        </w:rPr>
+        <w:t>在 Tab 4 点击电芯柱体或 100 只矩阵中任意芯片，展示顶部横幅数值跳动与柱体发光高亮，凸显系统的就地联动性能。</w:t>
       </w:r>
     </w:p>
     <w:p>

</xml_diff>

<commit_message>
docs: align video script with Double-Tier Evaluation framework and remove in-service/retired terminology
</commit_message>
<xml_diff>
--- a/焕芯电愈智策_5分钟网页录屏演示脚本与解说台词表.docx
+++ b/焕芯电愈智策_5分钟网页录屏演示脚本与解说台词表.docx
@@ -13,9 +13,9 @@
           <w:color w:val="0F172A"/>
           <w:sz w:val="40"/>
         </w:rPr>
-        <w:t>《焕芯·电愈智策》系统</w:t>
+        <w:t>《焕芯——电池智能诊断与价值再生系统》</w:t>
         <w:br/>
-        <w:t>七大功能页面全景解析与 5分钟录屏解说台词表</w:t>
+        <w:t>“双层评估”核心体系 5分钟录屏演示脚本与全景导览手册</w:t>
       </w:r>
     </w:p>
     <w:p>
@@ -28,7 +28,7 @@
           <w:color w:val="475569"/>
           <w:sz w:val="22"/>
         </w:rPr>
-        <w:t>多体系电池智能快速诊断与低碳循环决策系统 | 界面功能详解与实操录制规范手册</w:t>
+        <w:t>SOH快速健康状态无损诊断 · 无需历史轨迹的恢复容量精准预测 · 电池利用全过程碳减排量化</w:t>
       </w:r>
     </w:p>
     <w:p/>
@@ -48,10 +48,104 @@
             <w:tcW w:type="dxa" w:w="2592"/>
             <w:shd w:fill="F1F5F9"/>
             <w:tcMar>
-              <w:top w:w="100" w:type="dxa"/>
-              <w:bottom w:w="100" w:type="dxa"/>
-              <w:left w:w="140" w:type="dxa"/>
-              <w:right w:w="140" w:type="dxa"/>
+              <w:top w:w="90" w:type="dxa"/>
+              <w:bottom w:w="90" w:type="dxa"/>
+              <w:left w:w="130" w:type="dxa"/>
+              <w:right w:w="130" w:type="dxa"/>
+            </w:tcMar>
+          </w:tcPr>
+          <w:p>
+            <w:r>
+              <w:rPr>
+                <w:rFonts w:ascii="微软雅黑" w:hAnsi="微软雅黑"/>
+                <w:b/>
+                <w:color w:val="1E293B"/>
+                <w:sz w:val="19"/>
+              </w:rPr>
+              <w:t>核心技术框架</w:t>
+            </w:r>
+          </w:p>
+        </w:tc>
+        <w:tc>
+          <w:tcPr>
+            <w:tcW w:type="dxa" w:w="7200"/>
+            <w:shd w:fill="FFFFFF"/>
+            <w:tcMar>
+              <w:top w:w="90" w:type="dxa"/>
+              <w:bottom w:w="90" w:type="dxa"/>
+              <w:left w:w="130" w:type="dxa"/>
+              <w:right w:w="130" w:type="dxa"/>
+            </w:tcMar>
+          </w:tcPr>
+          <w:p>
+            <w:r>
+              <w:rPr>
+                <w:rFonts w:ascii="微软雅黑" w:hAnsi="微软雅黑"/>
+                <w:color w:val="334155"/>
+                <w:sz w:val="19"/>
+              </w:rPr>
+              <w:t>“双层智能评估”体系：第一层 SOH 快速无损诊断 + 第二层 无需历史轨迹的恢复容量精准预测</w:t>
+            </w:r>
+          </w:p>
+        </w:tc>
+      </w:tr>
+      <w:tr>
+        <w:tc>
+          <w:tcPr>
+            <w:tcW w:type="dxa" w:w="2592"/>
+            <w:shd w:fill="F1F5F9"/>
+            <w:tcMar>
+              <w:top w:w="90" w:type="dxa"/>
+              <w:bottom w:w="90" w:type="dxa"/>
+              <w:left w:w="130" w:type="dxa"/>
+              <w:right w:w="130" w:type="dxa"/>
+            </w:tcMar>
+          </w:tcPr>
+          <w:p>
+            <w:r>
+              <w:rPr>
+                <w:rFonts w:ascii="微软雅黑" w:hAnsi="微软雅黑"/>
+                <w:b/>
+                <w:color w:val="1E293B"/>
+                <w:sz w:val="19"/>
+              </w:rPr>
+              <w:t>碳量化模型</w:t>
+            </w:r>
+          </w:p>
+        </w:tc>
+        <w:tc>
+          <w:tcPr>
+            <w:tcW w:type="dxa" w:w="7200"/>
+            <w:shd w:fill="FFFFFF"/>
+            <w:tcMar>
+              <w:top w:w="90" w:type="dxa"/>
+              <w:bottom w:w="90" w:type="dxa"/>
+              <w:left w:w="130" w:type="dxa"/>
+              <w:right w:w="130" w:type="dxa"/>
+            </w:tcMar>
+          </w:tcPr>
+          <w:p>
+            <w:r>
+              <w:rPr>
+                <w:rFonts w:ascii="微软雅黑" w:hAnsi="微软雅黑"/>
+                <w:color w:val="334155"/>
+                <w:sz w:val="19"/>
+              </w:rPr>
+              <w:t>构建电池利用过程碳减排量化模型，量化延长有效使用周期、减少新电池制造带来的碳减排潜力</w:t>
+            </w:r>
+          </w:p>
+        </w:tc>
+      </w:tr>
+      <w:tr>
+        <w:tc>
+          <w:tcPr>
+            <w:tcW w:type="dxa" w:w="2592"/>
+            <w:shd w:fill="F1F5F9"/>
+            <w:tcMar>
+              <w:top w:w="90" w:type="dxa"/>
+              <w:bottom w:w="90" w:type="dxa"/>
+              <w:left w:w="130" w:type="dxa"/>
+              <w:right w:w="130" w:type="dxa"/>
             </w:tcMar>
           </w:tcPr>
           <w:p>
@@ -71,10 +165,10 @@
             <w:tcW w:type="dxa" w:w="7200"/>
             <w:shd w:fill="FFFFFF"/>
             <w:tcMar>
-              <w:top w:w="100" w:type="dxa"/>
-              <w:bottom w:w="100" w:type="dxa"/>
-              <w:left w:w="140" w:type="dxa"/>
-              <w:right w:w="140" w:type="dxa"/>
+              <w:top w:w="90" w:type="dxa"/>
+              <w:bottom w:w="90" w:type="dxa"/>
+              <w:left w:w="130" w:type="dxa"/>
+              <w:right w:w="130" w:type="dxa"/>
             </w:tcMar>
           </w:tcPr>
           <w:p>
@@ -95,10 +189,10 @@
             <w:tcW w:type="dxa" w:w="2592"/>
             <w:shd w:fill="F1F5F9"/>
             <w:tcMar>
-              <w:top w:w="100" w:type="dxa"/>
-              <w:bottom w:w="100" w:type="dxa"/>
-              <w:left w:w="140" w:type="dxa"/>
-              <w:right w:w="140" w:type="dxa"/>
+              <w:top w:w="90" w:type="dxa"/>
+              <w:bottom w:w="90" w:type="dxa"/>
+              <w:left w:w="130" w:type="dxa"/>
+              <w:right w:w="130" w:type="dxa"/>
             </w:tcMar>
           </w:tcPr>
           <w:p>
@@ -118,10 +212,10 @@
             <w:tcW w:type="dxa" w:w="7200"/>
             <w:shd w:fill="FFFFFF"/>
             <w:tcMar>
-              <w:top w:w="100" w:type="dxa"/>
-              <w:bottom w:w="100" w:type="dxa"/>
-              <w:left w:w="140" w:type="dxa"/>
-              <w:right w:w="140" w:type="dxa"/>
+              <w:top w:w="90" w:type="dxa"/>
+              <w:bottom w:w="90" w:type="dxa"/>
+              <w:left w:w="130" w:type="dxa"/>
+              <w:right w:w="130" w:type="dxa"/>
             </w:tcMar>
           </w:tcPr>
           <w:p>
@@ -131,7 +225,7 @@
                 <w:color w:val="334155"/>
                 <w:sz w:val="19"/>
               </w:rPr>
-              <w:t>220 ~ 240 字/分钟，全篇逐字稿约 1,150 字，节奏沉稳流畅、富有工程质感</w:t>
+              <w:t>220 ~ 240 字/分钟，全篇解说词约 1,160 字，节奏沉稳流畅、富有科研与工程质感</w:t>
             </w:r>
           </w:p>
         </w:tc>
@@ -142,10 +236,10 @@
             <w:tcW w:type="dxa" w:w="2592"/>
             <w:shd w:fill="F1F5F9"/>
             <w:tcMar>
-              <w:top w:w="100" w:type="dxa"/>
-              <w:bottom w:w="100" w:type="dxa"/>
-              <w:left w:w="140" w:type="dxa"/>
-              <w:right w:w="140" w:type="dxa"/>
+              <w:top w:w="90" w:type="dxa"/>
+              <w:bottom w:w="90" w:type="dxa"/>
+              <w:left w:w="130" w:type="dxa"/>
+              <w:right w:w="130" w:type="dxa"/>
             </w:tcMar>
           </w:tcPr>
           <w:p>
@@ -165,10 +259,10 @@
             <w:tcW w:type="dxa" w:w="7200"/>
             <w:shd w:fill="FFFFFF"/>
             <w:tcMar>
-              <w:top w:w="100" w:type="dxa"/>
-              <w:bottom w:w="100" w:type="dxa"/>
-              <w:left w:w="140" w:type="dxa"/>
-              <w:right w:w="140" w:type="dxa"/>
+              <w:top w:w="90" w:type="dxa"/>
+              <w:bottom w:w="90" w:type="dxa"/>
+              <w:left w:w="130" w:type="dxa"/>
+              <w:right w:w="130" w:type="dxa"/>
             </w:tcMar>
           </w:tcPr>
           <w:p>
@@ -178,7 +272,7 @@
                 <w:color w:val="334155"/>
                 <w:sz w:val="19"/>
               </w:rPr>
-              <w:t>Tab 1 -&gt; Tab 2 -&gt; Tab 3 -&gt; Tab 4 -&gt; Tab 5 -&gt; Tab 6 -&gt; Tab 7（全流程闭环推进）</w:t>
+              <w:t>Tab 1 -&gt; Tab 2 -&gt; Tab 3 -&gt; Tab 4 -&gt; Tab 5 -&gt; Tab 6 -&gt; Tab 7（全流程顺畅闭环）</w:t>
             </w:r>
           </w:p>
         </w:tc>
@@ -189,10 +283,10 @@
             <w:tcW w:type="dxa" w:w="2592"/>
             <w:shd w:fill="F1F5F9"/>
             <w:tcMar>
-              <w:top w:w="100" w:type="dxa"/>
-              <w:bottom w:w="100" w:type="dxa"/>
-              <w:left w:w="140" w:type="dxa"/>
-              <w:right w:w="140" w:type="dxa"/>
+              <w:top w:w="90" w:type="dxa"/>
+              <w:bottom w:w="90" w:type="dxa"/>
+              <w:left w:w="130" w:type="dxa"/>
+              <w:right w:w="130" w:type="dxa"/>
             </w:tcMar>
           </w:tcPr>
           <w:p>
@@ -203,7 +297,7 @@
                 <w:color w:val="1E293B"/>
                 <w:sz w:val="19"/>
               </w:rPr>
-              <w:t>材料体系覆盖</w:t>
+              <w:t>严谨用词规范</w:t>
             </w:r>
           </w:p>
         </w:tc>
@@ -212,10 +306,10 @@
             <w:tcW w:type="dxa" w:w="7200"/>
             <w:shd w:fill="FFFFFF"/>
             <w:tcMar>
-              <w:top w:w="100" w:type="dxa"/>
-              <w:bottom w:w="100" w:type="dxa"/>
-              <w:left w:w="140" w:type="dxa"/>
-              <w:right w:w="140" w:type="dxa"/>
+              <w:top w:w="90" w:type="dxa"/>
+              <w:bottom w:w="90" w:type="dxa"/>
+              <w:left w:w="130" w:type="dxa"/>
+              <w:right w:w="130" w:type="dxa"/>
             </w:tcMar>
           </w:tcPr>
           <w:p>
@@ -225,54 +319,7 @@
                 <w:color w:val="334155"/>
                 <w:sz w:val="19"/>
               </w:rPr>
-              <w:t>仅涵盖真实台架实测的 3 大体系：磷酸铁锂 (LFP)、三元高镍 (NCM)、硅碳复合 (NCM-SiC)</w:t>
-            </w:r>
-          </w:p>
-        </w:tc>
-      </w:tr>
-      <w:tr>
-        <w:tc>
-          <w:tcPr>
-            <w:tcW w:type="dxa" w:w="2592"/>
-            <w:shd w:fill="F1F5F9"/>
-            <w:tcMar>
-              <w:top w:w="100" w:type="dxa"/>
-              <w:bottom w:w="100" w:type="dxa"/>
-              <w:left w:w="140" w:type="dxa"/>
-              <w:right w:w="140" w:type="dxa"/>
-            </w:tcMar>
-          </w:tcPr>
-          <w:p>
-            <w:r>
-              <w:rPr>
-                <w:rFonts w:ascii="微软雅黑" w:hAnsi="微软雅黑"/>
-                <w:b/>
-                <w:color w:val="1E293B"/>
-                <w:sz w:val="19"/>
-              </w:rPr>
-              <w:t>演说风格规范</w:t>
-            </w:r>
-          </w:p>
-        </w:tc>
-        <w:tc>
-          <w:tcPr>
-            <w:tcW w:type="dxa" w:w="7200"/>
-            <w:shd w:fill="FFFFFF"/>
-            <w:tcMar>
-              <w:top w:w="100" w:type="dxa"/>
-              <w:bottom w:w="100" w:type="dxa"/>
-              <w:left w:w="140" w:type="dxa"/>
-              <w:right w:w="140" w:type="dxa"/>
-            </w:tcMar>
-          </w:tcPr>
-          <w:p>
-            <w:r>
-              <w:rPr>
-                <w:rFonts w:ascii="微软雅黑" w:hAnsi="微软雅黑"/>
-                <w:color w:val="334155"/>
-                <w:sz w:val="19"/>
-              </w:rPr>
-              <w:t>客观、严谨、沉稳；紧扣电化学机理与工程实际，杜绝虚浮与过度营销用词</w:t>
+              <w:t>严格杜绝在役、退役等限制性术语；严格执行学术禁用词拦截标准；全面采用规范学术表述</w:t>
             </w:r>
           </w:p>
         </w:tc>
@@ -353,7 +400,7 @@
                 <w:color w:val="334155"/>
                 <w:sz w:val="18"/>
               </w:rPr>
-              <w:t>系统的总览与主操作台，负责全局参数配置、真实数据源载入、极速评估总览与定级决策。</w:t>
+              <w:t>系统的总览与主操作台，负责全局参数配置、真实数据源载入、第一层 SOH 快速健康状态评估与综合定级决策。</w:t>
             </w:r>
           </w:p>
         </w:tc>
@@ -409,7 +456,7 @@
                 <w:color w:val="475569"/>
                 <w:sz w:val="17"/>
               </w:rPr>
-              <w:t>材料体系选择（LFP/NCM/SiC）、国家台架实测样本库一键载入、测试仪脉冲 CSV 导入、标称容量/电压设置，以及折叠的 8 项微观电化学物理特征手动配置抽屉。</w:t>
+              <w:t>材料体系选择（涵盖真实台架实测的 LFP / NCM / NCM-SiC）、标定电芯实测样本库一键载入、测试仪脉冲 CSV 导入、标称容量/电压配置，以及可折叠的 8 项微观电化学物理特征手动配置抽屉。</w:t>
             </w:r>
           </w:p>
           <w:p>
@@ -428,7 +475,7 @@
                 <w:color w:val="475569"/>
                 <w:sz w:val="17"/>
               </w:rPr>
-              <w:t>多色环形 SOH 健康度能量仪表盘（平滑渐变无文字遮挡）、健康等级徽标、模型选择标签、预估恢复容量 (Ah)、90% 保角置信区间与恢复潜力 RPI。</w:t>
+              <w:t>多色环形 SOH 健康度能量仪表盘（平滑渐变无文字遮挡）、健康等级徽标、模型推荐标签、预估恢复容量 (Ah)、90% 保角预测区间与恢复潜力 RPI。</w:t>
             </w:r>
           </w:p>
           <w:p>
@@ -439,7 +486,7 @@
                 <w:color w:val="0E7490"/>
                 <w:sz w:val="17"/>
               </w:rPr>
-              <w:t>• 二次服役梯次定级卡片：</w:t>
+              <w:t>• 二次服役分级利用卡片：</w:t>
             </w:r>
             <w:r>
               <w:rPr>
@@ -447,7 +494,7 @@
                 <w:color w:val="475569"/>
                 <w:sz w:val="17"/>
               </w:rPr>
-              <w:t>清晰给出 A/B/C/D 四级再利用评级、匹配应用场景（如储能/备电/轻载/提锂回收）、微调理建议与预期残值；右侧配套五维度机理雷达图。</w:t>
+              <w:t>明确给出 A/B/C/D 四级利用评级、匹配应用场景（如储能利用、高敏备电、轻载场景、循环再生）、微调理建议与预期残值；右侧配套五维度机理雷达图。</w:t>
             </w:r>
           </w:p>
           <w:p>
@@ -513,7 +560,7 @@
                 <w:color w:val="92400E"/>
                 <w:sz w:val="18"/>
               </w:rPr>
-              <w:t>演示未接入数据时的待测留空机制（体现严谨性）；载入实测退役电芯样本，演示 180 秒短时脉冲提取微观特征并秒级驱动全站推演的过程。</w:t>
+              <w:t>演示未接入数据时的待测留空机制（严格杜绝虚构指标）；载入实测长循环电芯样本，演示短时脉冲提取微观物理特征并秒级驱动全站推演的过程。</w:t>
             </w:r>
           </w:p>
         </w:tc>
@@ -583,7 +630,7 @@
                 <w:color w:val="334155"/>
                 <w:sz w:val="18"/>
               </w:rPr>
-              <w:t>电化学硬件测试直连与高频动态瞬态信号采集工作站，证实系统具备硬件闭环落地能力。</w:t>
+              <w:t>电化学硬件测试直连与高频动态瞬态信号采集工作站，证实系统具备硬件级闭环落地能力。</w:t>
             </w:r>
           </w:p>
         </w:tc>
@@ -743,7 +790,7 @@
                 <w:color w:val="92400E"/>
                 <w:sz w:val="18"/>
               </w:rPr>
-              <w:t>展示动态示波器波形，强调与四端子开尔文夹具等测试仪器的直连能力，体现‘台架采集-特征提取-模型推理’工程闭环。</w:t>
+              <w:t>展现动态示波器波形，强调与四端子开尔文夹具等测试仪器的直连能力，体现‘台架采集-特征提取-模型推理’工程闭环。</w:t>
             </w:r>
           </w:p>
         </w:tc>
@@ -1024,7 +1071,7 @@
                 <w:color w:val="334155"/>
                 <w:sz w:val="18"/>
               </w:rPr>
-              <w:t>容量恢复微调理潜力预测、90% 保角置信区间量化与 100 只电芯批量梯次分选中心。</w:t>
+              <w:t>第二层评估核心载体：无需历史轨迹的恢复容量精准预测、90% 保角置信区间量化与 100 只电芯模组批量分选中心。</w:t>
             </w:r>
           </w:p>
         </w:tc>
@@ -1110,7 +1157,7 @@
                 <w:color w:val="0E7490"/>
                 <w:sz w:val="17"/>
               </w:rPr>
-              <w:t>• 100只退役储能电芯矩阵看板：</w:t>
+              <w:t>• 100只储能模组电芯矩阵看板：</w:t>
             </w:r>
             <w:r>
               <w:rPr>
@@ -1156,7 +1203,7 @@
                 <w:color w:val="475569"/>
                 <w:sz w:val="17"/>
               </w:rPr>
-              <w:t>中心标注 100 只总评定样本量，环形图清晰呈现 A级(储能服役)、B级(调理再生)、C级(轻载利用)、D级(提锂再生) 的确切样本数量与百分比。</w:t>
+              <w:t>中心标注 100 只总评定样本量，环形图清晰呈现 A级(储能利用)、B级(调理再生)、C级(轻载利用)、D级(提锂再生) 的确切样本数量与百分比。</w:t>
             </w:r>
           </w:p>
         </w:tc>
@@ -1203,7 +1250,7 @@
                 <w:color w:val="92400E"/>
                 <w:sz w:val="18"/>
               </w:rPr>
-              <w:t>阐述活性锂可逆调理机理；强调 90% 保角预测区间在统计学上的置信界限；现场点击任意电芯展示全图表联动高亮；介绍批量分选矩阵与再利用占比环形图。</w:t>
+              <w:t>阐述降低对全生命周期历史退化轨迹依赖的核心创新；强调仅凭单次检测电化学特征预测净可恢复容量；演示点击柱体就地联动高亮；介绍 100 只矩阵与占比环形图。</w:t>
             </w:r>
           </w:p>
         </w:tc>
@@ -1433,7 +1480,7 @@
                 <w:color w:val="92400E"/>
                 <w:sz w:val="18"/>
               </w:rPr>
-              <w:t>阐明‘恢复可用电量等效替代新电池制造’的避碳逻辑，强调核算依照国家产品碳足迹规范，体现退役电池循环再生的低碳环境效益。</w:t>
+              <w:t>阐述‘延长电池有效使用周期、减少新电池制造需求’的碳减排量化逻辑，强调核算依据符合国家产品碳足迹规范，体现循环利用的综合效益。</w:t>
             </w:r>
           </w:p>
         </w:tc>
@@ -1559,7 +1606,7 @@
                 <w:color w:val="475569"/>
                 <w:sz w:val="17"/>
               </w:rPr>
-              <w:t>支持登记送检单位、电池型号、役龄年限与历史工况；点击‘登记送检电池’弹窗可录入完整商业档案。</w:t>
+              <w:t>支持登记送检单位、电池型号、使用年限与历史工况；点击‘登记送检电池’弹窗可录入完整商业档案。</w:t>
             </w:r>
           </w:p>
           <w:p>
@@ -1578,7 +1625,7 @@
                 <w:color w:val="475569"/>
                 <w:sz w:val="17"/>
               </w:rPr>
-              <w:t>横向坐标记录出厂初始、常规巡检、退役初检、微调理再生各节点 SOH 与直流内阻 R_dc 演变。</w:t>
+              <w:t>横向坐标记录出厂初始、常规巡检、阶段健康初检、微调理再生各节点 SOH 与直流内阻 R_dc 演变。</w:t>
             </w:r>
           </w:p>
           <w:p>
@@ -1597,7 +1644,7 @@
                 <w:color w:val="475569"/>
                 <w:sz w:val="17"/>
               </w:rPr>
-              <w:t>点击‘📜 质检公证书’弹出科技深色质检证书：包含唯一样本识别码、直流内阻实测数据、微调理恢复潜力准确量（全新标定为 0.00Ah，退役电芯真实标定）、残值估价、定级建议、防伪核验码与权威签章，支持一键打印导出。</w:t>
+              <w:t>点击‘📜 质检公证书’弹出科技深色质检证书：包含唯一样本识别码、直流内阻实测数据、微调理恢复潜力准确量（全新标定为 0.00Ah，衰退电芯真实标定）、残值估价、定级建议、防伪核验码与权威签章，支持一键打印导出。</w:t>
             </w:r>
           </w:p>
         </w:tc>
@@ -1644,7 +1691,7 @@
                 <w:color w:val="92400E"/>
                 <w:sz w:val="18"/>
               </w:rPr>
-              <w:t>展示体检建档的数字化飞轮；调出资产评估质检公证书，重点解读直流内阻实测值、真实恢复潜力和残值评估，展现技术赋能商业二手交易流转。</w:t>
+              <w:t>展示全周期体检建档的数字化飞轮；调出资产评估质检公证书，重点解读直流内阻实测值、真实恢复潜力和残值评估，展现技术赋能商业资产流转与质量判定。</w:t>
             </w:r>
           </w:p>
         </w:tc>
@@ -1789,7 +1836,7 @@
                 <w:color w:val="475569"/>
                 <w:sz w:val="17"/>
               </w:rPr>
-              <w:t>M1 SOH 健康度评估与等级判定、M2 容量恢复量与 90% 保角预测区间、二次服役梯次定级与调理工艺建议、M3 制造端净碳减排量。</w:t>
+              <w:t>第一层 SOH 健康度评估与等级判定、第二层 容量恢复量与 90% 保角预测区间、二次服役梯次利用定级建议与处理工艺、M3 制造端净碳减排量。</w:t>
             </w:r>
           </w:p>
           <w:p>
@@ -2019,7 +2066,7 @@
                 <w:color w:val="334155"/>
                 <w:sz w:val="17"/>
               </w:rPr>
-              <w:t>行业痛点：阐述传统容量充放电检测耗时长、缺少可逆容量恢复评估的瓶颈，引出系统定位。</w:t>
+              <w:t>行业背景与痛点：阐述电池规模扩大背景下检测耗时长、缺少可逆恢复评估的瓶颈，引出系统“双层智能评估”定位。</w:t>
             </w:r>
           </w:p>
         </w:tc>
@@ -2066,7 +2113,7 @@
                 <w:color w:val="0E7490"/>
                 <w:sz w:val="18"/>
               </w:rPr>
-              <w:t>Tab 1 脉冲测试与微观特征</w:t>
+              <w:t>Tab 1 脉冲测试与第一层SOH诊断</w:t>
             </w:r>
           </w:p>
         </w:tc>
@@ -2088,7 +2135,7 @@
                 <w:color w:val="334155"/>
                 <w:sz w:val="17"/>
               </w:rPr>
-              <w:t>严谨规范：演示未接入数据时的待测留空机制；调取实测退役电芯数据，180秒脉冲提取8项微观物理机理特征。</w:t>
+              <w:t>第一层评估实操：演示未接入数据时的待测留空机制；调取实测长循环电芯，180秒脉冲提取8项微观物理机理特征完成SOH评估。</w:t>
             </w:r>
           </w:p>
         </w:tc>
@@ -2157,7 +2204,7 @@
                 <w:color w:val="334155"/>
                 <w:sz w:val="17"/>
               </w:rPr>
-              <w:t>硬件直连：切换示波器呈现 60 FPS 动态双通道瞬态曲线与四端子开尔文采样状态，表征硬件级测试闭环。</w:t>
+              <w:t>硬件直连闭环：示波器呈现 60 FPS 动态双通道瞬态曲线与四端子开尔文采样状态，表征硬件级测试闭环。</w:t>
             </w:r>
           </w:p>
         </w:tc>
@@ -2226,7 +2273,7 @@
                 <w:color w:val="334155"/>
                 <w:sz w:val="17"/>
               </w:rPr>
-              <w:t>算法透明：呈现微观特征敏感度排序，解析主导特征机理；呈现多模型留一交叉验证误差矩阵，证实 XGBoost 优势。</w:t>
+              <w:t>算法机理解析：呈现微观特征敏感度排序，解析主导机理；呈现多模型留一交叉验证误差矩阵，证实 XGBoost 优势。</w:t>
             </w:r>
           </w:p>
         </w:tc>
@@ -2273,7 +2320,7 @@
                 <w:color w:val="0E7490"/>
                 <w:sz w:val="18"/>
               </w:rPr>
-              <w:t>Tab 4 容量恢复与批量分选</w:t>
+              <w:t>Tab 4 第二层恢复容量预测与批量分选</w:t>
             </w:r>
           </w:p>
         </w:tc>
@@ -2295,7 +2342,7 @@
                 <w:color w:val="334155"/>
                 <w:sz w:val="17"/>
               </w:rPr>
-              <w:t>机理推演：基于柱状区间图呈现可恢复容量预测与 90% 保角误差棒；演示点击电芯联动高亮；呈现 100 只矩阵、等级占比环形图与 CSV 导出。</w:t>
+              <w:t>第二层评估推演：基于当前电化学特征预测净可恢复容量与 90% 保角误差棒；演示点击电芯联动高亮；呈现 100 只矩阵、等级占比环形图与 CSV 导出。</w:t>
             </w:r>
           </w:p>
         </w:tc>
@@ -2364,7 +2411,7 @@
                 <w:color w:val="334155"/>
                 <w:sz w:val="17"/>
               </w:rPr>
-              <w:t>低碳循环：参照产品碳足迹标准，将恢复容量等效为替代新电池制造所规避排放，量化瀑布分解链路与净减排量。</w:t>
+              <w:t>低碳效益链路：参照产品碳足迹标准，将恢复容量等效为替代新电池制造所规避排放，量化瀑布分解链路与净减排量。</w:t>
             </w:r>
           </w:p>
         </w:tc>
@@ -2433,7 +2480,7 @@
                 <w:color w:val="334155"/>
                 <w:sz w:val="17"/>
               </w:rPr>
-              <w:t>商业闭环：演示体检档案建档；呈现标准资产评估质检公证书，明确给出直流内阻实测值、真实可恢复潜力与残值估价。</w:t>
+              <w:t>全周期健康档案：演示体检建档；呈现标准资产评估质检公证书，明确给出直流内阻实测值、真实可恢复潜力与残值估价。</w:t>
             </w:r>
           </w:p>
         </w:tc>
@@ -2502,7 +2549,7 @@
                 <w:color w:val="334155"/>
                 <w:sz w:val="17"/>
               </w:rPr>
-              <w:t>决策总结：汇总全链条多维评估指标，形成结构化报告，总结系统在快速诊断与梯次利用中的工程支撑价值。</w:t>
+              <w:t>决策总结：汇总全链条多维评估指标，形成结构化报告，总结系统在快速健康体检与价值再生中的工程支撑价值。</w:t>
             </w:r>
           </w:p>
         </w:tc>
@@ -2528,7 +2575,7 @@
           <w:color w:val="0F172A"/>
           <w:sz w:val="24"/>
         </w:rPr>
-        <w:t>【第一幕：开场总览与背景切入】（00:00 - 00:45，时长45秒）</w:t>
+        <w:t>【第一幕：项目背景与“双层评估”核心体系】（00:00 - 00:45，时长45秒）</w:t>
       </w:r>
     </w:p>
     <w:p>
@@ -2606,7 +2653,7 @@
                 <w:color w:val="334155"/>
                 <w:sz w:val="19"/>
               </w:rPr>
-              <w:t>2. 鼠标平缓从顶部大标题《焕芯·电愈智策》划过，顺次滑过左侧输入控制台与右侧决策看板大卡片；</w:t>
+              <w:t>2. 鼠标平缓从顶部标题《焕芯·电愈智策》划过，顺次滑过左侧输入控制台与右侧决策看板卡片；</w:t>
             </w:r>
           </w:p>
           <w:p>
@@ -2665,7 +2712,7 @@
                 <w:color w:val="0F172A"/>
                 <w:sz w:val="20"/>
               </w:rPr>
-              <w:t>“大家好，欢迎观看《焕芯·电愈智策》系统的功能演示。</w:t>
+              <w:t>“大家好，欢迎观看《焕芯——电池智能诊断与价值再生系统》的功能演示。</w:t>
             </w:r>
           </w:p>
           <w:p>
@@ -2675,7 +2722,7 @@
                 <w:color w:val="0F172A"/>
                 <w:sz w:val="20"/>
               </w:rPr>
-              <w:t>在退役动力与储能电池的回收利用环节中，传统容量检测通常需要完整的充放电循环，单次测试耗时约 6 至 8 小时。同时，常规检测多聚焦于当前的静态容量衰减，较少涉及微调理对可逆容量的恢复评估。</w:t>
+              <w:t>随着新能源与储能等领域快速发展，电池规模持续扩大，电池健康状态已成为关乎安全运行、使用效率和全生命周期价值的核心指标。目前，电池检测评估仍面临两大技术痛点：一是传统完整充放电标定耗时数小时，检测效率低；二是现有方法多侧重于当前剩余容量，对电池未来性能变化及潜在容量恢复能力关注不足，难以全面体现真实健康水平和后续利用价值。</w:t>
             </w:r>
           </w:p>
           <w:p>
@@ -2685,7 +2732,7 @@
                 <w:color w:val="0F172A"/>
                 <w:sz w:val="20"/>
               </w:rPr>
-              <w:t>针对上述实际工况，本系统构建了一套面向多材料体系电池的快速诊断与循环决策平台，涵盖微观特征提取、SOH 健康度评估、容量恢复量预估、模组梯次分选以及制造端碳减排核算等功能。”</w:t>
+              <w:t>为此，本项目研发了本套系统，提出‘SOH健康诊断与恢复容量预测相结合’的双层智能评估方法，并构建电池利用过程碳减排量化模型，实现对电池当前状态、潜在价值及低碳效益的综合评价。”</w:t>
             </w:r>
           </w:p>
         </w:tc>
@@ -2732,7 +2779,7 @@
                 <w:color w:val="92400E"/>
                 <w:sz w:val="18"/>
               </w:rPr>
-              <w:t>语速沉稳自然，客观陈述行业实际测试痛点，避免浮夸词汇。</w:t>
+              <w:t>语速沉稳自然，紧扣项目官方立项背景，客观陈述行业实际测试痛点，杜绝浮夸词汇。</w:t>
             </w:r>
           </w:p>
         </w:tc>
@@ -2747,7 +2794,7 @@
           <w:color w:val="0F172A"/>
           <w:sz w:val="24"/>
         </w:rPr>
-        <w:t>【第二幕：脉冲测试与微观特征提取】（00:45 - 01:35，时长50秒）</w:t>
+        <w:t>【第二幕：第一层评估——SOH 快速健康状态无损诊断】（00:45 - 01:35，时长50秒）</w:t>
       </w:r>
     </w:p>
     <w:p>
@@ -2825,7 +2872,7 @@
                 <w:color w:val="334155"/>
                 <w:sz w:val="19"/>
               </w:rPr>
-              <w:t>2. 【载入真实实测样本】：点击左上方标定电芯库下拉框，选中【实测#3】车载退役电芯 (1800次循环)；</w:t>
+              <w:t>2. 【载入真实实测样本】：点击左上方标定电芯库下拉框，选中【实测#3】长循环电芯 (1800次循环)；</w:t>
             </w:r>
           </w:p>
           <w:p>
@@ -2884,7 +2931,7 @@
                 <w:color w:val="0F172A"/>
                 <w:sz w:val="20"/>
               </w:rPr>
-              <w:t>“首先来看 Tab 1 的诊断工作台。</w:t>
+              <w:t>“首先来看系统的第一层评估：SOH 快速健康状态无损诊断。</w:t>
             </w:r>
           </w:p>
           <w:p>
@@ -2894,7 +2941,7 @@
                 <w:color w:val="0F172A"/>
                 <w:sz w:val="20"/>
               </w:rPr>
-              <w:t>系统设计了严格的数据完整性校验逻辑：当尚未导入测试仪数据或脉冲采样时，界面保持待测状态，避免产生无依据的计算结果。</w:t>
+              <w:t>系统设计了严格的数据完整性校验逻辑：当尚未导入测试仪数据或脉冲采样时，界面严格保持待测状态，避免产生无依据的计算指标。</w:t>
             </w:r>
           </w:p>
           <w:p>
@@ -2904,7 +2951,7 @@
                 <w:color w:val="0F172A"/>
                 <w:sz w:val="20"/>
               </w:rPr>
-              <w:t>当我们载入一组退役动力电芯的实测数据后，系统随即开展推演。在测试方法上，系统采用 50% SOC 下的短时充放电脉冲测试规程，测试时长约为 180 秒。在此期间，算法从瞬态响应中提取 8 项关键电化学物理特征，例如稳态开路电压、放电直流内阻、极化过电位以及充放电响应不对称度等。</w:t>
+              <w:t>当我们载入一组长循环电芯的实测数据后，系统随即开展推演。系统采用短时脉冲激励获取电池动态响应信息，替代传统长时间充放电标定，测试耗时仅需约 180 秒。算法从瞬态响应中精准提取稳态开路电压、放电直流内阻、极化过电位等 8 项关键电化学物理特征。</w:t>
             </w:r>
           </w:p>
           <w:p>
@@ -2914,7 +2961,7 @@
                 <w:color w:val="0F172A"/>
                 <w:sz w:val="20"/>
               </w:rPr>
-              <w:t>基于梯度提升决策树等机器学习模型，系统对电芯健康度 SOH 进行快速评估，验证误差 MAE 保持在 1% 以内，显著缩减了测试所需的时间周期。”</w:t>
+              <w:t>结合统一 XGBoost 模型，单次快速检测即可实现分钟级健康诊断，验证误差保持在 1% 以内，高效支撑日常健康检查、状态监测与性能评估。”</w:t>
             </w:r>
           </w:p>
         </w:tc>
@@ -2976,7 +3023,7 @@
           <w:color w:val="0F172A"/>
           <w:sz w:val="24"/>
         </w:rPr>
-        <w:t>【第三幕：实时测试示波器与通道采样】（01:35 - 02:05，时长30秒）</w:t>
+        <w:t>【第三幕：实时测试示波器与动态脉冲响应】（01:35 - 02:05，时长30秒）</w:t>
       </w:r>
     </w:p>
     <w:p>
@@ -3123,7 +3170,7 @@
                 <w:color w:val="0F172A"/>
                 <w:sz w:val="20"/>
               </w:rPr>
-              <w:t>系统可直接配合电化学测试硬件与四端子开尔文采集夹具，实时采集测试过程中的动态响应。右侧示波器以 60 帧每秒的平滑度绘制电压与电流瞬态轨迹，有效表征了脱嵌锂阻抗与弛豫响应过程。</w:t>
+              <w:t>系统可直接配合电化学测试硬件与四端子开尔文采集夹具，实时采集测试过程中的动态响应。示波器以 60 帧每秒的平滑度绘制电压与电流瞬态轨迹，有效表征了脱嵌锂阻抗与离子扩散弛豫过程。</w:t>
             </w:r>
           </w:p>
           <w:p>
@@ -3195,7 +3242,7 @@
           <w:color w:val="0F172A"/>
           <w:sz w:val="24"/>
         </w:rPr>
-        <w:t>【第四幕：特征工程与多模型交叉验证】（02:05 - 02:25，时长20秒）</w:t>
+        <w:t>【第四幕：特征机理工程与多算法交叉验证】（02:05 - 02:25，时长20秒）</w:t>
       </w:r>
     </w:p>
     <w:p>
@@ -3283,7 +3330,7 @@
                 <w:color w:val="334155"/>
                 <w:sz w:val="19"/>
               </w:rPr>
-              <w:t>3. 鼠标划过右侧【多模型 LOBO 误差横向对比】与下方对照矩阵，展示 XGBoost 与随机森林等多模型比对结果。</w:t>
+              <w:t>3. 鼠标划过右侧【多模型 LOBO 误差横向对比】与下方对照矩阵，展示 XGBoost 与对比模型表现。</w:t>
             </w:r>
           </w:p>
         </w:tc>
@@ -3342,7 +3389,7 @@
                 <w:color w:val="0F172A"/>
                 <w:sz w:val="20"/>
               </w:rPr>
-              <w:t>为了保障诊断模型的物理可解释性，左侧量化了各项微观特征的重要性得分，表明松弛电压与极化过电位是主导 SOH 衰退的关键参数，与电化学扩散极化规律高度吻合。</w:t>
+              <w:t>为了保障诊断模型的物理可解释性，左侧量化了各项微观特征的重要性得分，表明松弛电压与极化过电位是主导健康衰退的关键参数，与电化学扩散极化规律高度吻合。</w:t>
             </w:r>
           </w:p>
           <w:p>
@@ -3399,7 +3446,7 @@
                 <w:color w:val="92400E"/>
                 <w:sz w:val="18"/>
               </w:rPr>
-              <w:t>用约 20 秒干脆利落带过，展示算法可解释性与多模型 PK 的学术严谨度。</w:t>
+              <w:t>用约 20 秒干脆利落带过，展示算法可解释性与多模型横向比对的学术严谨度。</w:t>
             </w:r>
           </w:p>
         </w:tc>
@@ -3414,7 +3461,7 @@
           <w:color w:val="0F172A"/>
           <w:sz w:val="24"/>
         </w:rPr>
-        <w:t>【第五幕：容量恢复预测与模组批量分选】（02:25 - 03:15，时长50秒）</w:t>
+        <w:t>【第五幕：第二层评估——无需历史轨迹的恢复容量精准预测】（02:25 - 03:15，时长50秒）</w:t>
       </w:r>
     </w:p>
     <w:p>
@@ -3502,7 +3549,7 @@
                 <w:color w:val="334155"/>
                 <w:sz w:val="19"/>
               </w:rPr>
-              <w:t>3. 鼠标滚动至下方【100 只退役电芯批量矩阵看板】与【再利用等级分布占比环形图】，点击分类药丸按钮（如点击 B级(42)，表格联动筛选），并指向‘📥 导出 CSV’按钮。</w:t>
+              <w:t>3. 鼠标滚动至下方【100 只电芯批量矩阵看板】与【再利用等级分布占比环形图】，点击分类药丸按钮（如点击 B级(42)，表格联动筛选），并指向‘📥 导出 CSV’按钮。</w:t>
             </w:r>
           </w:p>
         </w:tc>
@@ -3551,7 +3598,7 @@
                 <w:color w:val="0F172A"/>
                 <w:sz w:val="20"/>
               </w:rPr>
-              <w:t>“切换到 Tab 4 的容量恢复与再生定级模块。</w:t>
+              <w:t>“切换到 Tab 4，这是系统的第二层评估：无需历史轨迹的恢复容量精准预测。</w:t>
             </w:r>
           </w:p>
           <w:p>
@@ -3561,7 +3608,7 @@
                 <w:color w:val="0F172A"/>
                 <w:sz w:val="20"/>
               </w:rPr>
-              <w:t>在实际退役电池中，部分活性锂损失在特定电化学调理条件下具有一定的可逆性。系统通过弹性网络回归模型，对恒压调理后的容量恢复量 Q_rec 进行量化预估，并以柱状区间图与 90% 保角置信误差棒，为离散电芯样本提供统计学上的置信上下界。当点击任意电芯柱体或下方矩阵芯片时，系统会即时居中高亮并同步呈现其恢复参数。</w:t>
+              <w:t>针对实际应用中全生命周期运行数据难以完整获取的难题，系统降低对历史数据的依赖，仅基于当前单次检测获得的电化学特征，对经过恢复处理后的净可恢复容量进行预测。</w:t>
             </w:r>
           </w:p>
           <w:p>
@@ -3571,7 +3618,7 @@
                 <w:color w:val="0F172A"/>
                 <w:sz w:val="20"/>
               </w:rPr>
-              <w:t>在下方，系统集成了模组级 100 只电芯的批量快速分选功能，右侧环形图清晰量化了各等级占比（如 A级储能利用、B级调理再生等），并支持一键导出 CSV 表格，方便工程中的精准成组与流转。”</w:t>
+              <w:t>上方柱状图直观呈现预估恢复量，并通过工字形误差棒给出 90% 保角置信区间。点击任意柱体或下方芯片，系统即可即时高亮居中并更新参数。下方 100 只模组批量分选矩阵与右侧环形图清晰量化了各等级占比（如 A级储能利用、B级调理再生），支持导出 CSV 表格，为电池维护、继续使用与分级利用提供科学依据。”</w:t>
             </w:r>
           </w:p>
         </w:tc>
@@ -3618,7 +3665,7 @@
                 <w:color w:val="92400E"/>
                 <w:sz w:val="18"/>
               </w:rPr>
-              <w:t>演示点击电芯图表联动高亮，展示柱状误差棒与右侧环形图，突出 90% 保角置信区间的科学性。</w:t>
+              <w:t>演示点击电芯图表联动高亮，展示柱状误差棒与右侧环形图，突出无需历史轨迹预测恢复容量的科学性。</w:t>
             </w:r>
           </w:p>
         </w:tc>
@@ -3633,7 +3680,7 @@
           <w:color w:val="0F172A"/>
           <w:sz w:val="24"/>
         </w:rPr>
-        <w:t>【第六幕：制造端碳减排核算与低碳效益】（03:15 - 03:55，时长40秒）</w:t>
+        <w:t>【第六幕：全生命周期评价与制造端碳减排量化】（03:15 - 03:55，时长40秒）</w:t>
       </w:r>
     </w:p>
     <w:p>
@@ -3780,7 +3827,7 @@
                 <w:color w:val="0F172A"/>
                 <w:sz w:val="20"/>
               </w:rPr>
-              <w:t>系统参照产品碳足迹与全生命周期评价规范，将电芯微调理恢复的可用电量，等效折算为替代新电池生产制造所规避的温室气体排放。</w:t>
+              <w:t>在双层评估基础上，系统进一步建立从健康状态识别、潜在价值判断到低碳效益评价的量化链路。模型将容量恢复等效为延长电池有效使用周期、减少新电池制造需求所带来的碳减排潜力。</w:t>
             </w:r>
           </w:p>
           <w:p>
@@ -3790,7 +3837,7 @@
                 <w:color w:val="0F172A"/>
                 <w:sz w:val="20"/>
               </w:rPr>
-              <w:t>界面通过碳排分解瀑布图，清晰量化了新电池生产端排放因数、调理过程消耗的电网碳排放以及最终的净碳减排量，为退役电池梯次循环的绿色低碳价值核算提供了可量化的技术支撑。”</w:t>
+              <w:t>界面通过碳排分解瀑布图，清晰量化了新电池生产端排放因数、调理过程消耗的电网碳排放以及最终的净碳减排量，为电池健康管理与循环利用提供了全过程量化支撑。”</w:t>
             </w:r>
           </w:p>
         </w:tc>
@@ -3852,7 +3899,7 @@
           <w:color w:val="0F172A"/>
           <w:sz w:val="24"/>
         </w:rPr>
-        <w:t>【第七幕：商业资产评估与质检公证书】（03:55 - 04:35，时长40秒）</w:t>
+        <w:t>【第七幕：全周期健康档案与资产评估公证书】（03:55 - 04:35，时长40秒）</w:t>
       </w:r>
     </w:p>
     <w:p>
@@ -3950,7 +3997,7 @@
                 <w:color w:val="334155"/>
                 <w:sz w:val="19"/>
               </w:rPr>
-              <w:t>4. 鼠标高亮指向直流内阻（10.9 mΩ）、可恢复潜力（全新电芯标定为 0.00Ah，退役电芯真实呈现恢复量）及底部的打印导出按钮。</w:t>
+              <w:t>4. 鼠标高亮指向直流内阻（10.9 mΩ）、可恢复潜力（全新电芯标定为 0.00Ah，衰退电芯真实标定）及底部的打印导出按钮。</w:t>
             </w:r>
           </w:p>
         </w:tc>
@@ -3999,7 +4046,7 @@
                 <w:color w:val="0F172A"/>
                 <w:sz w:val="20"/>
               </w:rPr>
-              <w:t>“在 Tab 6 电池档案与数字护照模块中，系统提供了标准化的送检建档流程。</w:t>
+              <w:t>“在 Tab 6 电池档案与数字护照模块中，系统提供了标准化的送检建档与健康履历追踪。</w:t>
             </w:r>
           </w:p>
           <w:p>
@@ -4009,7 +4056,7 @@
                 <w:color w:val="0F172A"/>
                 <w:sz w:val="20"/>
               </w:rPr>
-              <w:t>用户可登记送检单位、出厂规格、役龄年限以及历史运行工况等信息。系统基于实测健康度与恢复量，结合折旧模型计算残值评估参考价格。</w:t>
+              <w:t>用户可登记送检单位、出厂规格、使用年限以及历史运行工况等信息。系统基于实测健康度与恢复潜力，结合折旧模型计算残值评估参考价格。</w:t>
             </w:r>
           </w:p>
           <w:p>
@@ -4019,7 +4066,7 @@
                 <w:color w:val="0F172A"/>
                 <w:sz w:val="20"/>
               </w:rPr>
-              <w:t>在此基础上，系统支持生成标准格式的电池健康资产评估公证书。报告清晰呈现直流内阻、微调理恢复潜力以及梯次利用处置建议。例如对于全新电芯如实标定恢复量为零，而对于衰退电芯则定量给出可恢复容量与回升预期，支持一键打印与导出，作为资产流转的技术凭证。”</w:t>
+              <w:t>系统支持出具标准格式的电池健康资产评估公证书，清晰呈现直流内阻、微调理恢复潜力以及分级利用建议。例如对于全新电芯如实标定恢复量为零，而对于衰退电芯则定量给出可恢复容量与回升预期，支持一键打印与导出，作为资产流转的技术凭证。”</w:t>
             </w:r>
           </w:p>
         </w:tc>
@@ -4081,7 +4128,7 @@
           <w:color w:val="0F172A"/>
           <w:sz w:val="24"/>
         </w:rPr>
-        <w:t>【第八幕：综合决策报告整合与总结】（04:35 - 04:55，时长20秒）</w:t>
+        <w:t>【第八幕：综合决策报告整合与全景总结】（04:35 - 04:55，时长20秒）</w:t>
       </w:r>
     </w:p>
     <w:p>
@@ -4208,7 +4255,7 @@
                 <w:color w:val="0F172A"/>
                 <w:sz w:val="20"/>
               </w:rPr>
-              <w:t>“最后在 Tab 7 中，系统自动汇总前述所有模块的分析结论，生成结构化的综合决策评估报告，集中呈现 SOH 诊断、容量恢复预期、梯次利用建议与碳减排指标。</w:t>
+              <w:t>“最后在 Tab 7 中，系统自动汇总前述所有模块的分析结论，生成结构化的综合决策评估报告，集中呈现 SOH 诊断、容量恢复预期、分级利用建议与碳减排指标。</w:t>
             </w:r>
           </w:p>
           <w:p>
@@ -4218,7 +4265,7 @@
                 <w:color w:val="0F172A"/>
                 <w:sz w:val="20"/>
               </w:rPr>
-              <w:t>总体而言，本系统通过短时脉冲特征提取与机器学习算法，实现了退役电池的快速健康评估与容量恢复潜力分析，并结合梯次分选与碳核算，为退役电池的高效循环利用提供了一套较为完整的技术方案。</w:t>
+              <w:t>总体而言，本系统通过双层智能评估方法与碳减排量化模型，实现了电池快速无损体检与潜在价值精准挖掘，为电池全生命周期安全运行与高效循环利用提供了完整的技术方案。</w:t>
             </w:r>
           </w:p>
           <w:p>
@@ -4275,7 +4322,7 @@
                 <w:color w:val="92400E"/>
                 <w:sz w:val="18"/>
               </w:rPr>
-              <w:t>平稳收尾，总结全篇核心工程逻辑，整片控制在 4 分 40 秒左右。</w:t>
+              <w:t>平稳收尾，总结双层评估核心工程逻辑，整片控制在 4 分 40 秒左右。</w:t>
             </w:r>
           </w:p>
         </w:tc>
@@ -4410,7 +4457,7 @@
           <w:rFonts w:ascii="微软雅黑" w:hAnsi="微软雅黑"/>
           <w:color w:val="475569"/>
         </w:rPr>
-        <w:t>在 Tab 6 打开质检公证书时，重点指向‘直流内阻 (10.9 mΩ)’与‘微调理恢复潜力’（全新电芯标示为 0.00Ah，退役电芯标示为 +2.71Ah），展现真实数据科学性。</w:t>
+        <w:t>在 Tab 6 打开质检公证书时，重点指向‘直流内阻 (10.9 mΩ)’与‘微调理恢复潜力’（全新电芯标示为 0.00Ah，长循环衰退电芯标示为 +2.71Ah），展现真实数据科学性。</w:t>
       </w:r>
     </w:p>
     <w:p>
@@ -4434,7 +4481,7 @@
           <w:rFonts w:ascii="微软雅黑" w:hAnsi="微软雅黑"/>
           <w:color w:val="475569"/>
         </w:rPr>
-        <w:t>录屏解说建议佩戴指向性麦克风，开启降噪；语调保持沉稳、专业、务实，避免使用浮夸煽情词汇。</w:t>
+        <w:t>录屏解说建议佩戴指向性麦克风，开启降噪；语调保持沉稳、专业、务实，严格恪守双层智能评估主题。</w:t>
       </w:r>
     </w:p>
     <w:sectPr>

</xml_diff>